<commit_message>
Refine health report summary layout
</commit_message>
<xml_diff>
--- a/examples/sample-health-report.docx
+++ b/examples/sample-health-report.docx
@@ -136,6 +136,288 @@
           <w:color w:val="005F9E"/>
           <w:b/>
         </w:rPr>
+        <w:t xml:space="preserve">Health Check Status/Severity</w:t>
+      </w:r>
+    </w:p>
+    <w:tbl>
+      <w:tblPr>
+        <w:tblW w:w="10800" w:type="dxa"/>
+        <w:tblInd w:w="0" w:type="dxa"/>
+        <w:tblLayout w:type="fixed"/>
+        <w:tblCellMar>
+          <w:top w:w="80" w:type="dxa"/>
+          <w:start w:w="120" w:type="dxa"/>
+          <w:bottom w:w="80" w:type="dxa"/>
+          <w:end w:w="120" w:type="dxa"/>
+        </w:tblCellMar>
+        <w:tblBorders>
+          <w:top w:val="single" w:sz="4" w:color="C8D5DF"/>
+          <w:left w:val="single" w:sz="4" w:color="C8D5DF"/>
+          <w:bottom w:val="single" w:sz="4" w:color="C8D5DF"/>
+          <w:right w:val="single" w:sz="4" w:color="C8D5DF"/>
+          <w:insideH w:val="single" w:sz="4" w:color="DCE5EB"/>
+          <w:insideV w:val="single" w:sz="4" w:color="DCE5EB"/>
+        </w:tblBorders>
+      </w:tblPr>
+      <w:tblGrid>
+        <w:gridCol w:w="3000"/>
+        <w:gridCol w:w="7800"/>
+      </w:tblGrid>
+      <w:tr>
+        <w:trPr>
+          <w:tblHeader/>
+        </w:trPr>
+        <w:tc>
+          <w:tcPr>
+            <w:tcW w:w="3000" w:type="dxa"/>
+            <w:shd w:val="clear" w:color="auto" w:fill="005F9E"/>
+            <w:vAlign w:val="center"/>
+          </w:tcPr>
+          <w:p>
+            <w:pPr>
+              <w:jc w:val="left"/>
+              <w:spacing w:before="0" w:after="0" w:line="240" w:lineRule="auto"/>
+            </w:pPr>
+            <w:r>
+              <w:rPr>
+                <w:rFonts w:ascii="Aptos" w:hAnsi="Aptos"/>
+                <w:sz w:val="17"/>
+                <w:szCs w:val="17"/>
+                <w:color w:val="FFFFFF"/>
+                <w:b/>
+              </w:rPr>
+              <w:t xml:space="preserve">Status / Severity</w:t>
+            </w:r>
+          </w:p>
+        </w:tc>
+        <w:tc>
+          <w:tcPr>
+            <w:tcW w:w="7800" w:type="dxa"/>
+            <w:shd w:val="clear" w:color="auto" w:fill="005F9E"/>
+            <w:vAlign w:val="center"/>
+          </w:tcPr>
+          <w:p>
+            <w:pPr>
+              <w:jc w:val="left"/>
+              <w:spacing w:before="0" w:after="0" w:line="240" w:lineRule="auto"/>
+            </w:pPr>
+            <w:r>
+              <w:rPr>
+                <w:rFonts w:ascii="Aptos" w:hAnsi="Aptos"/>
+                <w:sz w:val="17"/>
+                <w:szCs w:val="17"/>
+                <w:color w:val="FFFFFF"/>
+                <w:b/>
+              </w:rPr>
+              <w:t xml:space="preserve">Guidance</w:t>
+            </w:r>
+          </w:p>
+        </w:tc>
+      </w:tr>
+      <w:tr>
+        <w:tc>
+          <w:tcPr>
+            <w:tcW w:w="3000" w:type="dxa"/>
+            <w:shd w:val="clear" w:color="auto" w:fill="FFFFFF"/>
+            <w:vAlign w:val="center"/>
+          </w:tcPr>
+          <w:p>
+            <w:pPr>
+              <w:jc w:val="center"/>
+              <w:spacing w:before="0" w:after="0" w:line="240" w:lineRule="auto"/>
+            </w:pPr>
+            <w:r>
+              <w:rPr>
+                <w:rFonts w:ascii="Aptos" w:hAnsi="Aptos"/>
+                <w:sz w:val="17"/>
+                <w:szCs w:val="17"/>
+                <w:color w:val="00843D"/>
+                <w:b/>
+              </w:rPr>
+              <w:t xml:space="preserve">HEALTHY</w:t>
+            </w:r>
+          </w:p>
+        </w:tc>
+        <w:tc>
+          <w:tcPr>
+            <w:tcW w:w="7800" w:type="dxa"/>
+            <w:shd w:val="clear" w:color="auto" w:fill="FFFFFF"/>
+            <w:vAlign w:val="center"/>
+          </w:tcPr>
+          <w:p>
+            <w:pPr>
+              <w:jc w:val="left"/>
+              <w:spacing w:before="0" w:after="0" w:line="240" w:lineRule="auto"/>
+            </w:pPr>
+            <w:r>
+              <w:rPr>
+                <w:rFonts w:ascii="Aptos" w:hAnsi="Aptos"/>
+                <w:sz w:val="17"/>
+                <w:szCs w:val="17"/>
+                <w:color w:val="222222"/>
+              </w:rPr>
+              <w:t xml:space="preserve">No recommendations required.</w:t>
+            </w:r>
+          </w:p>
+        </w:tc>
+      </w:tr>
+      <w:tr>
+        <w:tc>
+          <w:tcPr>
+            <w:tcW w:w="3000" w:type="dxa"/>
+            <w:shd w:val="clear" w:color="auto" w:fill="EEF4F8"/>
+            <w:vAlign w:val="center"/>
+          </w:tcPr>
+          <w:p>
+            <w:pPr>
+              <w:jc w:val="center"/>
+              <w:spacing w:before="0" w:after="0" w:line="240" w:lineRule="auto"/>
+            </w:pPr>
+            <w:r>
+              <w:rPr>
+                <w:rFonts w:ascii="Aptos" w:hAnsi="Aptos"/>
+                <w:sz w:val="17"/>
+                <w:szCs w:val="17"/>
+                <w:color w:val="BF7200"/>
+                <w:b/>
+              </w:rPr>
+              <w:t xml:space="preserve">WARNING</w:t>
+            </w:r>
+          </w:p>
+        </w:tc>
+        <w:tc>
+          <w:tcPr>
+            <w:tcW w:w="7800" w:type="dxa"/>
+            <w:shd w:val="clear" w:color="auto" w:fill="EEF4F8"/>
+            <w:vAlign w:val="center"/>
+          </w:tcPr>
+          <w:p>
+            <w:pPr>
+              <w:jc w:val="left"/>
+              <w:spacing w:before="0" w:after="0" w:line="240" w:lineRule="auto"/>
+            </w:pPr>
+            <w:r>
+              <w:rPr>
+                <w:rFonts w:ascii="Aptos" w:hAnsi="Aptos"/>
+                <w:sz w:val="17"/>
+                <w:szCs w:val="17"/>
+                <w:color w:val="222222"/>
+              </w:rPr>
+              <w:t xml:space="preserve">Review the finding and plan remediation during the next appropriate maintenance window.</w:t>
+            </w:r>
+          </w:p>
+        </w:tc>
+      </w:tr>
+      <w:tr>
+        <w:tc>
+          <w:tcPr>
+            <w:tcW w:w="3000" w:type="dxa"/>
+            <w:shd w:val="clear" w:color="auto" w:fill="FFFFFF"/>
+            <w:vAlign w:val="center"/>
+          </w:tcPr>
+          <w:p>
+            <w:pPr>
+              <w:jc w:val="center"/>
+              <w:spacing w:before="0" w:after="0" w:line="240" w:lineRule="auto"/>
+            </w:pPr>
+            <w:r>
+              <w:rPr>
+                <w:rFonts w:ascii="Aptos" w:hAnsi="Aptos"/>
+                <w:sz w:val="17"/>
+                <w:szCs w:val="17"/>
+                <w:color w:val="C00000"/>
+                <w:b/>
+              </w:rPr>
+              <w:t xml:space="preserve">CRITICAL</w:t>
+            </w:r>
+          </w:p>
+        </w:tc>
+        <w:tc>
+          <w:tcPr>
+            <w:tcW w:w="7800" w:type="dxa"/>
+            <w:shd w:val="clear" w:color="auto" w:fill="FFFFFF"/>
+            <w:vAlign w:val="center"/>
+          </w:tcPr>
+          <w:p>
+            <w:pPr>
+              <w:jc w:val="left"/>
+              <w:spacing w:before="0" w:after="0" w:line="240" w:lineRule="auto"/>
+            </w:pPr>
+            <w:r>
+              <w:rPr>
+                <w:rFonts w:ascii="Aptos" w:hAnsi="Aptos"/>
+                <w:sz w:val="17"/>
+                <w:szCs w:val="17"/>
+                <w:color w:val="222222"/>
+              </w:rPr>
+              <w:t xml:space="preserve">Immediate attention is required. Review and remediate as soon as possible.</w:t>
+            </w:r>
+          </w:p>
+        </w:tc>
+      </w:tr>
+      <w:tr>
+        <w:tc>
+          <w:tcPr>
+            <w:tcW w:w="3000" w:type="dxa"/>
+            <w:shd w:val="clear" w:color="auto" w:fill="EEF4F8"/>
+            <w:vAlign w:val="center"/>
+          </w:tcPr>
+          <w:p>
+            <w:pPr>
+              <w:jc w:val="center"/>
+              <w:spacing w:before="0" w:after="0" w:line="240" w:lineRule="auto"/>
+            </w:pPr>
+            <w:r>
+              <w:rPr>
+                <w:rFonts w:ascii="Aptos" w:hAnsi="Aptos"/>
+                <w:sz w:val="17"/>
+                <w:szCs w:val="17"/>
+                <w:color w:val="4F81BD"/>
+                <w:b/>
+              </w:rPr>
+              <w:t xml:space="preserve">INFO</w:t>
+            </w:r>
+          </w:p>
+        </w:tc>
+        <w:tc>
+          <w:tcPr>
+            <w:tcW w:w="7800" w:type="dxa"/>
+            <w:shd w:val="clear" w:color="auto" w:fill="EEF4F8"/>
+            <w:vAlign w:val="center"/>
+          </w:tcPr>
+          <w:p>
+            <w:pPr>
+              <w:jc w:val="left"/>
+              <w:spacing w:before="0" w:after="0" w:line="240" w:lineRule="auto"/>
+            </w:pPr>
+            <w:r>
+              <w:rPr>
+                <w:rFonts w:ascii="Aptos" w:hAnsi="Aptos"/>
+                <w:sz w:val="17"/>
+                <w:szCs w:val="17"/>
+                <w:color w:val="222222"/>
+              </w:rPr>
+              <w:t xml:space="preserve">Informational observation. No immediate remediation is required.</w:t>
+            </w:r>
+          </w:p>
+        </w:tc>
+      </w:tr>
+    </w:tbl>
+    <w:p>
+      <w:pPr>
+        <w:pStyle w:val="Heading2"/>
+        <w:jc w:val="left"/>
+        <w:spacing w:before="120" w:after="100" w:line="276" w:lineRule="auto"/>
+        <w:keepNext/>
+      </w:pPr>
+      <w:r>
+        <w:rPr>
+          <w:rFonts w:ascii="Aptos" w:hAnsi="Aptos"/>
+          <w:sz w:val="26"/>
+          <w:szCs w:val="26"/>
+          <w:color w:val="005F9E"/>
+          <w:b/>
+        </w:rPr>
         <w:t xml:space="preserve">Recommended Action</w:t>
       </w:r>
     </w:p>
@@ -222,7 +504,7 @@
                 <w:color w:val="FFFFFF"/>
                 <w:b/>
               </w:rPr>
-              <w:t xml:space="preserve">Assessment</w:t>
+              <w:t xml:space="preserve">Category</w:t>
             </w:r>
           </w:p>
         </w:tc>
@@ -268,7 +550,7 @@
                 <w:color w:val="FFFFFF"/>
                 <w:b/>
               </w:rPr>
-              <w:t xml:space="preserve">Assessment </w:t>
+              <w:t xml:space="preserve">Category </w:t>
             </w:r>
           </w:p>
         </w:tc>
@@ -544,7 +826,7 @@
                 <w:szCs w:val="17"/>
                 <w:color w:val="222222"/>
               </w:rPr>
-              <w:t xml:space="preserve">Remote Support</w:t>
+              <w:t xml:space="preserve">iLO Dedicated Network Port</w:t>
             </w:r>
           </w:p>
         </w:tc>
@@ -591,7 +873,7 @@
                 <w:szCs w:val="17"/>
                 <w:color w:val="222222"/>
               </w:rPr>
-              <w:t xml:space="preserve">Security Dashboard</w:t>
+              <w:t xml:space="preserve">Remote Support</w:t>
             </w:r>
           </w:p>
         </w:tc>
@@ -636,7 +918,7 @@
                 <w:szCs w:val="17"/>
                 <w:color w:val="222222"/>
               </w:rPr>
-              <w:t xml:space="preserve"/>
+              <w:t xml:space="preserve">Security Dashboard</w:t>
             </w:r>
           </w:p>
         </w:tc>
@@ -656,37 +938,22 @@
                 <w:rFonts w:ascii="Aptos" w:hAnsi="Aptos"/>
                 <w:sz w:val="17"/>
                 <w:szCs w:val="17"/>
-                <w:color w:val="666666"/>
-                <w:b/>
-              </w:rPr>
-              <w:t xml:space="preserve"/>
+                <w:color w:val="00843D"/>
+                <w:b/>
+              </w:rPr>
+              <w:t xml:space="preserve">HEALTHY</w:t>
             </w:r>
           </w:p>
         </w:tc>
       </w:tr>
     </w:tbl>
-    <w:p>
-      <w:pPr>
-        <w:pStyle w:val="Normal"/>
-        <w:jc w:val="left"/>
-        <w:spacing w:before="0" w:after="80" w:line="276" w:lineRule="auto"/>
-      </w:pPr>
-      <w:r>
-        <w:rPr>
-          <w:rFonts w:ascii="Aptos" w:hAnsi="Aptos"/>
-          <w:sz w:val="4"/>
-          <w:szCs w:val="4"/>
-          <w:color w:val="222222"/>
-        </w:rPr>
-        <w:t xml:space="preserve"/>
-      </w:r>
-    </w:p>
     <w:p>
       <w:pPr>
         <w:pStyle w:val="Heading1"/>
         <w:jc w:val="left"/>
         <w:spacing w:before="220" w:after="120" w:line="276" w:lineRule="auto"/>
         <w:keepNext/>
+        <w:pageBreakBefore/>
       </w:pPr>
       <w:r>
         <w:rPr>
@@ -933,22 +1200,6 @@
     </w:tbl>
     <w:p>
       <w:pPr>
-        <w:pStyle w:val="Normal"/>
-        <w:jc w:val="left"/>
-        <w:spacing w:before="0" w:after="80" w:line="276" w:lineRule="auto"/>
-      </w:pPr>
-      <w:r>
-        <w:rPr>
-          <w:rFonts w:ascii="Aptos" w:hAnsi="Aptos"/>
-          <w:sz w:val="4"/>
-          <w:szCs w:val="4"/>
-          <w:color w:val="222222"/>
-        </w:rPr>
-        <w:t xml:space="preserve"/>
-      </w:r>
-    </w:p>
-    <w:p>
-      <w:pPr>
         <w:pStyle w:val="Heading2"/>
         <w:jc w:val="left"/>
         <w:spacing w:before="160" w:after="100" w:line="276" w:lineRule="auto"/>
@@ -1134,22 +1385,6 @@
         </w:tc>
       </w:tr>
     </w:tbl>
-    <w:p>
-      <w:pPr>
-        <w:pStyle w:val="Normal"/>
-        <w:jc w:val="left"/>
-        <w:spacing w:before="0" w:after="80" w:line="276" w:lineRule="auto"/>
-      </w:pPr>
-      <w:r>
-        <w:rPr>
-          <w:rFonts w:ascii="Aptos" w:hAnsi="Aptos"/>
-          <w:sz w:val="4"/>
-          <w:szCs w:val="4"/>
-          <w:color w:val="222222"/>
-        </w:rPr>
-        <w:t xml:space="preserve"/>
-      </w:r>
-    </w:p>
     <w:p>
       <w:pPr>
         <w:pStyle w:val="Heading2"/>
@@ -1337,22 +1572,6 @@
         </w:tc>
       </w:tr>
     </w:tbl>
-    <w:p>
-      <w:pPr>
-        <w:pStyle w:val="Normal"/>
-        <w:jc w:val="left"/>
-        <w:spacing w:before="0" w:after="80" w:line="276" w:lineRule="auto"/>
-      </w:pPr>
-      <w:r>
-        <w:rPr>
-          <w:rFonts w:ascii="Aptos" w:hAnsi="Aptos"/>
-          <w:sz w:val="4"/>
-          <w:szCs w:val="4"/>
-          <w:color w:val="222222"/>
-        </w:rPr>
-        <w:t xml:space="preserve"/>
-      </w:r>
-    </w:p>
     <w:p>
       <w:pPr>
         <w:pStyle w:val="Heading2"/>
@@ -1586,22 +1805,6 @@
         </w:tc>
       </w:tr>
     </w:tbl>
-    <w:p>
-      <w:pPr>
-        <w:pStyle w:val="Normal"/>
-        <w:jc w:val="left"/>
-        <w:spacing w:before="0" w:after="80" w:line="276" w:lineRule="auto"/>
-      </w:pPr>
-      <w:r>
-        <w:rPr>
-          <w:rFonts w:ascii="Aptos" w:hAnsi="Aptos"/>
-          <w:sz w:val="4"/>
-          <w:szCs w:val="4"/>
-          <w:color w:val="222222"/>
-        </w:rPr>
-        <w:t xml:space="preserve"/>
-      </w:r>
-    </w:p>
     <w:p>
       <w:pPr>
         <w:pStyle w:val="Heading1"/>
@@ -1900,22 +2103,6 @@
     </w:tbl>
     <w:p>
       <w:pPr>
-        <w:pStyle w:val="Normal"/>
-        <w:jc w:val="left"/>
-        <w:spacing w:before="0" w:after="80" w:line="276" w:lineRule="auto"/>
-      </w:pPr>
-      <w:r>
-        <w:rPr>
-          <w:rFonts w:ascii="Aptos" w:hAnsi="Aptos"/>
-          <w:sz w:val="4"/>
-          <w:szCs w:val="4"/>
-          <w:color w:val="222222"/>
-        </w:rPr>
-        <w:t xml:space="preserve"/>
-      </w:r>
-    </w:p>
-    <w:p>
-      <w:pPr>
         <w:pStyle w:val="Heading1"/>
         <w:jc w:val="left"/>
         <w:spacing w:before="220" w:after="120" w:line="276" w:lineRule="auto"/>
@@ -2055,22 +2242,6 @@
         </w:tc>
       </w:tr>
     </w:tbl>
-    <w:p>
-      <w:pPr>
-        <w:pStyle w:val="Normal"/>
-        <w:jc w:val="left"/>
-        <w:spacing w:before="0" w:after="80" w:line="276" w:lineRule="auto"/>
-      </w:pPr>
-      <w:r>
-        <w:rPr>
-          <w:rFonts w:ascii="Aptos" w:hAnsi="Aptos"/>
-          <w:sz w:val="4"/>
-          <w:szCs w:val="4"/>
-          <w:color w:val="222222"/>
-        </w:rPr>
-        <w:t xml:space="preserve"/>
-      </w:r>
-    </w:p>
     <w:p>
       <w:pPr>
         <w:pStyle w:val="Heading1"/>
@@ -2323,22 +2494,6 @@
     </w:tbl>
     <w:p>
       <w:pPr>
-        <w:pStyle w:val="Normal"/>
-        <w:jc w:val="left"/>
-        <w:spacing w:before="0" w:after="80" w:line="276" w:lineRule="auto"/>
-      </w:pPr>
-      <w:r>
-        <w:rPr>
-          <w:rFonts w:ascii="Aptos" w:hAnsi="Aptos"/>
-          <w:sz w:val="4"/>
-          <w:szCs w:val="4"/>
-          <w:color w:val="222222"/>
-        </w:rPr>
-        <w:t xml:space="preserve"/>
-      </w:r>
-    </w:p>
-    <w:p>
-      <w:pPr>
         <w:pStyle w:val="Heading2"/>
         <w:jc w:val="left"/>
         <w:spacing w:before="160" w:after="100" w:line="276" w:lineRule="auto"/>
@@ -2524,22 +2679,6 @@
         </w:tc>
       </w:tr>
     </w:tbl>
-    <w:p>
-      <w:pPr>
-        <w:pStyle w:val="Normal"/>
-        <w:jc w:val="left"/>
-        <w:spacing w:before="0" w:after="80" w:line="276" w:lineRule="auto"/>
-      </w:pPr>
-      <w:r>
-        <w:rPr>
-          <w:rFonts w:ascii="Aptos" w:hAnsi="Aptos"/>
-          <w:sz w:val="4"/>
-          <w:szCs w:val="4"/>
-          <w:color w:val="222222"/>
-        </w:rPr>
-        <w:t xml:space="preserve"/>
-      </w:r>
-    </w:p>
     <w:p>
       <w:pPr>
         <w:pStyle w:val="Heading2"/>
@@ -2932,22 +3071,6 @@
         </w:tc>
       </w:tr>
     </w:tbl>
-    <w:p>
-      <w:pPr>
-        <w:pStyle w:val="Normal"/>
-        <w:jc w:val="left"/>
-        <w:spacing w:before="0" w:after="80" w:line="276" w:lineRule="auto"/>
-      </w:pPr>
-      <w:r>
-        <w:rPr>
-          <w:rFonts w:ascii="Aptos" w:hAnsi="Aptos"/>
-          <w:sz w:val="4"/>
-          <w:szCs w:val="4"/>
-          <w:color w:val="222222"/>
-        </w:rPr>
-        <w:t xml:space="preserve"/>
-      </w:r>
-    </w:p>
     <w:p>
       <w:pPr>
         <w:pStyle w:val="Heading2"/>
@@ -3321,22 +3444,6 @@
     </w:tbl>
     <w:p>
       <w:pPr>
-        <w:pStyle w:val="Normal"/>
-        <w:jc w:val="left"/>
-        <w:spacing w:before="0" w:after="80" w:line="276" w:lineRule="auto"/>
-      </w:pPr>
-      <w:r>
-        <w:rPr>
-          <w:rFonts w:ascii="Aptos" w:hAnsi="Aptos"/>
-          <w:sz w:val="4"/>
-          <w:szCs w:val="4"/>
-          <w:color w:val="222222"/>
-        </w:rPr>
-        <w:t xml:space="preserve"/>
-      </w:r>
-    </w:p>
-    <w:p>
-      <w:pPr>
         <w:pStyle w:val="Heading2"/>
         <w:jc w:val="left"/>
         <w:spacing w:before="160" w:after="100" w:line="276" w:lineRule="auto"/>
@@ -3614,22 +3721,6 @@
         </w:tc>
       </w:tr>
     </w:tbl>
-    <w:p>
-      <w:pPr>
-        <w:pStyle w:val="Normal"/>
-        <w:jc w:val="left"/>
-        <w:spacing w:before="0" w:after="80" w:line="276" w:lineRule="auto"/>
-      </w:pPr>
-      <w:r>
-        <w:rPr>
-          <w:rFonts w:ascii="Aptos" w:hAnsi="Aptos"/>
-          <w:sz w:val="4"/>
-          <w:szCs w:val="4"/>
-          <w:color w:val="222222"/>
-        </w:rPr>
-        <w:t xml:space="preserve"/>
-      </w:r>
-    </w:p>
     <w:p>
       <w:pPr>
         <w:pStyle w:val="Heading2"/>
@@ -3865,22 +3956,6 @@
     </w:tbl>
     <w:p>
       <w:pPr>
-        <w:pStyle w:val="Normal"/>
-        <w:jc w:val="left"/>
-        <w:spacing w:before="0" w:after="80" w:line="276" w:lineRule="auto"/>
-      </w:pPr>
-      <w:r>
-        <w:rPr>
-          <w:rFonts w:ascii="Aptos" w:hAnsi="Aptos"/>
-          <w:sz w:val="4"/>
-          <w:szCs w:val="4"/>
-          <w:color w:val="222222"/>
-        </w:rPr>
-        <w:t xml:space="preserve"/>
-      </w:r>
-    </w:p>
-    <w:p>
-      <w:pPr>
         <w:pStyle w:val="Heading1"/>
         <w:jc w:val="left"/>
         <w:spacing w:before="220" w:after="120" w:line="276" w:lineRule="auto"/>
@@ -4066,22 +4141,6 @@
         </w:tc>
       </w:tr>
     </w:tbl>
-    <w:p>
-      <w:pPr>
-        <w:pStyle w:val="Normal"/>
-        <w:jc w:val="left"/>
-        <w:spacing w:before="0" w:after="80" w:line="276" w:lineRule="auto"/>
-      </w:pPr>
-      <w:r>
-        <w:rPr>
-          <w:rFonts w:ascii="Aptos" w:hAnsi="Aptos"/>
-          <w:sz w:val="4"/>
-          <w:szCs w:val="4"/>
-          <w:color w:val="222222"/>
-        </w:rPr>
-        <w:t xml:space="preserve"/>
-      </w:r>
-    </w:p>
     <w:p>
       <w:pPr>
         <w:pStyle w:val="Heading1"/>
@@ -4289,22 +4348,6 @@
     </w:tbl>
     <w:p>
       <w:pPr>
-        <w:pStyle w:val="Normal"/>
-        <w:jc w:val="left"/>
-        <w:spacing w:before="0" w:after="80" w:line="276" w:lineRule="auto"/>
-      </w:pPr>
-      <w:r>
-        <w:rPr>
-          <w:rFonts w:ascii="Aptos" w:hAnsi="Aptos"/>
-          <w:sz w:val="4"/>
-          <w:szCs w:val="4"/>
-          <w:color w:val="222222"/>
-        </w:rPr>
-        <w:t xml:space="preserve"/>
-      </w:r>
-    </w:p>
-    <w:p>
-      <w:pPr>
         <w:pStyle w:val="Heading2"/>
         <w:jc w:val="left"/>
         <w:spacing w:before="160" w:after="100" w:line="276" w:lineRule="auto"/>
@@ -4490,22 +4533,6 @@
         </w:tc>
       </w:tr>
     </w:tbl>
-    <w:p>
-      <w:pPr>
-        <w:pStyle w:val="Normal"/>
-        <w:jc w:val="left"/>
-        <w:spacing w:before="0" w:after="80" w:line="276" w:lineRule="auto"/>
-      </w:pPr>
-      <w:r>
-        <w:rPr>
-          <w:rFonts w:ascii="Aptos" w:hAnsi="Aptos"/>
-          <w:sz w:val="4"/>
-          <w:szCs w:val="4"/>
-          <w:color w:val="222222"/>
-        </w:rPr>
-        <w:t xml:space="preserve"/>
-      </w:r>
-    </w:p>
     <w:p>
       <w:pPr>
         <w:pStyle w:val="Heading2"/>
@@ -4739,22 +4766,6 @@
         </w:tc>
       </w:tr>
     </w:tbl>
-    <w:p>
-      <w:pPr>
-        <w:pStyle w:val="Normal"/>
-        <w:jc w:val="left"/>
-        <w:spacing w:before="0" w:after="80" w:line="276" w:lineRule="auto"/>
-      </w:pPr>
-      <w:r>
-        <w:rPr>
-          <w:rFonts w:ascii="Aptos" w:hAnsi="Aptos"/>
-          <w:sz w:val="4"/>
-          <w:szCs w:val="4"/>
-          <w:color w:val="222222"/>
-        </w:rPr>
-        <w:t xml:space="preserve"/>
-      </w:r>
-    </w:p>
     <w:sectPr>
       <w:headerReference w:type="default" r:id="rId1"/>
       <w:headerReference w:type="first" r:id="rId1"/>

</xml_diff>

<commit_message>
Refine report status presentation
</commit_message>
<xml_diff>
--- a/examples/sample-health-report.docx
+++ b/examples/sample-health-report.docx
@@ -405,9 +405,25 @@
     </w:tbl>
     <w:p>
       <w:pPr>
+        <w:pStyle w:val="Normal"/>
+        <w:jc w:val="left"/>
+        <w:spacing w:before="0" w:after="0" w:line="276" w:lineRule="auto"/>
+      </w:pPr>
+      <w:r>
+        <w:rPr>
+          <w:rFonts w:ascii="Aptos" w:hAnsi="Aptos"/>
+          <w:sz w:val="20"/>
+          <w:szCs w:val="20"/>
+          <w:color w:val="222222"/>
+        </w:rPr>
+        <w:t xml:space="preserve"/>
+      </w:r>
+    </w:p>
+    <w:p>
+      <w:pPr>
         <w:pStyle w:val="Heading2"/>
         <w:jc w:val="left"/>
-        <w:spacing w:before="120" w:after="100" w:line="276" w:lineRule="auto"/>
+        <w:spacing w:before="0" w:after="100" w:line="276" w:lineRule="auto"/>
         <w:keepNext/>
       </w:pPr>
       <w:r>
@@ -439,9 +455,25 @@
     </w:p>
     <w:p>
       <w:pPr>
+        <w:pStyle w:val="Normal"/>
+        <w:jc w:val="left"/>
+        <w:spacing w:before="0" w:after="0" w:line="276" w:lineRule="auto"/>
+      </w:pPr>
+      <w:r>
+        <w:rPr>
+          <w:rFonts w:ascii="Aptos" w:hAnsi="Aptos"/>
+          <w:sz w:val="20"/>
+          <w:szCs w:val="20"/>
+          <w:color w:val="222222"/>
+        </w:rPr>
+        <w:t xml:space="preserve"/>
+      </w:r>
+    </w:p>
+    <w:p>
+      <w:pPr>
         <w:pStyle w:val="Heading2"/>
         <w:jc w:val="left"/>
-        <w:spacing w:before="160" w:after="100" w:line="276" w:lineRule="auto"/>
+        <w:spacing w:before="0" w:after="100" w:line="276" w:lineRule="auto"/>
         <w:keepNext/>
       </w:pPr>
       <w:r>
@@ -1182,17 +1214,18 @@
           </w:tcPr>
           <w:p>
             <w:pPr>
-              <w:jc w:val="left"/>
-              <w:spacing w:before="0" w:after="0" w:line="240" w:lineRule="auto"/>
-            </w:pPr>
-            <w:r>
-              <w:rPr>
-                <w:rFonts w:ascii="Aptos" w:hAnsi="Aptos"/>
-                <w:sz w:val="17"/>
-                <w:szCs w:val="17"/>
-                <w:color w:val="222222"/>
-              </w:rPr>
-              <w:t xml:space="preserve">OK</w:t>
+              <w:jc w:val="center"/>
+              <w:spacing w:before="0" w:after="0" w:line="240" w:lineRule="auto"/>
+            </w:pPr>
+            <w:r>
+              <w:rPr>
+                <w:rFonts w:ascii="Aptos" w:hAnsi="Aptos"/>
+                <w:sz w:val="17"/>
+                <w:szCs w:val="17"/>
+                <w:color w:val="00843D"/>
+                <w:b/>
+              </w:rPr>
+              <w:t xml:space="preserve">HEALTHY</w:t>
             </w:r>
           </w:p>
         </w:tc>
@@ -1379,7 +1412,7 @@
                 <w:color w:val="00843D"/>
                 <w:b/>
               </w:rPr>
-              <w:t xml:space="preserve">OK</w:t>
+              <w:t xml:space="preserve">HEALTHY</w:t>
             </w:r>
           </w:p>
         </w:tc>
@@ -1544,7 +1577,7 @@
                 <w:color w:val="00843D"/>
                 <w:b/>
               </w:rPr>
-              <w:t xml:space="preserve">OK</w:t>
+              <w:t xml:space="preserve">HEALTHY</w:t>
             </w:r>
           </w:p>
         </w:tc>
@@ -2236,7 +2269,7 @@
                 <w:color w:val="00843D"/>
                 <w:b/>
               </w:rPr>
-              <w:t xml:space="preserve">OK</w:t>
+              <w:t xml:space="preserve">HEALTHY</w:t>
             </w:r>
           </w:p>
         </w:tc>
@@ -2476,17 +2509,18 @@
           </w:tcPr>
           <w:p>
             <w:pPr>
-              <w:jc w:val="left"/>
-              <w:spacing w:before="0" w:after="0" w:line="240" w:lineRule="auto"/>
-            </w:pPr>
-            <w:r>
-              <w:rPr>
-                <w:rFonts w:ascii="Aptos" w:hAnsi="Aptos"/>
-                <w:sz w:val="17"/>
-                <w:szCs w:val="17"/>
-                <w:color w:val="222222"/>
-              </w:rPr>
-              <w:t xml:space="preserve">OK</w:t>
+              <w:jc w:val="center"/>
+              <w:spacing w:before="0" w:after="0" w:line="240" w:lineRule="auto"/>
+            </w:pPr>
+            <w:r>
+              <w:rPr>
+                <w:rFonts w:ascii="Aptos" w:hAnsi="Aptos"/>
+                <w:sz w:val="17"/>
+                <w:szCs w:val="17"/>
+                <w:color w:val="00843D"/>
+                <w:b/>
+              </w:rPr>
+              <w:t xml:space="preserve">HEALTHY</w:t>
             </w:r>
           </w:p>
         </w:tc>
@@ -2673,7 +2707,7 @@
                 <w:color w:val="00843D"/>
                 <w:b/>
               </w:rPr>
-              <w:t xml:space="preserve">OK</w:t>
+              <w:t xml:space="preserve">HEALTHY</w:t>
             </w:r>
           </w:p>
         </w:tc>
@@ -2952,7 +2986,7 @@
                 <w:color w:val="00843D"/>
                 <w:b/>
               </w:rPr>
-              <w:t xml:space="preserve">OK</w:t>
+              <w:t xml:space="preserve">HEALTHY</w:t>
             </w:r>
           </w:p>
         </w:tc>
@@ -3065,7 +3099,7 @@
                 <w:color w:val="00843D"/>
                 <w:b/>
               </w:rPr>
-              <w:t xml:space="preserve">OK</w:t>
+              <w:t xml:space="preserve">HEALTHY</w:t>
             </w:r>
           </w:p>
         </w:tc>
@@ -3436,7 +3470,7 @@
                 <w:color w:val="00843D"/>
                 <w:b/>
               </w:rPr>
-              <w:t xml:space="preserve">OK</w:t>
+              <w:t xml:space="preserve">HEALTHY</w:t>
             </w:r>
           </w:p>
         </w:tc>
@@ -3715,7 +3749,7 @@
                 <w:color w:val="00843D"/>
                 <w:b/>
               </w:rPr>
-              <w:t xml:space="preserve">OK</w:t>
+              <w:t xml:space="preserve">HEALTHY</w:t>
             </w:r>
           </w:p>
         </w:tc>
@@ -3948,7 +3982,7 @@
                 <w:color w:val="00843D"/>
                 <w:b/>
               </w:rPr>
-              <w:t xml:space="preserve">OK</w:t>
+              <w:t xml:space="preserve">HEALTHY</w:t>
             </w:r>
           </w:p>
         </w:tc>
@@ -4135,7 +4169,7 @@
                 <w:color w:val="00843D"/>
                 <w:b/>
               </w:rPr>
-              <w:t xml:space="preserve">OK</w:t>
+              <w:t xml:space="preserve">HEALTHY</w:t>
             </w:r>
           </w:p>
         </w:tc>
@@ -4340,7 +4374,7 @@
                 <w:color w:val="00843D"/>
                 <w:b/>
               </w:rPr>
-              <w:t xml:space="preserve">OK</w:t>
+              <w:t xml:space="preserve">HEALTHY</w:t>
             </w:r>
           </w:p>
         </w:tc>
@@ -4527,7 +4561,7 @@
                 <w:color w:val="00843D"/>
                 <w:b/>
               </w:rPr>
-              <w:t xml:space="preserve">OK</w:t>
+              <w:t xml:space="preserve">HEALTHY</w:t>
             </w:r>
           </w:p>
         </w:tc>
@@ -4760,7 +4794,7 @@
                 <w:color w:val="00843D"/>
                 <w:b/>
               </w:rPr>
-              <w:t xml:space="preserve">OK</w:t>
+              <w:t xml:space="preserve">HEALTHY</w:t>
             </w:r>
           </w:p>
         </w:tc>

</xml_diff>

<commit_message>
Align report layout with Nutanix v1.1.0
</commit_message>
<xml_diff>
--- a/examples/sample-health-report.docx
+++ b/examples/sample-health-report.docx
@@ -10,7 +10,7 @@
       </w:pPr>
       <w:r>
         <w:rPr>
-          <w:rFonts w:ascii="Aptos" w:hAnsi="Aptos"/>
+          <w:rFonts w:ascii="Calibri" w:hAnsi="Calibri"/>
           <w:sz w:val="56"/>
           <w:szCs w:val="56"/>
           <w:color w:val="005F9E"/>
@@ -27,7 +27,7 @@
       </w:pPr>
       <w:r>
         <w:rPr>
-          <w:rFonts w:ascii="Aptos" w:hAnsi="Aptos"/>
+          <w:rFonts w:ascii="Calibri" w:hAnsi="Calibri"/>
           <w:sz w:val="40"/>
           <w:szCs w:val="40"/>
           <w:color w:val="203647"/>
@@ -43,7 +43,7 @@
       </w:pPr>
       <w:r>
         <w:rPr>
-          <w:rFonts w:ascii="Aptos" w:hAnsi="Aptos"/>
+          <w:rFonts w:ascii="Calibri" w:hAnsi="Calibri"/>
           <w:sz w:val="32"/>
           <w:szCs w:val="32"/>
           <w:color w:val="203647"/>
@@ -59,12 +59,12 @@
       </w:pPr>
       <w:r>
         <w:rPr>
-          <w:rFonts w:ascii="Aptos" w:hAnsi="Aptos"/>
+          <w:rFonts w:ascii="Calibri" w:hAnsi="Calibri"/>
           <w:sz w:val="24"/>
           <w:szCs w:val="24"/>
           <w:color w:val="777777"/>
         </w:rPr>
-        <w:t xml:space="preserve">July 27, 2026</w:t>
+        <w:t xml:space="preserve">July 29, 2026</w:t>
       </w:r>
     </w:p>
     <w:p>
@@ -75,7 +75,7 @@
       </w:pPr>
       <w:r>
         <w:rPr>
-          <w:rFonts w:ascii="Aptos" w:hAnsi="Aptos"/>
+          <w:rFonts w:ascii="Calibri" w:hAnsi="Calibri"/>
           <w:sz w:val="20"/>
           <w:szCs w:val="20"/>
           <w:color w:val="999999"/>
@@ -96,7 +96,7 @@
       </w:pPr>
       <w:r>
         <w:rPr>
-          <w:rFonts w:ascii="Aptos" w:hAnsi="Aptos"/>
+          <w:rFonts w:ascii="Calibri" w:hAnsi="Calibri"/>
           <w:sz w:val="32"/>
           <w:szCs w:val="32"/>
           <w:color w:val="005F9E"/>
@@ -113,7 +113,7 @@
       </w:pPr>
       <w:r>
         <w:rPr>
-          <w:rFonts w:ascii="Aptos" w:hAnsi="Aptos"/>
+          <w:rFonts w:ascii="Calibri" w:hAnsi="Calibri"/>
           <w:sz w:val="21"/>
           <w:szCs w:val="21"/>
           <w:color w:val="222222"/>
@@ -130,10 +130,10 @@
       </w:pPr>
       <w:r>
         <w:rPr>
-          <w:rFonts w:ascii="Aptos" w:hAnsi="Aptos"/>
+          <w:rFonts w:ascii="Calibri" w:hAnsi="Calibri"/>
           <w:sz w:val="26"/>
           <w:szCs w:val="26"/>
-          <w:color w:val="005F9E"/>
+          <w:color w:val="404040"/>
           <w:b/>
         </w:rPr>
         <w:t xml:space="preserve">Health Check Status/Severity</w:t>
@@ -143,11 +143,11 @@
       <w:tblPr>
         <w:tblW w:w="10800" w:type="dxa"/>
         <w:tblInd w:w="0" w:type="dxa"/>
-        <w:tblLayout w:type="fixed"/>
+        <w:tblLayout w:type="autofit"/>
         <w:tblCellMar>
-          <w:top w:w="80" w:type="dxa"/>
+          <w:top w:w="60" w:type="dxa"/>
           <w:start w:w="120" w:type="dxa"/>
-          <w:bottom w:w="80" w:type="dxa"/>
+          <w:bottom w:w="60" w:type="dxa"/>
           <w:end w:w="120" w:type="dxa"/>
         </w:tblCellMar>
         <w:tblBorders>
@@ -180,9 +180,9 @@
             </w:pPr>
             <w:r>
               <w:rPr>
-                <w:rFonts w:ascii="Aptos" w:hAnsi="Aptos"/>
-                <w:sz w:val="17"/>
-                <w:szCs w:val="17"/>
+                <w:rFonts w:ascii="Calibri" w:hAnsi="Calibri"/>
+                <w:sz w:val="18"/>
+                <w:szCs w:val="18"/>
                 <w:color w:val="FFFFFF"/>
                 <w:b/>
               </w:rPr>
@@ -203,9 +203,9 @@
             </w:pPr>
             <w:r>
               <w:rPr>
-                <w:rFonts w:ascii="Aptos" w:hAnsi="Aptos"/>
-                <w:sz w:val="17"/>
-                <w:szCs w:val="17"/>
+                <w:rFonts w:ascii="Calibri" w:hAnsi="Calibri"/>
+                <w:sz w:val="18"/>
+                <w:szCs w:val="18"/>
                 <w:color w:val="FFFFFF"/>
                 <w:b/>
               </w:rPr>
@@ -228,9 +228,9 @@
             </w:pPr>
             <w:r>
               <w:rPr>
-                <w:rFonts w:ascii="Aptos" w:hAnsi="Aptos"/>
-                <w:sz w:val="17"/>
-                <w:szCs w:val="17"/>
+                <w:rFonts w:ascii="Calibri" w:hAnsi="Calibri"/>
+                <w:sz w:val="18"/>
+                <w:szCs w:val="18"/>
                 <w:color w:val="00843D"/>
                 <w:b/>
               </w:rPr>
@@ -251,9 +251,9 @@
             </w:pPr>
             <w:r>
               <w:rPr>
-                <w:rFonts w:ascii="Aptos" w:hAnsi="Aptos"/>
-                <w:sz w:val="17"/>
-                <w:szCs w:val="17"/>
+                <w:rFonts w:ascii="Calibri" w:hAnsi="Calibri"/>
+                <w:sz w:val="18"/>
+                <w:szCs w:val="18"/>
                 <w:color w:val="222222"/>
               </w:rPr>
               <w:t xml:space="preserve">No recommendations required.</w:t>
@@ -275,9 +275,9 @@
             </w:pPr>
             <w:r>
               <w:rPr>
-                <w:rFonts w:ascii="Aptos" w:hAnsi="Aptos"/>
-                <w:sz w:val="17"/>
-                <w:szCs w:val="17"/>
+                <w:rFonts w:ascii="Calibri" w:hAnsi="Calibri"/>
+                <w:sz w:val="18"/>
+                <w:szCs w:val="18"/>
                 <w:color w:val="BF7200"/>
                 <w:b/>
               </w:rPr>
@@ -298,9 +298,9 @@
             </w:pPr>
             <w:r>
               <w:rPr>
-                <w:rFonts w:ascii="Aptos" w:hAnsi="Aptos"/>
-                <w:sz w:val="17"/>
-                <w:szCs w:val="17"/>
+                <w:rFonts w:ascii="Calibri" w:hAnsi="Calibri"/>
+                <w:sz w:val="18"/>
+                <w:szCs w:val="18"/>
                 <w:color w:val="222222"/>
               </w:rPr>
               <w:t xml:space="preserve">Review the finding and plan remediation during the next appropriate maintenance window.</w:t>
@@ -322,9 +322,9 @@
             </w:pPr>
             <w:r>
               <w:rPr>
-                <w:rFonts w:ascii="Aptos" w:hAnsi="Aptos"/>
-                <w:sz w:val="17"/>
-                <w:szCs w:val="17"/>
+                <w:rFonts w:ascii="Calibri" w:hAnsi="Calibri"/>
+                <w:sz w:val="18"/>
+                <w:szCs w:val="18"/>
                 <w:color w:val="C00000"/>
                 <w:b/>
               </w:rPr>
@@ -345,9 +345,9 @@
             </w:pPr>
             <w:r>
               <w:rPr>
-                <w:rFonts w:ascii="Aptos" w:hAnsi="Aptos"/>
-                <w:sz w:val="17"/>
-                <w:szCs w:val="17"/>
+                <w:rFonts w:ascii="Calibri" w:hAnsi="Calibri"/>
+                <w:sz w:val="18"/>
+                <w:szCs w:val="18"/>
                 <w:color w:val="222222"/>
               </w:rPr>
               <w:t xml:space="preserve">Immediate attention is required. Review and remediate as soon as possible.</w:t>
@@ -369,9 +369,9 @@
             </w:pPr>
             <w:r>
               <w:rPr>
-                <w:rFonts w:ascii="Aptos" w:hAnsi="Aptos"/>
-                <w:sz w:val="17"/>
-                <w:szCs w:val="17"/>
+                <w:rFonts w:ascii="Calibri" w:hAnsi="Calibri"/>
+                <w:sz w:val="18"/>
+                <w:szCs w:val="18"/>
                 <w:color w:val="4F81BD"/>
                 <w:b/>
               </w:rPr>
@@ -392,9 +392,9 @@
             </w:pPr>
             <w:r>
               <w:rPr>
-                <w:rFonts w:ascii="Aptos" w:hAnsi="Aptos"/>
-                <w:sz w:val="17"/>
-                <w:szCs w:val="17"/>
+                <w:rFonts w:ascii="Calibri" w:hAnsi="Calibri"/>
+                <w:sz w:val="18"/>
+                <w:szCs w:val="18"/>
                 <w:color w:val="222222"/>
               </w:rPr>
               <w:t xml:space="preserve">Informational observation. No immediate remediation is required.</w:t>
@@ -411,7 +411,7 @@
       </w:pPr>
       <w:r>
         <w:rPr>
-          <w:rFonts w:ascii="Aptos" w:hAnsi="Aptos"/>
+          <w:rFonts w:ascii="Calibri" w:hAnsi="Calibri"/>
           <w:sz w:val="20"/>
           <w:szCs w:val="20"/>
           <w:color w:val="222222"/>
@@ -428,10 +428,10 @@
       </w:pPr>
       <w:r>
         <w:rPr>
-          <w:rFonts w:ascii="Aptos" w:hAnsi="Aptos"/>
+          <w:rFonts w:ascii="Calibri" w:hAnsi="Calibri"/>
           <w:sz w:val="26"/>
           <w:szCs w:val="26"/>
-          <w:color w:val="005F9E"/>
+          <w:color w:val="404040"/>
           <w:b/>
         </w:rPr>
         <w:t xml:space="preserve">Recommended Action</w:t>
@@ -445,7 +445,7 @@
       </w:pPr>
       <w:r>
         <w:rPr>
-          <w:rFonts w:ascii="Aptos" w:hAnsi="Aptos"/>
+          <w:rFonts w:ascii="Calibri" w:hAnsi="Calibri"/>
           <w:sz w:val="21"/>
           <w:szCs w:val="21"/>
           <w:color w:val="222222"/>
@@ -461,7 +461,7 @@
       </w:pPr>
       <w:r>
         <w:rPr>
-          <w:rFonts w:ascii="Aptos" w:hAnsi="Aptos"/>
+          <w:rFonts w:ascii="Calibri" w:hAnsi="Calibri"/>
           <w:sz w:val="20"/>
           <w:szCs w:val="20"/>
           <w:color w:val="222222"/>
@@ -478,10 +478,10 @@
       </w:pPr>
       <w:r>
         <w:rPr>
-          <w:rFonts w:ascii="Aptos" w:hAnsi="Aptos"/>
+          <w:rFonts w:ascii="Calibri" w:hAnsi="Calibri"/>
           <w:sz w:val="26"/>
           <w:szCs w:val="26"/>
-          <w:color w:val="005F9E"/>
+          <w:color w:val="404040"/>
           <w:b/>
         </w:rPr>
         <w:t xml:space="preserve">Assessment Summary</w:t>
@@ -491,11 +491,11 @@
       <w:tblPr>
         <w:tblW w:w="10800" w:type="dxa"/>
         <w:tblInd w:w="0" w:type="dxa"/>
-        <w:tblLayout w:type="fixed"/>
+        <w:tblLayout w:type="autofit"/>
         <w:tblCellMar>
-          <w:top w:w="80" w:type="dxa"/>
+          <w:top w:w="60" w:type="dxa"/>
           <w:start w:w="120" w:type="dxa"/>
-          <w:bottom w:w="80" w:type="dxa"/>
+          <w:bottom w:w="60" w:type="dxa"/>
           <w:end w:w="120" w:type="dxa"/>
         </w:tblCellMar>
         <w:tblBorders>
@@ -530,9 +530,9 @@
             </w:pPr>
             <w:r>
               <w:rPr>
-                <w:rFonts w:ascii="Aptos" w:hAnsi="Aptos"/>
-                <w:sz w:val="17"/>
-                <w:szCs w:val="17"/>
+                <w:rFonts w:ascii="Calibri" w:hAnsi="Calibri"/>
+                <w:sz w:val="18"/>
+                <w:szCs w:val="18"/>
                 <w:color w:val="FFFFFF"/>
                 <w:b/>
               </w:rPr>
@@ -553,9 +553,9 @@
             </w:pPr>
             <w:r>
               <w:rPr>
-                <w:rFonts w:ascii="Aptos" w:hAnsi="Aptos"/>
-                <w:sz w:val="17"/>
-                <w:szCs w:val="17"/>
+                <w:rFonts w:ascii="Calibri" w:hAnsi="Calibri"/>
+                <w:sz w:val="18"/>
+                <w:szCs w:val="18"/>
                 <w:color w:val="FFFFFF"/>
                 <w:b/>
               </w:rPr>
@@ -576,9 +576,9 @@
             </w:pPr>
             <w:r>
               <w:rPr>
-                <w:rFonts w:ascii="Aptos" w:hAnsi="Aptos"/>
-                <w:sz w:val="17"/>
-                <w:szCs w:val="17"/>
+                <w:rFonts w:ascii="Calibri" w:hAnsi="Calibri"/>
+                <w:sz w:val="18"/>
+                <w:szCs w:val="18"/>
                 <w:color w:val="FFFFFF"/>
                 <w:b/>
               </w:rPr>
@@ -599,9 +599,9 @@
             </w:pPr>
             <w:r>
               <w:rPr>
-                <w:rFonts w:ascii="Aptos" w:hAnsi="Aptos"/>
-                <w:sz w:val="17"/>
-                <w:szCs w:val="17"/>
+                <w:rFonts w:ascii="Calibri" w:hAnsi="Calibri"/>
+                <w:sz w:val="18"/>
+                <w:szCs w:val="18"/>
                 <w:color w:val="FFFFFF"/>
                 <w:b/>
               </w:rPr>
@@ -624,9 +624,9 @@
             </w:pPr>
             <w:r>
               <w:rPr>
-                <w:rFonts w:ascii="Aptos" w:hAnsi="Aptos"/>
-                <w:sz w:val="17"/>
-                <w:szCs w:val="17"/>
+                <w:rFonts w:ascii="Calibri" w:hAnsi="Calibri"/>
+                <w:sz w:val="18"/>
+                <w:szCs w:val="18"/>
                 <w:color w:val="222222"/>
               </w:rPr>
               <w:t xml:space="preserve">Information</w:t>
@@ -646,9 +646,9 @@
             </w:pPr>
             <w:r>
               <w:rPr>
-                <w:rFonts w:ascii="Aptos" w:hAnsi="Aptos"/>
-                <w:sz w:val="17"/>
-                <w:szCs w:val="17"/>
+                <w:rFonts w:ascii="Calibri" w:hAnsi="Calibri"/>
+                <w:sz w:val="18"/>
+                <w:szCs w:val="18"/>
                 <w:color w:val="00843D"/>
                 <w:b/>
               </w:rPr>
@@ -669,9 +669,9 @@
             </w:pPr>
             <w:r>
               <w:rPr>
-                <w:rFonts w:ascii="Aptos" w:hAnsi="Aptos"/>
-                <w:sz w:val="17"/>
-                <w:szCs w:val="17"/>
+                <w:rFonts w:ascii="Calibri" w:hAnsi="Calibri"/>
+                <w:sz w:val="18"/>
+                <w:szCs w:val="18"/>
                 <w:color w:val="222222"/>
               </w:rPr>
               <w:t xml:space="preserve">System Information</w:t>
@@ -691,9 +691,9 @@
             </w:pPr>
             <w:r>
               <w:rPr>
-                <w:rFonts w:ascii="Aptos" w:hAnsi="Aptos"/>
-                <w:sz w:val="17"/>
-                <w:szCs w:val="17"/>
+                <w:rFonts w:ascii="Calibri" w:hAnsi="Calibri"/>
+                <w:sz w:val="18"/>
+                <w:szCs w:val="18"/>
                 <w:color w:val="00843D"/>
                 <w:b/>
               </w:rPr>
@@ -716,9 +716,9 @@
             </w:pPr>
             <w:r>
               <w:rPr>
-                <w:rFonts w:ascii="Aptos" w:hAnsi="Aptos"/>
-                <w:sz w:val="17"/>
-                <w:szCs w:val="17"/>
+                <w:rFonts w:ascii="Calibri" w:hAnsi="Calibri"/>
+                <w:sz w:val="18"/>
+                <w:szCs w:val="18"/>
                 <w:color w:val="222222"/>
               </w:rPr>
               <w:t xml:space="preserve">Firmware &amp; OS Software</w:t>
@@ -738,9 +738,9 @@
             </w:pPr>
             <w:r>
               <w:rPr>
-                <w:rFonts w:ascii="Aptos" w:hAnsi="Aptos"/>
-                <w:sz w:val="17"/>
-                <w:szCs w:val="17"/>
+                <w:rFonts w:ascii="Calibri" w:hAnsi="Calibri"/>
+                <w:sz w:val="18"/>
+                <w:szCs w:val="18"/>
                 <w:color w:val="00843D"/>
                 <w:b/>
               </w:rPr>
@@ -761,9 +761,9 @@
             </w:pPr>
             <w:r>
               <w:rPr>
-                <w:rFonts w:ascii="Aptos" w:hAnsi="Aptos"/>
-                <w:sz w:val="17"/>
-                <w:szCs w:val="17"/>
+                <w:rFonts w:ascii="Calibri" w:hAnsi="Calibri"/>
+                <w:sz w:val="18"/>
+                <w:szCs w:val="18"/>
                 <w:color w:val="222222"/>
               </w:rPr>
               <w:t xml:space="preserve">Power &amp; Thermal</w:t>
@@ -783,9 +783,9 @@
             </w:pPr>
             <w:r>
               <w:rPr>
-                <w:rFonts w:ascii="Aptos" w:hAnsi="Aptos"/>
-                <w:sz w:val="17"/>
-                <w:szCs w:val="17"/>
+                <w:rFonts w:ascii="Calibri" w:hAnsi="Calibri"/>
+                <w:sz w:val="18"/>
+                <w:szCs w:val="18"/>
                 <w:color w:val="00843D"/>
                 <w:b/>
               </w:rPr>
@@ -808,9 +808,9 @@
             </w:pPr>
             <w:r>
               <w:rPr>
-                <w:rFonts w:ascii="Aptos" w:hAnsi="Aptos"/>
-                <w:sz w:val="17"/>
-                <w:szCs w:val="17"/>
+                <w:rFonts w:ascii="Calibri" w:hAnsi="Calibri"/>
+                <w:sz w:val="18"/>
+                <w:szCs w:val="18"/>
                 <w:color w:val="222222"/>
               </w:rPr>
               <w:t xml:space="preserve">Performance</w:t>
@@ -830,9 +830,9 @@
             </w:pPr>
             <w:r>
               <w:rPr>
-                <w:rFonts w:ascii="Aptos" w:hAnsi="Aptos"/>
-                <w:sz w:val="17"/>
-                <w:szCs w:val="17"/>
+                <w:rFonts w:ascii="Calibri" w:hAnsi="Calibri"/>
+                <w:sz w:val="18"/>
+                <w:szCs w:val="18"/>
                 <w:color w:val="00843D"/>
                 <w:b/>
               </w:rPr>
@@ -853,9 +853,9 @@
             </w:pPr>
             <w:r>
               <w:rPr>
-                <w:rFonts w:ascii="Aptos" w:hAnsi="Aptos"/>
-                <w:sz w:val="17"/>
-                <w:szCs w:val="17"/>
+                <w:rFonts w:ascii="Calibri" w:hAnsi="Calibri"/>
+                <w:sz w:val="18"/>
+                <w:szCs w:val="18"/>
                 <w:color w:val="222222"/>
               </w:rPr>
               <w:t xml:space="preserve">iLO Dedicated Network Port</w:t>
@@ -875,9 +875,9 @@
             </w:pPr>
             <w:r>
               <w:rPr>
-                <w:rFonts w:ascii="Aptos" w:hAnsi="Aptos"/>
-                <w:sz w:val="17"/>
-                <w:szCs w:val="17"/>
+                <w:rFonts w:ascii="Calibri" w:hAnsi="Calibri"/>
+                <w:sz w:val="18"/>
+                <w:szCs w:val="18"/>
                 <w:color w:val="00843D"/>
                 <w:b/>
               </w:rPr>
@@ -900,9 +900,9 @@
             </w:pPr>
             <w:r>
               <w:rPr>
-                <w:rFonts w:ascii="Aptos" w:hAnsi="Aptos"/>
-                <w:sz w:val="17"/>
-                <w:szCs w:val="17"/>
+                <w:rFonts w:ascii="Calibri" w:hAnsi="Calibri"/>
+                <w:sz w:val="18"/>
+                <w:szCs w:val="18"/>
                 <w:color w:val="222222"/>
               </w:rPr>
               <w:t xml:space="preserve">Remote Support</w:t>
@@ -922,9 +922,9 @@
             </w:pPr>
             <w:r>
               <w:rPr>
-                <w:rFonts w:ascii="Aptos" w:hAnsi="Aptos"/>
-                <w:sz w:val="17"/>
-                <w:szCs w:val="17"/>
+                <w:rFonts w:ascii="Calibri" w:hAnsi="Calibri"/>
+                <w:sz w:val="18"/>
+                <w:szCs w:val="18"/>
                 <w:color w:val="00843D"/>
                 <w:b/>
               </w:rPr>
@@ -945,9 +945,9 @@
             </w:pPr>
             <w:r>
               <w:rPr>
-                <w:rFonts w:ascii="Aptos" w:hAnsi="Aptos"/>
-                <w:sz w:val="17"/>
-                <w:szCs w:val="17"/>
+                <w:rFonts w:ascii="Calibri" w:hAnsi="Calibri"/>
+                <w:sz w:val="18"/>
+                <w:szCs w:val="18"/>
                 <w:color w:val="222222"/>
               </w:rPr>
               <w:t xml:space="preserve">Security Dashboard</w:t>
@@ -967,9 +967,9 @@
             </w:pPr>
             <w:r>
               <w:rPr>
-                <w:rFonts w:ascii="Aptos" w:hAnsi="Aptos"/>
-                <w:sz w:val="17"/>
-                <w:szCs w:val="17"/>
+                <w:rFonts w:ascii="Calibri" w:hAnsi="Calibri"/>
+                <w:sz w:val="18"/>
+                <w:szCs w:val="18"/>
                 <w:color w:val="00843D"/>
                 <w:b/>
               </w:rPr>
@@ -989,7 +989,7 @@
       </w:pPr>
       <w:r>
         <w:rPr>
-          <w:rFonts w:ascii="Aptos" w:hAnsi="Aptos"/>
+          <w:rFonts w:ascii="Calibri" w:hAnsi="Calibri"/>
           <w:sz w:val="32"/>
           <w:szCs w:val="32"/>
           <w:color w:val="005F9E"/>
@@ -1007,10 +1007,10 @@
       </w:pPr>
       <w:r>
         <w:rPr>
-          <w:rFonts w:ascii="Aptos" w:hAnsi="Aptos"/>
+          <w:rFonts w:ascii="Calibri" w:hAnsi="Calibri"/>
           <w:sz w:val="26"/>
           <w:szCs w:val="26"/>
-          <w:color w:val="005F9E"/>
+          <w:color w:val="404040"/>
           <w:b/>
         </w:rPr>
         <w:t xml:space="preserve">Server</w:t>
@@ -1020,11 +1020,11 @@
       <w:tblPr>
         <w:tblW w:w="10800" w:type="dxa"/>
         <w:tblInd w:w="0" w:type="dxa"/>
-        <w:tblLayout w:type="fixed"/>
+        <w:tblLayout w:type="autofit"/>
         <w:tblCellMar>
-          <w:top w:w="80" w:type="dxa"/>
+          <w:top w:w="60" w:type="dxa"/>
           <w:start w:w="120" w:type="dxa"/>
-          <w:bottom w:w="80" w:type="dxa"/>
+          <w:bottom w:w="60" w:type="dxa"/>
           <w:end w:w="120" w:type="dxa"/>
         </w:tblCellMar>
         <w:tblBorders>
@@ -1057,9 +1057,9 @@
             </w:pPr>
             <w:r>
               <w:rPr>
-                <w:rFonts w:ascii="Aptos" w:hAnsi="Aptos"/>
-                <w:sz w:val="17"/>
-                <w:szCs w:val="17"/>
+                <w:rFonts w:ascii="Calibri" w:hAnsi="Calibri"/>
+                <w:sz w:val="18"/>
+                <w:szCs w:val="18"/>
                 <w:color w:val="FFFFFF"/>
                 <w:b/>
               </w:rPr>
@@ -1080,9 +1080,9 @@
             </w:pPr>
             <w:r>
               <w:rPr>
-                <w:rFonts w:ascii="Aptos" w:hAnsi="Aptos"/>
-                <w:sz w:val="17"/>
-                <w:szCs w:val="17"/>
+                <w:rFonts w:ascii="Calibri" w:hAnsi="Calibri"/>
+                <w:sz w:val="18"/>
+                <w:szCs w:val="18"/>
                 <w:color w:val="FFFFFF"/>
                 <w:b/>
               </w:rPr>
@@ -1105,9 +1105,9 @@
             </w:pPr>
             <w:r>
               <w:rPr>
-                <w:rFonts w:ascii="Aptos" w:hAnsi="Aptos"/>
-                <w:sz w:val="17"/>
-                <w:szCs w:val="17"/>
+                <w:rFonts w:ascii="Calibri" w:hAnsi="Calibri"/>
+                <w:sz w:val="18"/>
+                <w:szCs w:val="18"/>
                 <w:color w:val="222222"/>
               </w:rPr>
               <w:t xml:space="preserve">Product name</w:t>
@@ -1127,9 +1127,9 @@
             </w:pPr>
             <w:r>
               <w:rPr>
-                <w:rFonts w:ascii="Aptos" w:hAnsi="Aptos"/>
-                <w:sz w:val="17"/>
-                <w:szCs w:val="17"/>
+                <w:rFonts w:ascii="Calibri" w:hAnsi="Calibri"/>
+                <w:sz w:val="18"/>
+                <w:szCs w:val="18"/>
                 <w:color w:val="222222"/>
               </w:rPr>
               <w:t xml:space="preserve">HPE ProLiant DL380 Gen10</w:t>
@@ -1151,9 +1151,9 @@
             </w:pPr>
             <w:r>
               <w:rPr>
-                <w:rFonts w:ascii="Aptos" w:hAnsi="Aptos"/>
-                <w:sz w:val="17"/>
-                <w:szCs w:val="17"/>
+                <w:rFonts w:ascii="Calibri" w:hAnsi="Calibri"/>
+                <w:sz w:val="18"/>
+                <w:szCs w:val="18"/>
                 <w:color w:val="222222"/>
               </w:rPr>
               <w:t xml:space="preserve">Serial number</w:t>
@@ -1173,9 +1173,9 @@
             </w:pPr>
             <w:r>
               <w:rPr>
-                <w:rFonts w:ascii="Aptos" w:hAnsi="Aptos"/>
-                <w:sz w:val="17"/>
-                <w:szCs w:val="17"/>
+                <w:rFonts w:ascii="Calibri" w:hAnsi="Calibri"/>
+                <w:sz w:val="18"/>
+                <w:szCs w:val="18"/>
                 <w:color w:val="222222"/>
               </w:rPr>
               <w:t xml:space="preserve">EXAMPLE123</w:t>
@@ -1197,9 +1197,9 @@
             </w:pPr>
             <w:r>
               <w:rPr>
-                <w:rFonts w:ascii="Aptos" w:hAnsi="Aptos"/>
-                <w:sz w:val="17"/>
-                <w:szCs w:val="17"/>
+                <w:rFonts w:ascii="Calibri" w:hAnsi="Calibri"/>
+                <w:sz w:val="18"/>
+                <w:szCs w:val="18"/>
                 <w:color w:val="222222"/>
               </w:rPr>
               <w:t xml:space="preserve">Health</w:t>
@@ -1219,9 +1219,9 @@
             </w:pPr>
             <w:r>
               <w:rPr>
-                <w:rFonts w:ascii="Aptos" w:hAnsi="Aptos"/>
-                <w:sz w:val="17"/>
-                <w:szCs w:val="17"/>
+                <w:rFonts w:ascii="Calibri" w:hAnsi="Calibri"/>
+                <w:sz w:val="18"/>
+                <w:szCs w:val="18"/>
                 <w:color w:val="00843D"/>
                 <w:b/>
               </w:rPr>
@@ -1240,10 +1240,10 @@
       </w:pPr>
       <w:r>
         <w:rPr>
-          <w:rFonts w:ascii="Aptos" w:hAnsi="Aptos"/>
+          <w:rFonts w:ascii="Calibri" w:hAnsi="Calibri"/>
           <w:sz w:val="26"/>
           <w:szCs w:val="26"/>
-          <w:color w:val="005F9E"/>
+          <w:color w:val="404040"/>
           <w:b/>
         </w:rPr>
         <w:t xml:space="preserve">iLO</w:t>
@@ -1253,11 +1253,11 @@
       <w:tblPr>
         <w:tblW w:w="10800" w:type="dxa"/>
         <w:tblInd w:w="0" w:type="dxa"/>
-        <w:tblLayout w:type="fixed"/>
+        <w:tblLayout w:type="autofit"/>
         <w:tblCellMar>
-          <w:top w:w="80" w:type="dxa"/>
+          <w:top w:w="60" w:type="dxa"/>
           <w:start w:w="120" w:type="dxa"/>
-          <w:bottom w:w="80" w:type="dxa"/>
+          <w:bottom w:w="60" w:type="dxa"/>
           <w:end w:w="120" w:type="dxa"/>
         </w:tblCellMar>
         <w:tblBorders>
@@ -1291,9 +1291,9 @@
             </w:pPr>
             <w:r>
               <w:rPr>
-                <w:rFonts w:ascii="Aptos" w:hAnsi="Aptos"/>
-                <w:sz w:val="17"/>
-                <w:szCs w:val="17"/>
+                <w:rFonts w:ascii="Calibri" w:hAnsi="Calibri"/>
+                <w:sz w:val="18"/>
+                <w:szCs w:val="18"/>
                 <w:color w:val="FFFFFF"/>
                 <w:b/>
               </w:rPr>
@@ -1314,9 +1314,9 @@
             </w:pPr>
             <w:r>
               <w:rPr>
-                <w:rFonts w:ascii="Aptos" w:hAnsi="Aptos"/>
-                <w:sz w:val="17"/>
-                <w:szCs w:val="17"/>
+                <w:rFonts w:ascii="Calibri" w:hAnsi="Calibri"/>
+                <w:sz w:val="18"/>
+                <w:szCs w:val="18"/>
                 <w:color w:val="FFFFFF"/>
                 <w:b/>
               </w:rPr>
@@ -1337,9 +1337,9 @@
             </w:pPr>
             <w:r>
               <w:rPr>
-                <w:rFonts w:ascii="Aptos" w:hAnsi="Aptos"/>
-                <w:sz w:val="17"/>
-                <w:szCs w:val="17"/>
+                <w:rFonts w:ascii="Calibri" w:hAnsi="Calibri"/>
+                <w:sz w:val="18"/>
+                <w:szCs w:val="18"/>
                 <w:color w:val="FFFFFF"/>
                 <w:b/>
               </w:rPr>
@@ -1362,9 +1362,9 @@
             </w:pPr>
             <w:r>
               <w:rPr>
-                <w:rFonts w:ascii="Aptos" w:hAnsi="Aptos"/>
-                <w:sz w:val="17"/>
-                <w:szCs w:val="17"/>
+                <w:rFonts w:ascii="Calibri" w:hAnsi="Calibri"/>
+                <w:sz w:val="18"/>
+                <w:szCs w:val="18"/>
                 <w:color w:val="222222"/>
               </w:rPr>
               <w:t xml:space="preserve">iLO 5</w:t>
@@ -1384,9 +1384,9 @@
             </w:pPr>
             <w:r>
               <w:rPr>
-                <w:rFonts w:ascii="Aptos" w:hAnsi="Aptos"/>
-                <w:sz w:val="17"/>
-                <w:szCs w:val="17"/>
+                <w:rFonts w:ascii="Calibri" w:hAnsi="Calibri"/>
+                <w:sz w:val="18"/>
+                <w:szCs w:val="18"/>
                 <w:color w:val="222222"/>
               </w:rPr>
               <w:t xml:space="preserve">3.10</w:t>
@@ -1406,9 +1406,9 @@
             </w:pPr>
             <w:r>
               <w:rPr>
-                <w:rFonts w:ascii="Aptos" w:hAnsi="Aptos"/>
-                <w:sz w:val="17"/>
-                <w:szCs w:val="17"/>
+                <w:rFonts w:ascii="Calibri" w:hAnsi="Calibri"/>
+                <w:sz w:val="18"/>
+                <w:szCs w:val="18"/>
                 <w:color w:val="00843D"/>
                 <w:b/>
               </w:rPr>
@@ -1427,10 +1427,10 @@
       </w:pPr>
       <w:r>
         <w:rPr>
-          <w:rFonts w:ascii="Aptos" w:hAnsi="Aptos"/>
+          <w:rFonts w:ascii="Calibri" w:hAnsi="Calibri"/>
           <w:sz w:val="26"/>
           <w:szCs w:val="26"/>
-          <w:color w:val="005F9E"/>
+          <w:color w:val="404040"/>
           <w:b/>
         </w:rPr>
         <w:t xml:space="preserve">Status</w:t>
@@ -1440,11 +1440,11 @@
       <w:tblPr>
         <w:tblW w:w="10800" w:type="dxa"/>
         <w:tblInd w:w="0" w:type="dxa"/>
-        <w:tblLayout w:type="fixed"/>
+        <w:tblLayout w:type="autofit"/>
         <w:tblCellMar>
-          <w:top w:w="80" w:type="dxa"/>
+          <w:top w:w="60" w:type="dxa"/>
           <w:start w:w="120" w:type="dxa"/>
-          <w:bottom w:w="80" w:type="dxa"/>
+          <w:bottom w:w="60" w:type="dxa"/>
           <w:end w:w="120" w:type="dxa"/>
         </w:tblCellMar>
         <w:tblBorders>
@@ -1478,9 +1478,9 @@
             </w:pPr>
             <w:r>
               <w:rPr>
-                <w:rFonts w:ascii="Aptos" w:hAnsi="Aptos"/>
-                <w:sz w:val="17"/>
-                <w:szCs w:val="17"/>
+                <w:rFonts w:ascii="Calibri" w:hAnsi="Calibri"/>
+                <w:sz w:val="18"/>
+                <w:szCs w:val="18"/>
                 <w:color w:val="FFFFFF"/>
                 <w:b/>
               </w:rPr>
@@ -1501,9 +1501,9 @@
             </w:pPr>
             <w:r>
               <w:rPr>
-                <w:rFonts w:ascii="Aptos" w:hAnsi="Aptos"/>
-                <w:sz w:val="17"/>
-                <w:szCs w:val="17"/>
+                <w:rFonts w:ascii="Calibri" w:hAnsi="Calibri"/>
+                <w:sz w:val="18"/>
+                <w:szCs w:val="18"/>
                 <w:color w:val="FFFFFF"/>
                 <w:b/>
               </w:rPr>
@@ -1524,9 +1524,9 @@
             </w:pPr>
             <w:r>
               <w:rPr>
-                <w:rFonts w:ascii="Aptos" w:hAnsi="Aptos"/>
-                <w:sz w:val="17"/>
-                <w:szCs w:val="17"/>
+                <w:rFonts w:ascii="Calibri" w:hAnsi="Calibri"/>
+                <w:sz w:val="18"/>
+                <w:szCs w:val="18"/>
                 <w:color w:val="FFFFFF"/>
                 <w:b/>
               </w:rPr>
@@ -1549,9 +1549,9 @@
             </w:pPr>
             <w:r>
               <w:rPr>
-                <w:rFonts w:ascii="Aptos" w:hAnsi="Aptos"/>
-                <w:sz w:val="17"/>
-                <w:szCs w:val="17"/>
+                <w:rFonts w:ascii="Calibri" w:hAnsi="Calibri"/>
+                <w:sz w:val="18"/>
+                <w:szCs w:val="18"/>
                 <w:color w:val="222222"/>
               </w:rPr>
               <w:t xml:space="preserve">Server</w:t>
@@ -1571,9 +1571,9 @@
             </w:pPr>
             <w:r>
               <w:rPr>
-                <w:rFonts w:ascii="Aptos" w:hAnsi="Aptos"/>
-                <w:sz w:val="17"/>
-                <w:szCs w:val="17"/>
+                <w:rFonts w:ascii="Calibri" w:hAnsi="Calibri"/>
+                <w:sz w:val="18"/>
+                <w:szCs w:val="18"/>
                 <w:color w:val="00843D"/>
                 <w:b/>
               </w:rPr>
@@ -1594,9 +1594,9 @@
             </w:pPr>
             <w:r>
               <w:rPr>
-                <w:rFonts w:ascii="Aptos" w:hAnsi="Aptos"/>
-                <w:sz w:val="17"/>
-                <w:szCs w:val="17"/>
+                <w:rFonts w:ascii="Calibri" w:hAnsi="Calibri"/>
+                <w:sz w:val="18"/>
+                <w:szCs w:val="18"/>
                 <w:color w:val="222222"/>
               </w:rPr>
               <w:t xml:space="preserve">Power: On</w:t>
@@ -1614,10 +1614,10 @@
       </w:pPr>
       <w:r>
         <w:rPr>
-          <w:rFonts w:ascii="Aptos" w:hAnsi="Aptos"/>
+          <w:rFonts w:ascii="Calibri" w:hAnsi="Calibri"/>
           <w:sz w:val="26"/>
           <w:szCs w:val="26"/>
-          <w:color w:val="005F9E"/>
+          <w:color w:val="404040"/>
           <w:b/>
         </w:rPr>
         <w:t xml:space="preserve">HPE Compute Ops Management</w:t>
@@ -1627,11 +1627,11 @@
       <w:tblPr>
         <w:tblW w:w="10800" w:type="dxa"/>
         <w:tblInd w:w="0" w:type="dxa"/>
-        <w:tblLayout w:type="fixed"/>
+        <w:tblLayout w:type="autofit"/>
         <w:tblCellMar>
-          <w:top w:w="80" w:type="dxa"/>
+          <w:top w:w="60" w:type="dxa"/>
           <w:start w:w="120" w:type="dxa"/>
-          <w:bottom w:w="80" w:type="dxa"/>
+          <w:bottom w:w="60" w:type="dxa"/>
           <w:end w:w="120" w:type="dxa"/>
         </w:tblCellMar>
         <w:tblBorders>
@@ -1666,9 +1666,9 @@
             </w:pPr>
             <w:r>
               <w:rPr>
-                <w:rFonts w:ascii="Aptos" w:hAnsi="Aptos"/>
-                <w:sz w:val="17"/>
-                <w:szCs w:val="17"/>
+                <w:rFonts w:ascii="Calibri" w:hAnsi="Calibri"/>
+                <w:sz w:val="18"/>
+                <w:szCs w:val="18"/>
                 <w:color w:val="FFFFFF"/>
                 <w:b/>
               </w:rPr>
@@ -1689,9 +1689,9 @@
             </w:pPr>
             <w:r>
               <w:rPr>
-                <w:rFonts w:ascii="Aptos" w:hAnsi="Aptos"/>
-                <w:sz w:val="17"/>
-                <w:szCs w:val="17"/>
+                <w:rFonts w:ascii="Calibri" w:hAnsi="Calibri"/>
+                <w:sz w:val="18"/>
+                <w:szCs w:val="18"/>
                 <w:color w:val="FFFFFF"/>
                 <w:b/>
               </w:rPr>
@@ -1712,9 +1712,9 @@
             </w:pPr>
             <w:r>
               <w:rPr>
-                <w:rFonts w:ascii="Aptos" w:hAnsi="Aptos"/>
-                <w:sz w:val="17"/>
-                <w:szCs w:val="17"/>
+                <w:rFonts w:ascii="Calibri" w:hAnsi="Calibri"/>
+                <w:sz w:val="18"/>
+                <w:szCs w:val="18"/>
                 <w:color w:val="FFFFFF"/>
                 <w:b/>
               </w:rPr>
@@ -1735,9 +1735,9 @@
             </w:pPr>
             <w:r>
               <w:rPr>
-                <w:rFonts w:ascii="Aptos" w:hAnsi="Aptos"/>
-                <w:sz w:val="17"/>
-                <w:szCs w:val="17"/>
+                <w:rFonts w:ascii="Calibri" w:hAnsi="Calibri"/>
+                <w:sz w:val="18"/>
+                <w:szCs w:val="18"/>
                 <w:color w:val="FFFFFF"/>
                 <w:b/>
               </w:rPr>
@@ -1760,9 +1760,9 @@
             </w:pPr>
             <w:r>
               <w:rPr>
-                <w:rFonts w:ascii="Aptos" w:hAnsi="Aptos"/>
-                <w:sz w:val="17"/>
-                <w:szCs w:val="17"/>
+                <w:rFonts w:ascii="Calibri" w:hAnsi="Calibri"/>
+                <w:sz w:val="18"/>
+                <w:szCs w:val="18"/>
                 <w:color w:val="222222"/>
               </w:rPr>
               <w:t xml:space="preserve">iLO 5</w:t>
@@ -1782,9 +1782,9 @@
             </w:pPr>
             <w:r>
               <w:rPr>
-                <w:rFonts w:ascii="Aptos" w:hAnsi="Aptos"/>
-                <w:sz w:val="17"/>
-                <w:szCs w:val="17"/>
+                <w:rFonts w:ascii="Calibri" w:hAnsi="Calibri"/>
+                <w:sz w:val="18"/>
+                <w:szCs w:val="18"/>
                 <w:color w:val="222222"/>
               </w:rPr>
               <w:t xml:space="preserve">Yes</w:t>
@@ -1804,9 +1804,9 @@
             </w:pPr>
             <w:r>
               <w:rPr>
-                <w:rFonts w:ascii="Aptos" w:hAnsi="Aptos"/>
-                <w:sz w:val="17"/>
-                <w:szCs w:val="17"/>
+                <w:rFonts w:ascii="Calibri" w:hAnsi="Calibri"/>
+                <w:sz w:val="18"/>
+                <w:szCs w:val="18"/>
                 <w:color w:val="666666"/>
                 <w:b/>
               </w:rPr>
@@ -1827,9 +1827,9 @@
             </w:pPr>
             <w:r>
               <w:rPr>
-                <w:rFonts w:ascii="Aptos" w:hAnsi="Aptos"/>
-                <w:sz w:val="17"/>
-                <w:szCs w:val="17"/>
+                <w:rFonts w:ascii="Calibri" w:hAnsi="Calibri"/>
+                <w:sz w:val="18"/>
+                <w:szCs w:val="18"/>
                 <w:color w:val="222222"/>
               </w:rPr>
               <w:t xml:space="preserve">Not reported</w:t>
@@ -1847,7 +1847,7 @@
       </w:pPr>
       <w:r>
         <w:rPr>
-          <w:rFonts w:ascii="Aptos" w:hAnsi="Aptos"/>
+          <w:rFonts w:ascii="Calibri" w:hAnsi="Calibri"/>
           <w:sz w:val="32"/>
           <w:szCs w:val="32"/>
           <w:color w:val="005F9E"/>
@@ -1865,10 +1865,10 @@
       </w:pPr>
       <w:r>
         <w:rPr>
-          <w:rFonts w:ascii="Aptos" w:hAnsi="Aptos"/>
+          <w:rFonts w:ascii="Calibri" w:hAnsi="Calibri"/>
           <w:sz w:val="26"/>
           <w:szCs w:val="26"/>
-          <w:color w:val="005F9E"/>
+          <w:color w:val="404040"/>
           <w:b/>
         </w:rPr>
         <w:t xml:space="preserve">Registration</w:t>
@@ -1878,11 +1878,11 @@
       <w:tblPr>
         <w:tblW w:w="10800" w:type="dxa"/>
         <w:tblInd w:w="0" w:type="dxa"/>
-        <w:tblLayout w:type="fixed"/>
+        <w:tblLayout w:type="autofit"/>
         <w:tblCellMar>
-          <w:top w:w="80" w:type="dxa"/>
+          <w:top w:w="60" w:type="dxa"/>
           <w:start w:w="120" w:type="dxa"/>
-          <w:bottom w:w="80" w:type="dxa"/>
+          <w:bottom w:w="60" w:type="dxa"/>
           <w:end w:w="120" w:type="dxa"/>
         </w:tblCellMar>
         <w:tblBorders>
@@ -1915,9 +1915,9 @@
             </w:pPr>
             <w:r>
               <w:rPr>
-                <w:rFonts w:ascii="Aptos" w:hAnsi="Aptos"/>
-                <w:sz w:val="17"/>
-                <w:szCs w:val="17"/>
+                <w:rFonts w:ascii="Calibri" w:hAnsi="Calibri"/>
+                <w:sz w:val="18"/>
+                <w:szCs w:val="18"/>
                 <w:color w:val="FFFFFF"/>
                 <w:b/>
               </w:rPr>
@@ -1938,9 +1938,9 @@
             </w:pPr>
             <w:r>
               <w:rPr>
-                <w:rFonts w:ascii="Aptos" w:hAnsi="Aptos"/>
-                <w:sz w:val="17"/>
-                <w:szCs w:val="17"/>
+                <w:rFonts w:ascii="Calibri" w:hAnsi="Calibri"/>
+                <w:sz w:val="18"/>
+                <w:szCs w:val="18"/>
                 <w:color w:val="FFFFFF"/>
                 <w:b/>
               </w:rPr>
@@ -1963,9 +1963,9 @@
             </w:pPr>
             <w:r>
               <w:rPr>
-                <w:rFonts w:ascii="Aptos" w:hAnsi="Aptos"/>
-                <w:sz w:val="17"/>
-                <w:szCs w:val="17"/>
+                <w:rFonts w:ascii="Calibri" w:hAnsi="Calibri"/>
+                <w:sz w:val="18"/>
+                <w:szCs w:val="18"/>
                 <w:color w:val="222222"/>
               </w:rPr>
               <w:t xml:space="preserve">Registration</w:t>
@@ -1985,9 +1985,9 @@
             </w:pPr>
             <w:r>
               <w:rPr>
-                <w:rFonts w:ascii="Aptos" w:hAnsi="Aptos"/>
-                <w:sz w:val="17"/>
-                <w:szCs w:val="17"/>
+                <w:rFonts w:ascii="Calibri" w:hAnsi="Calibri"/>
+                <w:sz w:val="18"/>
+                <w:szCs w:val="18"/>
                 <w:color w:val="222222"/>
               </w:rPr>
               <w:t xml:space="preserve">Registered</w:t>
@@ -2009,9 +2009,9 @@
             </w:pPr>
             <w:r>
               <w:rPr>
-                <w:rFonts w:ascii="Aptos" w:hAnsi="Aptos"/>
-                <w:sz w:val="17"/>
-                <w:szCs w:val="17"/>
+                <w:rFonts w:ascii="Calibri" w:hAnsi="Calibri"/>
+                <w:sz w:val="18"/>
+                <w:szCs w:val="18"/>
                 <w:color w:val="222222"/>
               </w:rPr>
               <w:t xml:space="preserve">Connection model</w:t>
@@ -2031,9 +2031,9 @@
             </w:pPr>
             <w:r>
               <w:rPr>
-                <w:rFonts w:ascii="Aptos" w:hAnsi="Aptos"/>
-                <w:sz w:val="17"/>
-                <w:szCs w:val="17"/>
+                <w:rFonts w:ascii="Calibri" w:hAnsi="Calibri"/>
+                <w:sz w:val="18"/>
+                <w:szCs w:val="18"/>
                 <w:color w:val="222222"/>
               </w:rPr>
               <w:t xml:space="preserve">CentralConnect</w:t>
@@ -2055,9 +2055,9 @@
             </w:pPr>
             <w:r>
               <w:rPr>
-                <w:rFonts w:ascii="Aptos" w:hAnsi="Aptos"/>
-                <w:sz w:val="17"/>
-                <w:szCs w:val="17"/>
+                <w:rFonts w:ascii="Calibri" w:hAnsi="Calibri"/>
+                <w:sz w:val="18"/>
+                <w:szCs w:val="18"/>
                 <w:color w:val="222222"/>
               </w:rPr>
               <w:t xml:space="preserve">Destination</w:t>
@@ -2077,9 +2077,9 @@
             </w:pPr>
             <w:r>
               <w:rPr>
-                <w:rFonts w:ascii="Aptos" w:hAnsi="Aptos"/>
-                <w:sz w:val="17"/>
-                <w:szCs w:val="17"/>
+                <w:rFonts w:ascii="Calibri" w:hAnsi="Calibri"/>
+                <w:sz w:val="18"/>
+                <w:szCs w:val="18"/>
                 <w:color w:val="222222"/>
               </w:rPr>
               <w:t xml:space="preserve">https://support.example.com</w:t>
@@ -2101,9 +2101,9 @@
             </w:pPr>
             <w:r>
               <w:rPr>
-                <w:rFonts w:ascii="Aptos" w:hAnsi="Aptos"/>
-                <w:sz w:val="17"/>
-                <w:szCs w:val="17"/>
+                <w:rFonts w:ascii="Calibri" w:hAnsi="Calibri"/>
+                <w:sz w:val="18"/>
+                <w:szCs w:val="18"/>
                 <w:color w:val="222222"/>
               </w:rPr>
               <w:t xml:space="preserve">Last transmission error</w:t>
@@ -2123,9 +2123,9 @@
             </w:pPr>
             <w:r>
               <w:rPr>
-                <w:rFonts w:ascii="Aptos" w:hAnsi="Aptos"/>
-                <w:sz w:val="17"/>
-                <w:szCs w:val="17"/>
+                <w:rFonts w:ascii="Calibri" w:hAnsi="Calibri"/>
+                <w:sz w:val="18"/>
+                <w:szCs w:val="18"/>
                 <w:color w:val="222222"/>
               </w:rPr>
               <w:t xml:space="preserve">None</w:t>
@@ -2143,7 +2143,7 @@
       </w:pPr>
       <w:r>
         <w:rPr>
-          <w:rFonts w:ascii="Aptos" w:hAnsi="Aptos"/>
+          <w:rFonts w:ascii="Calibri" w:hAnsi="Calibri"/>
           <w:sz w:val="32"/>
           <w:szCs w:val="32"/>
           <w:color w:val="005F9E"/>
@@ -2156,11 +2156,11 @@
       <w:tblPr>
         <w:tblW w:w="10800" w:type="dxa"/>
         <w:tblInd w:w="0" w:type="dxa"/>
-        <w:tblLayout w:type="fixed"/>
+        <w:tblLayout w:type="autofit"/>
         <w:tblCellMar>
-          <w:top w:w="80" w:type="dxa"/>
+          <w:top w:w="60" w:type="dxa"/>
           <w:start w:w="120" w:type="dxa"/>
-          <w:bottom w:w="80" w:type="dxa"/>
+          <w:bottom w:w="60" w:type="dxa"/>
           <w:end w:w="120" w:type="dxa"/>
         </w:tblCellMar>
         <w:tblBorders>
@@ -2193,9 +2193,9 @@
             </w:pPr>
             <w:r>
               <w:rPr>
-                <w:rFonts w:ascii="Aptos" w:hAnsi="Aptos"/>
-                <w:sz w:val="17"/>
-                <w:szCs w:val="17"/>
+                <w:rFonts w:ascii="Calibri" w:hAnsi="Calibri"/>
+                <w:sz w:val="18"/>
+                <w:szCs w:val="18"/>
                 <w:color w:val="FFFFFF"/>
                 <w:b/>
               </w:rPr>
@@ -2216,9 +2216,9 @@
             </w:pPr>
             <w:r>
               <w:rPr>
-                <w:rFonts w:ascii="Aptos" w:hAnsi="Aptos"/>
-                <w:sz w:val="17"/>
-                <w:szCs w:val="17"/>
+                <w:rFonts w:ascii="Calibri" w:hAnsi="Calibri"/>
+                <w:sz w:val="18"/>
+                <w:szCs w:val="18"/>
                 <w:color w:val="FFFFFF"/>
                 <w:b/>
               </w:rPr>
@@ -2241,9 +2241,9 @@
             </w:pPr>
             <w:r>
               <w:rPr>
-                <w:rFonts w:ascii="Aptos" w:hAnsi="Aptos"/>
-                <w:sz w:val="17"/>
-                <w:szCs w:val="17"/>
+                <w:rFonts w:ascii="Calibri" w:hAnsi="Calibri"/>
+                <w:sz w:val="18"/>
+                <w:szCs w:val="18"/>
                 <w:color w:val="222222"/>
               </w:rPr>
               <w:t xml:space="preserve">Overall Security Status</w:t>
@@ -2263,9 +2263,9 @@
             </w:pPr>
             <w:r>
               <w:rPr>
-                <w:rFonts w:ascii="Aptos" w:hAnsi="Aptos"/>
-                <w:sz w:val="17"/>
-                <w:szCs w:val="17"/>
+                <w:rFonts w:ascii="Calibri" w:hAnsi="Calibri"/>
+                <w:sz w:val="18"/>
+                <w:szCs w:val="18"/>
                 <w:color w:val="00843D"/>
                 <w:b/>
               </w:rPr>
@@ -2284,7 +2284,7 @@
       </w:pPr>
       <w:r>
         <w:rPr>
-          <w:rFonts w:ascii="Aptos" w:hAnsi="Aptos"/>
+          <w:rFonts w:ascii="Calibri" w:hAnsi="Calibri"/>
           <w:sz w:val="32"/>
           <w:szCs w:val="32"/>
           <w:color w:val="005F9E"/>
@@ -2302,10 +2302,10 @@
       </w:pPr>
       <w:r>
         <w:rPr>
-          <w:rFonts w:ascii="Aptos" w:hAnsi="Aptos"/>
+          <w:rFonts w:ascii="Calibri" w:hAnsi="Calibri"/>
           <w:sz w:val="26"/>
           <w:szCs w:val="26"/>
-          <w:color w:val="005F9E"/>
+          <w:color w:val="404040"/>
           <w:b/>
         </w:rPr>
         <w:t xml:space="preserve">Summary</w:t>
@@ -2315,11 +2315,11 @@
       <w:tblPr>
         <w:tblW w:w="10800" w:type="dxa"/>
         <w:tblInd w:w="0" w:type="dxa"/>
-        <w:tblLayout w:type="fixed"/>
+        <w:tblLayout w:type="autofit"/>
         <w:tblCellMar>
-          <w:top w:w="80" w:type="dxa"/>
+          <w:top w:w="60" w:type="dxa"/>
           <w:start w:w="120" w:type="dxa"/>
-          <w:bottom w:w="80" w:type="dxa"/>
+          <w:bottom w:w="60" w:type="dxa"/>
           <w:end w:w="120" w:type="dxa"/>
         </w:tblCellMar>
         <w:tblBorders>
@@ -2352,9 +2352,9 @@
             </w:pPr>
             <w:r>
               <w:rPr>
-                <w:rFonts w:ascii="Aptos" w:hAnsi="Aptos"/>
-                <w:sz w:val="17"/>
-                <w:szCs w:val="17"/>
+                <w:rFonts w:ascii="Calibri" w:hAnsi="Calibri"/>
+                <w:sz w:val="18"/>
+                <w:szCs w:val="18"/>
                 <w:color w:val="FFFFFF"/>
                 <w:b/>
               </w:rPr>
@@ -2375,9 +2375,9 @@
             </w:pPr>
             <w:r>
               <w:rPr>
-                <w:rFonts w:ascii="Aptos" w:hAnsi="Aptos"/>
-                <w:sz w:val="17"/>
-                <w:szCs w:val="17"/>
+                <w:rFonts w:ascii="Calibri" w:hAnsi="Calibri"/>
+                <w:sz w:val="18"/>
+                <w:szCs w:val="18"/>
                 <w:color w:val="FFFFFF"/>
                 <w:b/>
               </w:rPr>
@@ -2400,9 +2400,9 @@
             </w:pPr>
             <w:r>
               <w:rPr>
-                <w:rFonts w:ascii="Aptos" w:hAnsi="Aptos"/>
-                <w:sz w:val="17"/>
-                <w:szCs w:val="17"/>
+                <w:rFonts w:ascii="Calibri" w:hAnsi="Calibri"/>
+                <w:sz w:val="18"/>
+                <w:szCs w:val="18"/>
                 <w:color w:val="222222"/>
               </w:rPr>
               <w:t xml:space="preserve">Product name</w:t>
@@ -2422,9 +2422,9 @@
             </w:pPr>
             <w:r>
               <w:rPr>
-                <w:rFonts w:ascii="Aptos" w:hAnsi="Aptos"/>
-                <w:sz w:val="17"/>
-                <w:szCs w:val="17"/>
+                <w:rFonts w:ascii="Calibri" w:hAnsi="Calibri"/>
+                <w:sz w:val="18"/>
+                <w:szCs w:val="18"/>
                 <w:color w:val="222222"/>
               </w:rPr>
               <w:t xml:space="preserve">HPE ProLiant DL380 Gen10</w:t>
@@ -2446,9 +2446,9 @@
             </w:pPr>
             <w:r>
               <w:rPr>
-                <w:rFonts w:ascii="Aptos" w:hAnsi="Aptos"/>
-                <w:sz w:val="17"/>
-                <w:szCs w:val="17"/>
+                <w:rFonts w:ascii="Calibri" w:hAnsi="Calibri"/>
+                <w:sz w:val="18"/>
+                <w:szCs w:val="18"/>
                 <w:color w:val="222222"/>
               </w:rPr>
               <w:t xml:space="preserve">Serial number</w:t>
@@ -2468,9 +2468,9 @@
             </w:pPr>
             <w:r>
               <w:rPr>
-                <w:rFonts w:ascii="Aptos" w:hAnsi="Aptos"/>
-                <w:sz w:val="17"/>
-                <w:szCs w:val="17"/>
+                <w:rFonts w:ascii="Calibri" w:hAnsi="Calibri"/>
+                <w:sz w:val="18"/>
+                <w:szCs w:val="18"/>
                 <w:color w:val="222222"/>
               </w:rPr>
               <w:t xml:space="preserve">EXAMPLE123</w:t>
@@ -2492,9 +2492,9 @@
             </w:pPr>
             <w:r>
               <w:rPr>
-                <w:rFonts w:ascii="Aptos" w:hAnsi="Aptos"/>
-                <w:sz w:val="17"/>
-                <w:szCs w:val="17"/>
+                <w:rFonts w:ascii="Calibri" w:hAnsi="Calibri"/>
+                <w:sz w:val="18"/>
+                <w:szCs w:val="18"/>
                 <w:color w:val="222222"/>
               </w:rPr>
               <w:t xml:space="preserve">Health</w:t>
@@ -2514,9 +2514,9 @@
             </w:pPr>
             <w:r>
               <w:rPr>
-                <w:rFonts w:ascii="Aptos" w:hAnsi="Aptos"/>
-                <w:sz w:val="17"/>
-                <w:szCs w:val="17"/>
+                <w:rFonts w:ascii="Calibri" w:hAnsi="Calibri"/>
+                <w:sz w:val="18"/>
+                <w:szCs w:val="18"/>
                 <w:color w:val="00843D"/>
                 <w:b/>
               </w:rPr>
@@ -2535,10 +2535,10 @@
       </w:pPr>
       <w:r>
         <w:rPr>
-          <w:rFonts w:ascii="Aptos" w:hAnsi="Aptos"/>
+          <w:rFonts w:ascii="Calibri" w:hAnsi="Calibri"/>
           <w:sz w:val="26"/>
           <w:szCs w:val="26"/>
-          <w:color w:val="005F9E"/>
+          <w:color w:val="404040"/>
           <w:b/>
         </w:rPr>
         <w:t xml:space="preserve">Processors</w:t>
@@ -2548,11 +2548,11 @@
       <w:tblPr>
         <w:tblW w:w="10800" w:type="dxa"/>
         <w:tblInd w:w="0" w:type="dxa"/>
-        <w:tblLayout w:type="fixed"/>
+        <w:tblLayout w:type="autofit"/>
         <w:tblCellMar>
-          <w:top w:w="80" w:type="dxa"/>
+          <w:top w:w="60" w:type="dxa"/>
           <w:start w:w="120" w:type="dxa"/>
-          <w:bottom w:w="80" w:type="dxa"/>
+          <w:bottom w:w="60" w:type="dxa"/>
           <w:end w:w="120" w:type="dxa"/>
         </w:tblCellMar>
         <w:tblBorders>
@@ -2586,9 +2586,9 @@
             </w:pPr>
             <w:r>
               <w:rPr>
-                <w:rFonts w:ascii="Aptos" w:hAnsi="Aptos"/>
-                <w:sz w:val="17"/>
-                <w:szCs w:val="17"/>
+                <w:rFonts w:ascii="Calibri" w:hAnsi="Calibri"/>
+                <w:sz w:val="18"/>
+                <w:szCs w:val="18"/>
                 <w:color w:val="FFFFFF"/>
                 <w:b/>
               </w:rPr>
@@ -2609,9 +2609,9 @@
             </w:pPr>
             <w:r>
               <w:rPr>
-                <w:rFonts w:ascii="Aptos" w:hAnsi="Aptos"/>
-                <w:sz w:val="17"/>
-                <w:szCs w:val="17"/>
+                <w:rFonts w:ascii="Calibri" w:hAnsi="Calibri"/>
+                <w:sz w:val="18"/>
+                <w:szCs w:val="18"/>
                 <w:color w:val="FFFFFF"/>
                 <w:b/>
               </w:rPr>
@@ -2632,9 +2632,9 @@
             </w:pPr>
             <w:r>
               <w:rPr>
-                <w:rFonts w:ascii="Aptos" w:hAnsi="Aptos"/>
-                <w:sz w:val="17"/>
-                <w:szCs w:val="17"/>
+                <w:rFonts w:ascii="Calibri" w:hAnsi="Calibri"/>
+                <w:sz w:val="18"/>
+                <w:szCs w:val="18"/>
                 <w:color w:val="FFFFFF"/>
                 <w:b/>
               </w:rPr>
@@ -2657,9 +2657,9 @@
             </w:pPr>
             <w:r>
               <w:rPr>
-                <w:rFonts w:ascii="Aptos" w:hAnsi="Aptos"/>
-                <w:sz w:val="17"/>
-                <w:szCs w:val="17"/>
+                <w:rFonts w:ascii="Calibri" w:hAnsi="Calibri"/>
+                <w:sz w:val="18"/>
+                <w:szCs w:val="18"/>
                 <w:color w:val="222222"/>
               </w:rPr>
               <w:t xml:space="preserve">CPU 1</w:t>
@@ -2679,9 +2679,9 @@
             </w:pPr>
             <w:r>
               <w:rPr>
-                <w:rFonts w:ascii="Aptos" w:hAnsi="Aptos"/>
-                <w:sz w:val="17"/>
-                <w:szCs w:val="17"/>
+                <w:rFonts w:ascii="Calibri" w:hAnsi="Calibri"/>
+                <w:sz w:val="18"/>
+                <w:szCs w:val="18"/>
                 <w:color w:val="222222"/>
               </w:rPr>
               <w:t xml:space="preserve">Intel(R) Xeon(R) Gold 6130 CPU</w:t>
@@ -2701,9 +2701,9 @@
             </w:pPr>
             <w:r>
               <w:rPr>
-                <w:rFonts w:ascii="Aptos" w:hAnsi="Aptos"/>
-                <w:sz w:val="17"/>
-                <w:szCs w:val="17"/>
+                <w:rFonts w:ascii="Calibri" w:hAnsi="Calibri"/>
+                <w:sz w:val="18"/>
+                <w:szCs w:val="18"/>
                 <w:color w:val="00843D"/>
                 <w:b/>
               </w:rPr>
@@ -2722,10 +2722,10 @@
       </w:pPr>
       <w:r>
         <w:rPr>
-          <w:rFonts w:ascii="Aptos" w:hAnsi="Aptos"/>
+          <w:rFonts w:ascii="Calibri" w:hAnsi="Calibri"/>
           <w:sz w:val="26"/>
           <w:szCs w:val="26"/>
-          <w:color w:val="005F9E"/>
+          <w:color w:val="404040"/>
           <w:b/>
         </w:rPr>
         <w:t xml:space="preserve">Memory</w:t>
@@ -2735,11 +2735,11 @@
       <w:tblPr>
         <w:tblW w:w="10800" w:type="dxa"/>
         <w:tblInd w:w="0" w:type="dxa"/>
-        <w:tblLayout w:type="fixed"/>
+        <w:tblLayout w:type="autofit"/>
         <w:tblCellMar>
-          <w:top w:w="80" w:type="dxa"/>
+          <w:top w:w="60" w:type="dxa"/>
           <w:start w:w="120" w:type="dxa"/>
-          <w:bottom w:w="80" w:type="dxa"/>
+          <w:bottom w:w="60" w:type="dxa"/>
           <w:end w:w="120" w:type="dxa"/>
         </w:tblCellMar>
         <w:tblBorders>
@@ -2775,9 +2775,9 @@
             </w:pPr>
             <w:r>
               <w:rPr>
-                <w:rFonts w:ascii="Aptos" w:hAnsi="Aptos"/>
-                <w:sz w:val="17"/>
-                <w:szCs w:val="17"/>
+                <w:rFonts w:ascii="Calibri" w:hAnsi="Calibri"/>
+                <w:sz w:val="18"/>
+                <w:szCs w:val="18"/>
                 <w:color w:val="FFFFFF"/>
                 <w:b/>
               </w:rPr>
@@ -2798,9 +2798,9 @@
             </w:pPr>
             <w:r>
               <w:rPr>
-                <w:rFonts w:ascii="Aptos" w:hAnsi="Aptos"/>
-                <w:sz w:val="17"/>
-                <w:szCs w:val="17"/>
+                <w:rFonts w:ascii="Calibri" w:hAnsi="Calibri"/>
+                <w:sz w:val="18"/>
+                <w:szCs w:val="18"/>
                 <w:color w:val="FFFFFF"/>
                 <w:b/>
               </w:rPr>
@@ -2821,9 +2821,9 @@
             </w:pPr>
             <w:r>
               <w:rPr>
-                <w:rFonts w:ascii="Aptos" w:hAnsi="Aptos"/>
-                <w:sz w:val="17"/>
-                <w:szCs w:val="17"/>
+                <w:rFonts w:ascii="Calibri" w:hAnsi="Calibri"/>
+                <w:sz w:val="18"/>
+                <w:szCs w:val="18"/>
                 <w:color w:val="FFFFFF"/>
                 <w:b/>
               </w:rPr>
@@ -2844,9 +2844,9 @@
             </w:pPr>
             <w:r>
               <w:rPr>
-                <w:rFonts w:ascii="Aptos" w:hAnsi="Aptos"/>
-                <w:sz w:val="17"/>
-                <w:szCs w:val="17"/>
+                <w:rFonts w:ascii="Calibri" w:hAnsi="Calibri"/>
+                <w:sz w:val="18"/>
+                <w:szCs w:val="18"/>
                 <w:color w:val="FFFFFF"/>
                 <w:b/>
               </w:rPr>
@@ -2867,9 +2867,9 @@
             </w:pPr>
             <w:r>
               <w:rPr>
-                <w:rFonts w:ascii="Aptos" w:hAnsi="Aptos"/>
-                <w:sz w:val="17"/>
-                <w:szCs w:val="17"/>
+                <w:rFonts w:ascii="Calibri" w:hAnsi="Calibri"/>
+                <w:sz w:val="18"/>
+                <w:szCs w:val="18"/>
                 <w:color w:val="FFFFFF"/>
                 <w:b/>
               </w:rPr>
@@ -2892,9 +2892,9 @@
             </w:pPr>
             <w:r>
               <w:rPr>
-                <w:rFonts w:ascii="Aptos" w:hAnsi="Aptos"/>
-                <w:sz w:val="17"/>
-                <w:szCs w:val="17"/>
+                <w:rFonts w:ascii="Calibri" w:hAnsi="Calibri"/>
+                <w:sz w:val="18"/>
+                <w:szCs w:val="18"/>
                 <w:color w:val="222222"/>
               </w:rPr>
               <w:t xml:space="preserve">PROC 1 DIMM 8</w:t>
@@ -2914,9 +2914,9 @@
             </w:pPr>
             <w:r>
               <w:rPr>
-                <w:rFonts w:ascii="Aptos" w:hAnsi="Aptos"/>
-                <w:sz w:val="17"/>
-                <w:szCs w:val="17"/>
+                <w:rFonts w:ascii="Calibri" w:hAnsi="Calibri"/>
+                <w:sz w:val="18"/>
+                <w:szCs w:val="18"/>
                 <w:color w:val="222222"/>
               </w:rPr>
               <w:t xml:space="preserve">16384</w:t>
@@ -2936,9 +2936,9 @@
             </w:pPr>
             <w:r>
               <w:rPr>
-                <w:rFonts w:ascii="Aptos" w:hAnsi="Aptos"/>
-                <w:sz w:val="17"/>
-                <w:szCs w:val="17"/>
+                <w:rFonts w:ascii="Calibri" w:hAnsi="Calibri"/>
+                <w:sz w:val="18"/>
+                <w:szCs w:val="18"/>
                 <w:color w:val="222222"/>
               </w:rPr>
               <w:t xml:space="preserve">DDR4</w:t>
@@ -2958,9 +2958,9 @@
             </w:pPr>
             <w:r>
               <w:rPr>
-                <w:rFonts w:ascii="Aptos" w:hAnsi="Aptos"/>
-                <w:sz w:val="17"/>
-                <w:szCs w:val="17"/>
+                <w:rFonts w:ascii="Calibri" w:hAnsi="Calibri"/>
+                <w:sz w:val="18"/>
+                <w:szCs w:val="18"/>
                 <w:color w:val="222222"/>
               </w:rPr>
               <w:t xml:space="preserve">2400</w:t>
@@ -2980,9 +2980,9 @@
             </w:pPr>
             <w:r>
               <w:rPr>
-                <w:rFonts w:ascii="Aptos" w:hAnsi="Aptos"/>
-                <w:sz w:val="17"/>
-                <w:szCs w:val="17"/>
+                <w:rFonts w:ascii="Calibri" w:hAnsi="Calibri"/>
+                <w:sz w:val="18"/>
+                <w:szCs w:val="18"/>
                 <w:color w:val="00843D"/>
                 <w:b/>
               </w:rPr>
@@ -3005,9 +3005,9 @@
             </w:pPr>
             <w:r>
               <w:rPr>
-                <w:rFonts w:ascii="Aptos" w:hAnsi="Aptos"/>
-                <w:sz w:val="17"/>
-                <w:szCs w:val="17"/>
+                <w:rFonts w:ascii="Calibri" w:hAnsi="Calibri"/>
+                <w:sz w:val="18"/>
+                <w:szCs w:val="18"/>
                 <w:color w:val="222222"/>
               </w:rPr>
               <w:t xml:space="preserve">PROC 1 DIMM 10</w:t>
@@ -3027,9 +3027,9 @@
             </w:pPr>
             <w:r>
               <w:rPr>
-                <w:rFonts w:ascii="Aptos" w:hAnsi="Aptos"/>
-                <w:sz w:val="17"/>
-                <w:szCs w:val="17"/>
+                <w:rFonts w:ascii="Calibri" w:hAnsi="Calibri"/>
+                <w:sz w:val="18"/>
+                <w:szCs w:val="18"/>
                 <w:color w:val="222222"/>
               </w:rPr>
               <w:t xml:space="preserve">16384</w:t>
@@ -3049,9 +3049,9 @@
             </w:pPr>
             <w:r>
               <w:rPr>
-                <w:rFonts w:ascii="Aptos" w:hAnsi="Aptos"/>
-                <w:sz w:val="17"/>
-                <w:szCs w:val="17"/>
+                <w:rFonts w:ascii="Calibri" w:hAnsi="Calibri"/>
+                <w:sz w:val="18"/>
+                <w:szCs w:val="18"/>
                 <w:color w:val="222222"/>
               </w:rPr>
               <w:t xml:space="preserve">DDR4</w:t>
@@ -3071,9 +3071,9 @@
             </w:pPr>
             <w:r>
               <w:rPr>
-                <w:rFonts w:ascii="Aptos" w:hAnsi="Aptos"/>
-                <w:sz w:val="17"/>
-                <w:szCs w:val="17"/>
+                <w:rFonts w:ascii="Calibri" w:hAnsi="Calibri"/>
+                <w:sz w:val="18"/>
+                <w:szCs w:val="18"/>
                 <w:color w:val="222222"/>
               </w:rPr>
               <w:t xml:space="preserve">2400</w:t>
@@ -3093,9 +3093,9 @@
             </w:pPr>
             <w:r>
               <w:rPr>
-                <w:rFonts w:ascii="Aptos" w:hAnsi="Aptos"/>
-                <w:sz w:val="17"/>
-                <w:szCs w:val="17"/>
+                <w:rFonts w:ascii="Calibri" w:hAnsi="Calibri"/>
+                <w:sz w:val="18"/>
+                <w:szCs w:val="18"/>
                 <w:color w:val="00843D"/>
                 <w:b/>
               </w:rPr>
@@ -3114,10 +3114,10 @@
       </w:pPr>
       <w:r>
         <w:rPr>
-          <w:rFonts w:ascii="Aptos" w:hAnsi="Aptos"/>
+          <w:rFonts w:ascii="Calibri" w:hAnsi="Calibri"/>
           <w:sz w:val="26"/>
           <w:szCs w:val="26"/>
-          <w:color w:val="005F9E"/>
+          <w:color w:val="404040"/>
           <w:b/>
         </w:rPr>
         <w:t xml:space="preserve">Network</w:t>
@@ -3127,11 +3127,11 @@
       <w:tblPr>
         <w:tblW w:w="10800" w:type="dxa"/>
         <w:tblInd w:w="0" w:type="dxa"/>
-        <w:tblLayout w:type="fixed"/>
+        <w:tblLayout w:type="autofit"/>
         <w:tblCellMar>
-          <w:top w:w="80" w:type="dxa"/>
+          <w:top w:w="60" w:type="dxa"/>
           <w:start w:w="120" w:type="dxa"/>
-          <w:bottom w:w="80" w:type="dxa"/>
+          <w:bottom w:w="60" w:type="dxa"/>
           <w:end w:w="120" w:type="dxa"/>
         </w:tblCellMar>
         <w:tblBorders>
@@ -3169,9 +3169,9 @@
             </w:pPr>
             <w:r>
               <w:rPr>
-                <w:rFonts w:ascii="Aptos" w:hAnsi="Aptos"/>
-                <w:sz w:val="17"/>
-                <w:szCs w:val="17"/>
+                <w:rFonts w:ascii="Calibri" w:hAnsi="Calibri"/>
+                <w:sz w:val="18"/>
+                <w:szCs w:val="18"/>
                 <w:color w:val="FFFFFF"/>
                 <w:b/>
               </w:rPr>
@@ -3192,9 +3192,9 @@
             </w:pPr>
             <w:r>
               <w:rPr>
-                <w:rFonts w:ascii="Aptos" w:hAnsi="Aptos"/>
-                <w:sz w:val="17"/>
-                <w:szCs w:val="17"/>
+                <w:rFonts w:ascii="Calibri" w:hAnsi="Calibri"/>
+                <w:sz w:val="18"/>
+                <w:szCs w:val="18"/>
                 <w:color w:val="FFFFFF"/>
                 <w:b/>
               </w:rPr>
@@ -3215,9 +3215,9 @@
             </w:pPr>
             <w:r>
               <w:rPr>
-                <w:rFonts w:ascii="Aptos" w:hAnsi="Aptos"/>
-                <w:sz w:val="17"/>
-                <w:szCs w:val="17"/>
+                <w:rFonts w:ascii="Calibri" w:hAnsi="Calibri"/>
+                <w:sz w:val="18"/>
+                <w:szCs w:val="18"/>
                 <w:color w:val="FFFFFF"/>
                 <w:b/>
               </w:rPr>
@@ -3238,9 +3238,9 @@
             </w:pPr>
             <w:r>
               <w:rPr>
-                <w:rFonts w:ascii="Aptos" w:hAnsi="Aptos"/>
-                <w:sz w:val="17"/>
-                <w:szCs w:val="17"/>
+                <w:rFonts w:ascii="Calibri" w:hAnsi="Calibri"/>
+                <w:sz w:val="18"/>
+                <w:szCs w:val="18"/>
                 <w:color w:val="FFFFFF"/>
                 <w:b/>
               </w:rPr>
@@ -3261,9 +3261,9 @@
             </w:pPr>
             <w:r>
               <w:rPr>
-                <w:rFonts w:ascii="Aptos" w:hAnsi="Aptos"/>
-                <w:sz w:val="17"/>
-                <w:szCs w:val="17"/>
+                <w:rFonts w:ascii="Calibri" w:hAnsi="Calibri"/>
+                <w:sz w:val="18"/>
+                <w:szCs w:val="18"/>
                 <w:color w:val="FFFFFF"/>
                 <w:b/>
               </w:rPr>
@@ -3284,9 +3284,9 @@
             </w:pPr>
             <w:r>
               <w:rPr>
-                <w:rFonts w:ascii="Aptos" w:hAnsi="Aptos"/>
-                <w:sz w:val="17"/>
-                <w:szCs w:val="17"/>
+                <w:rFonts w:ascii="Calibri" w:hAnsi="Calibri"/>
+                <w:sz w:val="18"/>
+                <w:szCs w:val="18"/>
                 <w:color w:val="FFFFFF"/>
                 <w:b/>
               </w:rPr>
@@ -3307,9 +3307,9 @@
             </w:pPr>
             <w:r>
               <w:rPr>
-                <w:rFonts w:ascii="Aptos" w:hAnsi="Aptos"/>
-                <w:sz w:val="17"/>
-                <w:szCs w:val="17"/>
+                <w:rFonts w:ascii="Calibri" w:hAnsi="Calibri"/>
+                <w:sz w:val="18"/>
+                <w:szCs w:val="18"/>
                 <w:color w:val="FFFFFF"/>
                 <w:b/>
               </w:rPr>
@@ -3332,9 +3332,9 @@
             </w:pPr>
             <w:r>
               <w:rPr>
-                <w:rFonts w:ascii="Aptos" w:hAnsi="Aptos"/>
-                <w:sz w:val="17"/>
-                <w:szCs w:val="17"/>
+                <w:rFonts w:ascii="Calibri" w:hAnsi="Calibri"/>
+                <w:sz w:val="18"/>
+                <w:szCs w:val="18"/>
                 <w:color w:val="222222"/>
               </w:rPr>
               <w:t xml:space="preserve">Embedded LOM 1</w:t>
@@ -3354,9 +3354,9 @@
             </w:pPr>
             <w:r>
               <w:rPr>
-                <w:rFonts w:ascii="Aptos" w:hAnsi="Aptos"/>
-                <w:sz w:val="17"/>
-                <w:szCs w:val="17"/>
+                <w:rFonts w:ascii="Calibri" w:hAnsi="Calibri"/>
+                <w:sz w:val="18"/>
+                <w:szCs w:val="18"/>
                 <w:color w:val="222222"/>
               </w:rPr>
               <w:t xml:space="preserve">Ethernet interface</w:t>
@@ -3376,9 +3376,9 @@
             </w:pPr>
             <w:r>
               <w:rPr>
-                <w:rFonts w:ascii="Aptos" w:hAnsi="Aptos"/>
-                <w:sz w:val="17"/>
-                <w:szCs w:val="17"/>
+                <w:rFonts w:ascii="Calibri" w:hAnsi="Calibri"/>
+                <w:sz w:val="18"/>
+                <w:szCs w:val="18"/>
                 <w:color w:val="222222"/>
               </w:rPr>
               <w:t xml:space="preserve">00:11:22:33:44:55</w:t>
@@ -3398,9 +3398,9 @@
             </w:pPr>
             <w:r>
               <w:rPr>
-                <w:rFonts w:ascii="Aptos" w:hAnsi="Aptos"/>
-                <w:sz w:val="17"/>
-                <w:szCs w:val="17"/>
+                <w:rFonts w:ascii="Calibri" w:hAnsi="Calibri"/>
+                <w:sz w:val="18"/>
+                <w:szCs w:val="18"/>
                 <w:color w:val="222222"/>
               </w:rPr>
               <w:t xml:space="preserve">192.0.2.20</w:t>
@@ -3420,9 +3420,9 @@
             </w:pPr>
             <w:r>
               <w:rPr>
-                <w:rFonts w:ascii="Aptos" w:hAnsi="Aptos"/>
-                <w:sz w:val="17"/>
-                <w:szCs w:val="17"/>
+                <w:rFonts w:ascii="Calibri" w:hAnsi="Calibri"/>
+                <w:sz w:val="18"/>
+                <w:szCs w:val="18"/>
                 <w:color w:val="222222"/>
               </w:rPr>
               <w:t xml:space="preserve">LinkUp</w:t>
@@ -3442,9 +3442,9 @@
             </w:pPr>
             <w:r>
               <w:rPr>
-                <w:rFonts w:ascii="Aptos" w:hAnsi="Aptos"/>
-                <w:sz w:val="17"/>
-                <w:szCs w:val="17"/>
+                <w:rFonts w:ascii="Calibri" w:hAnsi="Calibri"/>
+                <w:sz w:val="18"/>
+                <w:szCs w:val="18"/>
                 <w:color w:val="222222"/>
               </w:rPr>
               <w:t xml:space="preserve">1000</w:t>
@@ -3464,9 +3464,9 @@
             </w:pPr>
             <w:r>
               <w:rPr>
-                <w:rFonts w:ascii="Aptos" w:hAnsi="Aptos"/>
-                <w:sz w:val="17"/>
-                <w:szCs w:val="17"/>
+                <w:rFonts w:ascii="Calibri" w:hAnsi="Calibri"/>
+                <w:sz w:val="18"/>
+                <w:szCs w:val="18"/>
                 <w:color w:val="00843D"/>
                 <w:b/>
               </w:rPr>
@@ -3485,10 +3485,10 @@
       </w:pPr>
       <w:r>
         <w:rPr>
-          <w:rFonts w:ascii="Aptos" w:hAnsi="Aptos"/>
+          <w:rFonts w:ascii="Calibri" w:hAnsi="Calibri"/>
           <w:sz w:val="26"/>
           <w:szCs w:val="26"/>
-          <w:color w:val="005F9E"/>
+          <w:color w:val="404040"/>
           <w:b/>
         </w:rPr>
         <w:t xml:space="preserve">Device Inventory</w:t>
@@ -3498,11 +3498,11 @@
       <w:tblPr>
         <w:tblW w:w="10800" w:type="dxa"/>
         <w:tblInd w:w="0" w:type="dxa"/>
-        <w:tblLayout w:type="fixed"/>
+        <w:tblLayout w:type="autofit"/>
         <w:tblCellMar>
-          <w:top w:w="80" w:type="dxa"/>
+          <w:top w:w="60" w:type="dxa"/>
           <w:start w:w="120" w:type="dxa"/>
-          <w:bottom w:w="80" w:type="dxa"/>
+          <w:bottom w:w="60" w:type="dxa"/>
           <w:end w:w="120" w:type="dxa"/>
         </w:tblCellMar>
         <w:tblBorders>
@@ -3538,9 +3538,9 @@
             </w:pPr>
             <w:r>
               <w:rPr>
-                <w:rFonts w:ascii="Aptos" w:hAnsi="Aptos"/>
-                <w:sz w:val="17"/>
-                <w:szCs w:val="17"/>
+                <w:rFonts w:ascii="Calibri" w:hAnsi="Calibri"/>
+                <w:sz w:val="18"/>
+                <w:szCs w:val="18"/>
                 <w:color w:val="FFFFFF"/>
                 <w:b/>
               </w:rPr>
@@ -3561,9 +3561,9 @@
             </w:pPr>
             <w:r>
               <w:rPr>
-                <w:rFonts w:ascii="Aptos" w:hAnsi="Aptos"/>
-                <w:sz w:val="17"/>
-                <w:szCs w:val="17"/>
+                <w:rFonts w:ascii="Calibri" w:hAnsi="Calibri"/>
+                <w:sz w:val="18"/>
+                <w:szCs w:val="18"/>
                 <w:color w:val="FFFFFF"/>
                 <w:b/>
               </w:rPr>
@@ -3584,9 +3584,9 @@
             </w:pPr>
             <w:r>
               <w:rPr>
-                <w:rFonts w:ascii="Aptos" w:hAnsi="Aptos"/>
-                <w:sz w:val="17"/>
-                <w:szCs w:val="17"/>
+                <w:rFonts w:ascii="Calibri" w:hAnsi="Calibri"/>
+                <w:sz w:val="18"/>
+                <w:szCs w:val="18"/>
                 <w:color w:val="FFFFFF"/>
                 <w:b/>
               </w:rPr>
@@ -3607,9 +3607,9 @@
             </w:pPr>
             <w:r>
               <w:rPr>
-                <w:rFonts w:ascii="Aptos" w:hAnsi="Aptos"/>
-                <w:sz w:val="17"/>
-                <w:szCs w:val="17"/>
+                <w:rFonts w:ascii="Calibri" w:hAnsi="Calibri"/>
+                <w:sz w:val="18"/>
+                <w:szCs w:val="18"/>
                 <w:color w:val="FFFFFF"/>
                 <w:b/>
               </w:rPr>
@@ -3630,9 +3630,9 @@
             </w:pPr>
             <w:r>
               <w:rPr>
-                <w:rFonts w:ascii="Aptos" w:hAnsi="Aptos"/>
-                <w:sz w:val="17"/>
-                <w:szCs w:val="17"/>
+                <w:rFonts w:ascii="Calibri" w:hAnsi="Calibri"/>
+                <w:sz w:val="18"/>
+                <w:szCs w:val="18"/>
                 <w:color w:val="FFFFFF"/>
                 <w:b/>
               </w:rPr>
@@ -3655,9 +3655,9 @@
             </w:pPr>
             <w:r>
               <w:rPr>
-                <w:rFonts w:ascii="Aptos" w:hAnsi="Aptos"/>
-                <w:sz w:val="17"/>
-                <w:szCs w:val="17"/>
+                <w:rFonts w:ascii="Calibri" w:hAnsi="Calibri"/>
+                <w:sz w:val="18"/>
+                <w:szCs w:val="18"/>
                 <w:color w:val="222222"/>
               </w:rPr>
               <w:t xml:space="preserve">Embedded LOM</w:t>
@@ -3677,9 +3677,9 @@
             </w:pPr>
             <w:r>
               <w:rPr>
-                <w:rFonts w:ascii="Aptos" w:hAnsi="Aptos"/>
-                <w:sz w:val="17"/>
-                <w:szCs w:val="17"/>
+                <w:rFonts w:ascii="Calibri" w:hAnsi="Calibri"/>
+                <w:sz w:val="18"/>
+                <w:szCs w:val="18"/>
                 <w:color w:val="222222"/>
               </w:rPr>
               <w:t xml:space="preserve">HPE Ethernet 1Gb 4-port 331i Adapter</w:t>
@@ -3699,9 +3699,9 @@
             </w:pPr>
             <w:r>
               <w:rPr>
-                <w:rFonts w:ascii="Aptos" w:hAnsi="Aptos"/>
-                <w:sz w:val="17"/>
-                <w:szCs w:val="17"/>
+                <w:rFonts w:ascii="Calibri" w:hAnsi="Calibri"/>
+                <w:sz w:val="18"/>
+                <w:szCs w:val="18"/>
                 <w:color w:val="222222"/>
               </w:rPr>
               <w:t xml:space="preserve">1.0</w:t>
@@ -3721,9 +3721,9 @@
             </w:pPr>
             <w:r>
               <w:rPr>
-                <w:rFonts w:ascii="Aptos" w:hAnsi="Aptos"/>
-                <w:sz w:val="17"/>
-                <w:szCs w:val="17"/>
+                <w:rFonts w:ascii="Calibri" w:hAnsi="Calibri"/>
+                <w:sz w:val="18"/>
+                <w:szCs w:val="18"/>
                 <w:color w:val="222222"/>
               </w:rPr>
               <w:t xml:space="preserve">20.33.41</w:t>
@@ -3743,9 +3743,9 @@
             </w:pPr>
             <w:r>
               <w:rPr>
-                <w:rFonts w:ascii="Aptos" w:hAnsi="Aptos"/>
-                <w:sz w:val="17"/>
-                <w:szCs w:val="17"/>
+                <w:rFonts w:ascii="Calibri" w:hAnsi="Calibri"/>
+                <w:sz w:val="18"/>
+                <w:szCs w:val="18"/>
                 <w:color w:val="00843D"/>
                 <w:b/>
               </w:rPr>
@@ -3764,10 +3764,10 @@
       </w:pPr>
       <w:r>
         <w:rPr>
-          <w:rFonts w:ascii="Aptos" w:hAnsi="Aptos"/>
+          <w:rFonts w:ascii="Calibri" w:hAnsi="Calibri"/>
           <w:sz w:val="26"/>
           <w:szCs w:val="26"/>
-          <w:color w:val="005F9E"/>
+          <w:color w:val="404040"/>
           <w:b/>
         </w:rPr>
         <w:t xml:space="preserve">Storage</w:t>
@@ -3777,11 +3777,11 @@
       <w:tblPr>
         <w:tblW w:w="10800" w:type="dxa"/>
         <w:tblInd w:w="0" w:type="dxa"/>
-        <w:tblLayout w:type="fixed"/>
+        <w:tblLayout w:type="autofit"/>
         <w:tblCellMar>
-          <w:top w:w="80" w:type="dxa"/>
+          <w:top w:w="60" w:type="dxa"/>
           <w:start w:w="120" w:type="dxa"/>
-          <w:bottom w:w="80" w:type="dxa"/>
+          <w:bottom w:w="60" w:type="dxa"/>
           <w:end w:w="120" w:type="dxa"/>
         </w:tblCellMar>
         <w:tblBorders>
@@ -3816,9 +3816,9 @@
             </w:pPr>
             <w:r>
               <w:rPr>
-                <w:rFonts w:ascii="Aptos" w:hAnsi="Aptos"/>
-                <w:sz w:val="17"/>
-                <w:szCs w:val="17"/>
+                <w:rFonts w:ascii="Calibri" w:hAnsi="Calibri"/>
+                <w:sz w:val="18"/>
+                <w:szCs w:val="18"/>
                 <w:color w:val="FFFFFF"/>
                 <w:b/>
               </w:rPr>
@@ -3839,9 +3839,9 @@
             </w:pPr>
             <w:r>
               <w:rPr>
-                <w:rFonts w:ascii="Aptos" w:hAnsi="Aptos"/>
-                <w:sz w:val="17"/>
-                <w:szCs w:val="17"/>
+                <w:rFonts w:ascii="Calibri" w:hAnsi="Calibri"/>
+                <w:sz w:val="18"/>
+                <w:szCs w:val="18"/>
                 <w:color w:val="FFFFFF"/>
                 <w:b/>
               </w:rPr>
@@ -3862,9 +3862,9 @@
             </w:pPr>
             <w:r>
               <w:rPr>
-                <w:rFonts w:ascii="Aptos" w:hAnsi="Aptos"/>
-                <w:sz w:val="17"/>
-                <w:szCs w:val="17"/>
+                <w:rFonts w:ascii="Calibri" w:hAnsi="Calibri"/>
+                <w:sz w:val="18"/>
+                <w:szCs w:val="18"/>
                 <w:color w:val="FFFFFF"/>
                 <w:b/>
               </w:rPr>
@@ -3885,9 +3885,9 @@
             </w:pPr>
             <w:r>
               <w:rPr>
-                <w:rFonts w:ascii="Aptos" w:hAnsi="Aptos"/>
-                <w:sz w:val="17"/>
-                <w:szCs w:val="17"/>
+                <w:rFonts w:ascii="Calibri" w:hAnsi="Calibri"/>
+                <w:sz w:val="18"/>
+                <w:szCs w:val="18"/>
                 <w:color w:val="FFFFFF"/>
                 <w:b/>
               </w:rPr>
@@ -3910,9 +3910,9 @@
             </w:pPr>
             <w:r>
               <w:rPr>
-                <w:rFonts w:ascii="Aptos" w:hAnsi="Aptos"/>
-                <w:sz w:val="17"/>
-                <w:szCs w:val="17"/>
+                <w:rFonts w:ascii="Calibri" w:hAnsi="Calibri"/>
+                <w:sz w:val="18"/>
+                <w:szCs w:val="18"/>
                 <w:color w:val="222222"/>
               </w:rPr>
               <w:t xml:space="preserve">Drive</w:t>
@@ -3932,9 +3932,9 @@
             </w:pPr>
             <w:r>
               <w:rPr>
-                <w:rFonts w:ascii="Aptos" w:hAnsi="Aptos"/>
-                <w:sz w:val="17"/>
-                <w:szCs w:val="17"/>
+                <w:rFonts w:ascii="Calibri" w:hAnsi="Calibri"/>
+                <w:sz w:val="18"/>
+                <w:szCs w:val="18"/>
                 <w:color w:val="222222"/>
               </w:rPr>
               <w:t xml:space="preserve">Disk 1</w:t>
@@ -3954,9 +3954,9 @@
             </w:pPr>
             <w:r>
               <w:rPr>
-                <w:rFonts w:ascii="Aptos" w:hAnsi="Aptos"/>
-                <w:sz w:val="17"/>
-                <w:szCs w:val="17"/>
+                <w:rFonts w:ascii="Calibri" w:hAnsi="Calibri"/>
+                <w:sz w:val="18"/>
+                <w:szCs w:val="18"/>
                 <w:color w:val="222222"/>
               </w:rPr>
               <w:t xml:space="preserve">1.8 TB</w:t>
@@ -3976,9 +3976,9 @@
             </w:pPr>
             <w:r>
               <w:rPr>
-                <w:rFonts w:ascii="Aptos" w:hAnsi="Aptos"/>
-                <w:sz w:val="17"/>
-                <w:szCs w:val="17"/>
+                <w:rFonts w:ascii="Calibri" w:hAnsi="Calibri"/>
+                <w:sz w:val="18"/>
+                <w:szCs w:val="18"/>
                 <w:color w:val="00843D"/>
                 <w:b/>
               </w:rPr>
@@ -3997,7 +3997,7 @@
       </w:pPr>
       <w:r>
         <w:rPr>
-          <w:rFonts w:ascii="Aptos" w:hAnsi="Aptos"/>
+          <w:rFonts w:ascii="Calibri" w:hAnsi="Calibri"/>
           <w:sz w:val="32"/>
           <w:szCs w:val="32"/>
           <w:color w:val="005F9E"/>
@@ -4010,11 +4010,11 @@
       <w:tblPr>
         <w:tblW w:w="10800" w:type="dxa"/>
         <w:tblInd w:w="0" w:type="dxa"/>
-        <w:tblLayout w:type="fixed"/>
+        <w:tblLayout w:type="autofit"/>
         <w:tblCellMar>
-          <w:top w:w="80" w:type="dxa"/>
+          <w:top w:w="60" w:type="dxa"/>
           <w:start w:w="120" w:type="dxa"/>
-          <w:bottom w:w="80" w:type="dxa"/>
+          <w:bottom w:w="60" w:type="dxa"/>
           <w:end w:w="120" w:type="dxa"/>
         </w:tblCellMar>
         <w:tblBorders>
@@ -4048,9 +4048,9 @@
             </w:pPr>
             <w:r>
               <w:rPr>
-                <w:rFonts w:ascii="Aptos" w:hAnsi="Aptos"/>
-                <w:sz w:val="17"/>
-                <w:szCs w:val="17"/>
+                <w:rFonts w:ascii="Calibri" w:hAnsi="Calibri"/>
+                <w:sz w:val="18"/>
+                <w:szCs w:val="18"/>
                 <w:color w:val="FFFFFF"/>
                 <w:b/>
               </w:rPr>
@@ -4071,9 +4071,9 @@
             </w:pPr>
             <w:r>
               <w:rPr>
-                <w:rFonts w:ascii="Aptos" w:hAnsi="Aptos"/>
-                <w:sz w:val="17"/>
-                <w:szCs w:val="17"/>
+                <w:rFonts w:ascii="Calibri" w:hAnsi="Calibri"/>
+                <w:sz w:val="18"/>
+                <w:szCs w:val="18"/>
                 <w:color w:val="FFFFFF"/>
                 <w:b/>
               </w:rPr>
@@ -4094,9 +4094,9 @@
             </w:pPr>
             <w:r>
               <w:rPr>
-                <w:rFonts w:ascii="Aptos" w:hAnsi="Aptos"/>
-                <w:sz w:val="17"/>
-                <w:szCs w:val="17"/>
+                <w:rFonts w:ascii="Calibri" w:hAnsi="Calibri"/>
+                <w:sz w:val="18"/>
+                <w:szCs w:val="18"/>
                 <w:color w:val="FFFFFF"/>
                 <w:b/>
               </w:rPr>
@@ -4119,9 +4119,9 @@
             </w:pPr>
             <w:r>
               <w:rPr>
-                <w:rFonts w:ascii="Aptos" w:hAnsi="Aptos"/>
-                <w:sz w:val="17"/>
-                <w:szCs w:val="17"/>
+                <w:rFonts w:ascii="Calibri" w:hAnsi="Calibri"/>
+                <w:sz w:val="18"/>
+                <w:szCs w:val="18"/>
                 <w:color w:val="222222"/>
               </w:rPr>
               <w:t xml:space="preserve">iLO 5</w:t>
@@ -4141,9 +4141,9 @@
             </w:pPr>
             <w:r>
               <w:rPr>
-                <w:rFonts w:ascii="Aptos" w:hAnsi="Aptos"/>
-                <w:sz w:val="17"/>
-                <w:szCs w:val="17"/>
+                <w:rFonts w:ascii="Calibri" w:hAnsi="Calibri"/>
+                <w:sz w:val="18"/>
+                <w:szCs w:val="18"/>
                 <w:color w:val="222222"/>
               </w:rPr>
               <w:t xml:space="preserve">3.10</w:t>
@@ -4163,9 +4163,9 @@
             </w:pPr>
             <w:r>
               <w:rPr>
-                <w:rFonts w:ascii="Aptos" w:hAnsi="Aptos"/>
-                <w:sz w:val="17"/>
-                <w:szCs w:val="17"/>
+                <w:rFonts w:ascii="Calibri" w:hAnsi="Calibri"/>
+                <w:sz w:val="18"/>
+                <w:szCs w:val="18"/>
                 <w:color w:val="00843D"/>
                 <w:b/>
               </w:rPr>
@@ -4184,7 +4184,7 @@
       </w:pPr>
       <w:r>
         <w:rPr>
-          <w:rFonts w:ascii="Aptos" w:hAnsi="Aptos"/>
+          <w:rFonts w:ascii="Calibri" w:hAnsi="Calibri"/>
           <w:sz w:val="32"/>
           <w:szCs w:val="32"/>
           <w:color w:val="005F9E"/>
@@ -4202,10 +4202,10 @@
       </w:pPr>
       <w:r>
         <w:rPr>
-          <w:rFonts w:ascii="Aptos" w:hAnsi="Aptos"/>
+          <w:rFonts w:ascii="Calibri" w:hAnsi="Calibri"/>
           <w:sz w:val="26"/>
           <w:szCs w:val="26"/>
-          <w:color w:val="005F9E"/>
+          <w:color w:val="404040"/>
           <w:b/>
         </w:rPr>
         <w:t xml:space="preserve">Power Supply</w:t>
@@ -4215,11 +4215,11 @@
       <w:tblPr>
         <w:tblW w:w="10800" w:type="dxa"/>
         <w:tblInd w:w="0" w:type="dxa"/>
-        <w:tblLayout w:type="fixed"/>
+        <w:tblLayout w:type="autofit"/>
         <w:tblCellMar>
-          <w:top w:w="80" w:type="dxa"/>
+          <w:top w:w="60" w:type="dxa"/>
           <w:start w:w="120" w:type="dxa"/>
-          <w:bottom w:w="80" w:type="dxa"/>
+          <w:bottom w:w="60" w:type="dxa"/>
           <w:end w:w="120" w:type="dxa"/>
         </w:tblCellMar>
         <w:tblBorders>
@@ -4253,9 +4253,9 @@
             </w:pPr>
             <w:r>
               <w:rPr>
-                <w:rFonts w:ascii="Aptos" w:hAnsi="Aptos"/>
-                <w:sz w:val="17"/>
-                <w:szCs w:val="17"/>
+                <w:rFonts w:ascii="Calibri" w:hAnsi="Calibri"/>
+                <w:sz w:val="18"/>
+                <w:szCs w:val="18"/>
                 <w:color w:val="FFFFFF"/>
                 <w:b/>
               </w:rPr>
@@ -4276,9 +4276,9 @@
             </w:pPr>
             <w:r>
               <w:rPr>
-                <w:rFonts w:ascii="Aptos" w:hAnsi="Aptos"/>
-                <w:sz w:val="17"/>
-                <w:szCs w:val="17"/>
+                <w:rFonts w:ascii="Calibri" w:hAnsi="Calibri"/>
+                <w:sz w:val="18"/>
+                <w:szCs w:val="18"/>
                 <w:color w:val="FFFFFF"/>
                 <w:b/>
               </w:rPr>
@@ -4299,9 +4299,9 @@
             </w:pPr>
             <w:r>
               <w:rPr>
-                <w:rFonts w:ascii="Aptos" w:hAnsi="Aptos"/>
-                <w:sz w:val="17"/>
-                <w:szCs w:val="17"/>
+                <w:rFonts w:ascii="Calibri" w:hAnsi="Calibri"/>
+                <w:sz w:val="18"/>
+                <w:szCs w:val="18"/>
                 <w:color w:val="FFFFFF"/>
                 <w:b/>
               </w:rPr>
@@ -4324,9 +4324,9 @@
             </w:pPr>
             <w:r>
               <w:rPr>
-                <w:rFonts w:ascii="Aptos" w:hAnsi="Aptos"/>
-                <w:sz w:val="17"/>
-                <w:szCs w:val="17"/>
+                <w:rFonts w:ascii="Calibri" w:hAnsi="Calibri"/>
+                <w:sz w:val="18"/>
+                <w:szCs w:val="18"/>
                 <w:color w:val="222222"/>
               </w:rPr>
               <w:t xml:space="preserve">Power Supply 1</w:t>
@@ -4346,9 +4346,9 @@
             </w:pPr>
             <w:r>
               <w:rPr>
-                <w:rFonts w:ascii="Aptos" w:hAnsi="Aptos"/>
-                <w:sz w:val="17"/>
-                <w:szCs w:val="17"/>
+                <w:rFonts w:ascii="Calibri" w:hAnsi="Calibri"/>
+                <w:sz w:val="18"/>
+                <w:szCs w:val="18"/>
                 <w:color w:val="222222"/>
               </w:rPr>
               <w:t xml:space="preserve">HPE 800W Flex Slot Platinum Hot Plug Power Supply Kit</w:t>
@@ -4368,9 +4368,9 @@
             </w:pPr>
             <w:r>
               <w:rPr>
-                <w:rFonts w:ascii="Aptos" w:hAnsi="Aptos"/>
-                <w:sz w:val="17"/>
-                <w:szCs w:val="17"/>
+                <w:rFonts w:ascii="Calibri" w:hAnsi="Calibri"/>
+                <w:sz w:val="18"/>
+                <w:szCs w:val="18"/>
                 <w:color w:val="00843D"/>
                 <w:b/>
               </w:rPr>
@@ -4389,10 +4389,10 @@
       </w:pPr>
       <w:r>
         <w:rPr>
-          <w:rFonts w:ascii="Aptos" w:hAnsi="Aptos"/>
+          <w:rFonts w:ascii="Calibri" w:hAnsi="Calibri"/>
           <w:sz w:val="26"/>
           <w:szCs w:val="26"/>
-          <w:color w:val="005F9E"/>
+          <w:color w:val="404040"/>
           <w:b/>
         </w:rPr>
         <w:t xml:space="preserve">Fans</w:t>
@@ -4402,11 +4402,11 @@
       <w:tblPr>
         <w:tblW w:w="10800" w:type="dxa"/>
         <w:tblInd w:w="0" w:type="dxa"/>
-        <w:tblLayout w:type="fixed"/>
+        <w:tblLayout w:type="autofit"/>
         <w:tblCellMar>
-          <w:top w:w="80" w:type="dxa"/>
+          <w:top w:w="60" w:type="dxa"/>
           <w:start w:w="120" w:type="dxa"/>
-          <w:bottom w:w="80" w:type="dxa"/>
+          <w:bottom w:w="60" w:type="dxa"/>
           <w:end w:w="120" w:type="dxa"/>
         </w:tblCellMar>
         <w:tblBorders>
@@ -4440,9 +4440,9 @@
             </w:pPr>
             <w:r>
               <w:rPr>
-                <w:rFonts w:ascii="Aptos" w:hAnsi="Aptos"/>
-                <w:sz w:val="17"/>
-                <w:szCs w:val="17"/>
+                <w:rFonts w:ascii="Calibri" w:hAnsi="Calibri"/>
+                <w:sz w:val="18"/>
+                <w:szCs w:val="18"/>
                 <w:color w:val="FFFFFF"/>
                 <w:b/>
               </w:rPr>
@@ -4463,9 +4463,9 @@
             </w:pPr>
             <w:r>
               <w:rPr>
-                <w:rFonts w:ascii="Aptos" w:hAnsi="Aptos"/>
-                <w:sz w:val="17"/>
-                <w:szCs w:val="17"/>
+                <w:rFonts w:ascii="Calibri" w:hAnsi="Calibri"/>
+                <w:sz w:val="18"/>
+                <w:szCs w:val="18"/>
                 <w:color w:val="FFFFFF"/>
                 <w:b/>
               </w:rPr>
@@ -4486,9 +4486,9 @@
             </w:pPr>
             <w:r>
               <w:rPr>
-                <w:rFonts w:ascii="Aptos" w:hAnsi="Aptos"/>
-                <w:sz w:val="17"/>
-                <w:szCs w:val="17"/>
+                <w:rFonts w:ascii="Calibri" w:hAnsi="Calibri"/>
+                <w:sz w:val="18"/>
+                <w:szCs w:val="18"/>
                 <w:color w:val="FFFFFF"/>
                 <w:b/>
               </w:rPr>
@@ -4511,9 +4511,9 @@
             </w:pPr>
             <w:r>
               <w:rPr>
-                <w:rFonts w:ascii="Aptos" w:hAnsi="Aptos"/>
-                <w:sz w:val="17"/>
-                <w:szCs w:val="17"/>
+                <w:rFonts w:ascii="Calibri" w:hAnsi="Calibri"/>
+                <w:sz w:val="18"/>
+                <w:szCs w:val="18"/>
                 <w:color w:val="222222"/>
               </w:rPr>
               <w:t xml:space="preserve">Fan 1</w:t>
@@ -4533,9 +4533,9 @@
             </w:pPr>
             <w:r>
               <w:rPr>
-                <w:rFonts w:ascii="Aptos" w:hAnsi="Aptos"/>
-                <w:sz w:val="17"/>
-                <w:szCs w:val="17"/>
+                <w:rFonts w:ascii="Calibri" w:hAnsi="Calibri"/>
+                <w:sz w:val="18"/>
+                <w:szCs w:val="18"/>
                 <w:color w:val="222222"/>
               </w:rPr>
               <w:t xml:space="preserve">24%</w:t>
@@ -4555,9 +4555,9 @@
             </w:pPr>
             <w:r>
               <w:rPr>
-                <w:rFonts w:ascii="Aptos" w:hAnsi="Aptos"/>
-                <w:sz w:val="17"/>
-                <w:szCs w:val="17"/>
+                <w:rFonts w:ascii="Calibri" w:hAnsi="Calibri"/>
+                <w:sz w:val="18"/>
+                <w:szCs w:val="18"/>
                 <w:color w:val="00843D"/>
                 <w:b/>
               </w:rPr>
@@ -4576,10 +4576,10 @@
       </w:pPr>
       <w:r>
         <w:rPr>
-          <w:rFonts w:ascii="Aptos" w:hAnsi="Aptos"/>
+          <w:rFonts w:ascii="Calibri" w:hAnsi="Calibri"/>
           <w:sz w:val="26"/>
           <w:szCs w:val="26"/>
-          <w:color w:val="005F9E"/>
+          <w:color w:val="404040"/>
           <w:b/>
         </w:rPr>
         <w:t xml:space="preserve">Temperatures</w:t>
@@ -4589,11 +4589,11 @@
       <w:tblPr>
         <w:tblW w:w="10800" w:type="dxa"/>
         <w:tblInd w:w="0" w:type="dxa"/>
-        <w:tblLayout w:type="fixed"/>
+        <w:tblLayout w:type="autofit"/>
         <w:tblCellMar>
-          <w:top w:w="80" w:type="dxa"/>
+          <w:top w:w="60" w:type="dxa"/>
           <w:start w:w="120" w:type="dxa"/>
-          <w:bottom w:w="80" w:type="dxa"/>
+          <w:bottom w:w="60" w:type="dxa"/>
           <w:end w:w="120" w:type="dxa"/>
         </w:tblCellMar>
         <w:tblBorders>
@@ -4628,9 +4628,9 @@
             </w:pPr>
             <w:r>
               <w:rPr>
-                <w:rFonts w:ascii="Aptos" w:hAnsi="Aptos"/>
-                <w:sz w:val="17"/>
-                <w:szCs w:val="17"/>
+                <w:rFonts w:ascii="Calibri" w:hAnsi="Calibri"/>
+                <w:sz w:val="18"/>
+                <w:szCs w:val="18"/>
                 <w:color w:val="FFFFFF"/>
                 <w:b/>
               </w:rPr>
@@ -4651,9 +4651,9 @@
             </w:pPr>
             <w:r>
               <w:rPr>
-                <w:rFonts w:ascii="Aptos" w:hAnsi="Aptos"/>
-                <w:sz w:val="17"/>
-                <w:szCs w:val="17"/>
+                <w:rFonts w:ascii="Calibri" w:hAnsi="Calibri"/>
+                <w:sz w:val="18"/>
+                <w:szCs w:val="18"/>
                 <w:color w:val="FFFFFF"/>
                 <w:b/>
               </w:rPr>
@@ -4674,9 +4674,9 @@
             </w:pPr>
             <w:r>
               <w:rPr>
-                <w:rFonts w:ascii="Aptos" w:hAnsi="Aptos"/>
-                <w:sz w:val="17"/>
-                <w:szCs w:val="17"/>
+                <w:rFonts w:ascii="Calibri" w:hAnsi="Calibri"/>
+                <w:sz w:val="18"/>
+                <w:szCs w:val="18"/>
                 <w:color w:val="FFFFFF"/>
                 <w:b/>
               </w:rPr>
@@ -4697,9 +4697,9 @@
             </w:pPr>
             <w:r>
               <w:rPr>
-                <w:rFonts w:ascii="Aptos" w:hAnsi="Aptos"/>
-                <w:sz w:val="17"/>
-                <w:szCs w:val="17"/>
+                <w:rFonts w:ascii="Calibri" w:hAnsi="Calibri"/>
+                <w:sz w:val="18"/>
+                <w:szCs w:val="18"/>
                 <w:color w:val="FFFFFF"/>
                 <w:b/>
               </w:rPr>
@@ -4722,9 +4722,9 @@
             </w:pPr>
             <w:r>
               <w:rPr>
-                <w:rFonts w:ascii="Aptos" w:hAnsi="Aptos"/>
-                <w:sz w:val="17"/>
-                <w:szCs w:val="17"/>
+                <w:rFonts w:ascii="Calibri" w:hAnsi="Calibri"/>
+                <w:sz w:val="18"/>
+                <w:szCs w:val="18"/>
                 <w:color w:val="222222"/>
               </w:rPr>
               <w:t xml:space="preserve">01-Inlet Ambient</w:t>
@@ -4744,9 +4744,9 @@
             </w:pPr>
             <w:r>
               <w:rPr>
-                <w:rFonts w:ascii="Aptos" w:hAnsi="Aptos"/>
-                <w:sz w:val="17"/>
-                <w:szCs w:val="17"/>
+                <w:rFonts w:ascii="Calibri" w:hAnsi="Calibri"/>
+                <w:sz w:val="18"/>
+                <w:szCs w:val="18"/>
                 <w:color w:val="222222"/>
               </w:rPr>
               <w:t xml:space="preserve">22</w:t>
@@ -4766,9 +4766,9 @@
             </w:pPr>
             <w:r>
               <w:rPr>
-                <w:rFonts w:ascii="Aptos" w:hAnsi="Aptos"/>
-                <w:sz w:val="17"/>
-                <w:szCs w:val="17"/>
+                <w:rFonts w:ascii="Calibri" w:hAnsi="Calibri"/>
+                <w:sz w:val="18"/>
+                <w:szCs w:val="18"/>
                 <w:color w:val="222222"/>
               </w:rPr>
               <w:t xml:space="preserve">42</w:t>
@@ -4788,9 +4788,9 @@
             </w:pPr>
             <w:r>
               <w:rPr>
-                <w:rFonts w:ascii="Aptos" w:hAnsi="Aptos"/>
-                <w:sz w:val="17"/>
-                <w:szCs w:val="17"/>
+                <w:rFonts w:ascii="Calibri" w:hAnsi="Calibri"/>
+                <w:sz w:val="18"/>
+                <w:szCs w:val="18"/>
                 <w:color w:val="00843D"/>
                 <w:b/>
               </w:rPr>
@@ -4808,7 +4808,7 @@
       <w:footerReference w:type="first" r:id="rId2"/>
       <w:footerReference w:type="even" r:id="rId2"/>
       <w:pgSz w:w="12240" w:h="15840"/>
-      <w:pgMar w:top="720" w:right="720" w:bottom="720" w:left="720" w:header="432" w:footer="432" w:gutter="0"/>
+      <w:pgMar w:top="1080" w:right="720" w:bottom="720" w:left="720" w:header="432" w:footer="432" w:gutter="0"/>
     </w:sectPr>
   </w:body>
 </w:document>
@@ -4829,7 +4829,7 @@
     </w:pPr>
     <w:r>
       <w:rPr>
-        <w:rFonts w:ascii="Aptos" w:hAnsi="Aptos"/>
+        <w:rFonts w:ascii="Calibri" w:hAnsi="Calibri"/>
         <w:sz w:val="17"/>
         <w:szCs w:val="17"/>
         <w:color w:val="506675"/>
@@ -4842,7 +4842,7 @@
     </w:r>
     <w:r>
       <w:rPr>
-        <w:rFonts w:ascii="Aptos" w:hAnsi="Aptos"/>
+        <w:rFonts w:ascii="Calibri" w:hAnsi="Calibri"/>
         <w:sz w:val="17"/>
         <w:szCs w:val="17"/>
         <w:color w:val="506675"/>
@@ -4854,7 +4854,7 @@
     </w:r>
     <w:r>
       <w:rPr>
-        <w:rFonts w:ascii="Aptos" w:hAnsi="Aptos"/>
+        <w:rFonts w:ascii="Calibri" w:hAnsi="Calibri"/>
         <w:sz w:val="17"/>
         <w:szCs w:val="17"/>
         <w:color w:val="506675"/>
@@ -4864,7 +4864,7 @@
     <w:fldSimple w:instr="PAGE">
       <w:r>
         <w:rPr>
-          <w:rFonts w:ascii="Aptos" w:hAnsi="Aptos"/>
+          <w:rFonts w:ascii="Calibri" w:hAnsi="Calibri"/>
           <w:sz w:val="17"/>
           <w:color w:val="506675"/>
         </w:rPr>
@@ -4873,7 +4873,7 @@
     </w:fldSimple>
     <w:r>
       <w:rPr>
-        <w:rFonts w:ascii="Aptos" w:hAnsi="Aptos"/>
+        <w:rFonts w:ascii="Calibri" w:hAnsi="Calibri"/>
         <w:sz w:val="17"/>
         <w:szCs w:val="17"/>
         <w:color w:val="506675"/>
@@ -4883,7 +4883,7 @@
     <w:fldSimple w:instr="NUMPAGES">
       <w:r>
         <w:rPr>
-          <w:rFonts w:ascii="Aptos" w:hAnsi="Aptos"/>
+          <w:rFonts w:ascii="Calibri" w:hAnsi="Calibri"/>
           <w:sz w:val="17"/>
           <w:color w:val="506675"/>
         </w:rPr>
@@ -4896,66 +4896,112 @@
 
 <file path=word/header1.xml><?xml version="1.0" encoding="utf-8"?>
 <w:hdr xmlns:w="http://schemas.openxmlformats.org/wordprocessingml/2006/main" xmlns:r="http://schemas.openxmlformats.org/officeDocument/2006/relationships" xmlns:wp="http://schemas.openxmlformats.org/drawingml/2006/wordprocessingDrawing" xmlns:a="http://schemas.openxmlformats.org/drawingml/2006/main" xmlns:pic="http://schemas.openxmlformats.org/drawingml/2006/picture">
-  <w:p>
-    <w:pPr>
-      <w:tabs>
-        <w:tab w:val="right" w:pos="10800"/>
-      </w:tabs>
-      <w:pBdr>
-        <w:bottom w:val="single" w:sz="6" w:space="4" w:color="005F9E"/>
-      </w:pBdr>
-      <w:spacing w:after="80"/>
-    </w:pPr>
-    <w:r>
-      <w:drawing>
-        <wp:inline distT="0" distB="0" distL="0" distR="0">
-          <wp:extent cx="751840" cy="228600"/>
-          <wp:effectExtent l="0" t="0" r="0" b="0"/>
-          <wp:docPr id="1" name="Winslow Technology Group logo" descr="Winslow Technology Group logo"/>
-          <wp:cNvGraphicFramePr>
-            <a:graphicFrameLocks noChangeAspect="1"/>
-          </wp:cNvGraphicFramePr>
-          <a:graphic>
-            <a:graphicData uri="http://schemas.openxmlformats.org/drawingml/2006/picture">
-              <pic:pic>
-                <pic:nvPicPr>
-                  <pic:cNvPr id="0" name="winslowtg-logo.png"/>
-                  <pic:cNvPicPr/>
-                </pic:nvPicPr>
-                <pic:blipFill>
-                  <a:blip r:embed="rId1"/>
-                  <a:stretch>
-                    <a:fillRect/>
-                  </a:stretch>
-                </pic:blipFill>
-                <pic:spPr>
-                  <a:xfrm>
-                    <a:off x="0" y="0"/>
-                    <a:ext cx="751840" cy="228600"/>
-                  </a:xfrm>
-                  <a:prstGeom prst="rect">
-                    <a:avLst/>
-                  </a:prstGeom>
-                </pic:spPr>
-              </pic:pic>
-            </a:graphicData>
-          </a:graphic>
-        </wp:inline>
-      </w:drawing>
-    </w:r>
-    <w:r>
-      <w:tab/>
-    </w:r>
-    <w:r>
-      <w:rPr>
-        <w:rFonts w:ascii="Aptos" w:hAnsi="Aptos"/>
-        <w:sz w:val="17"/>
-        <w:szCs w:val="17"/>
-        <w:color w:val="506675"/>
-      </w:rPr>
-      <w:t xml:space="preserve">HP iLO Check - ilo.example.com - Example Customer</w:t>
-    </w:r>
-  </w:p>
+  <w:tbl>
+    <w:tblPr>
+      <w:tblW w:w="10800" w:type="dxa"/>
+      <w:tblLayout w:type="fixed"/>
+    </w:tblPr>
+    <w:tblGrid>
+      <w:gridCol w:w="2300"/>
+      <w:gridCol w:w="8500"/>
+    </w:tblGrid>
+    <w:tr>
+      <w:tc>
+        <w:tcPr>
+          <w:tcW w:w="2300" w:type="dxa"/>
+          <w:vAlign w:val="center"/>
+          <w:tcMar>
+            <w:top w:w="0" w:type="dxa"/>
+            <w:bottom w:w="40" w:type="dxa"/>
+            <w:start w:w="0" w:type="dxa"/>
+            <w:end w:w="100" w:type="dxa"/>
+          </w:tcMar>
+          <w:tcBorders>
+            <w:top w:val="nil"/>
+            <w:left w:val="nil"/>
+            <w:right w:val="nil"/>
+            <w:bottom w:val="single" w:sz="6" w:color="005F9E"/>
+          </w:tcBorders>
+        </w:tcPr>
+        <w:p>
+          <w:pPr>
+            <w:jc w:val="left"/>
+            <w:spacing w:before="0" w:after="0"/>
+          </w:pPr>
+          <w:r>
+            <w:drawing>
+              <wp:inline distT="0" distB="0" distL="0" distR="0">
+                <wp:extent cx="1333500" cy="409575"/>
+                <wp:effectExtent l="0" t="0" r="0" b="0"/>
+                <wp:docPr id="1" name="Winslow Technology Group logo" descr="Winslow Technology Group logo"/>
+                <wp:cNvGraphicFramePr>
+                  <a:graphicFrameLocks noChangeAspect="1"/>
+                </wp:cNvGraphicFramePr>
+                <a:graphic>
+                  <a:graphicData uri="http://schemas.openxmlformats.org/drawingml/2006/picture">
+                    <pic:pic>
+                      <pic:nvPicPr>
+                        <pic:cNvPr id="0" name="winslowtg-logo.png"/>
+                        <pic:cNvPicPr/>
+                      </pic:nvPicPr>
+                      <pic:blipFill>
+                        <a:blip r:embed="rId1"/>
+                        <a:stretch>
+                          <a:fillRect/>
+                        </a:stretch>
+                      </pic:blipFill>
+                      <pic:spPr>
+                        <a:xfrm>
+                          <a:off x="0" y="0"/>
+                          <a:ext cx="1333500" cy="409575"/>
+                        </a:xfrm>
+                        <a:prstGeom prst="rect">
+                          <a:avLst/>
+                        </a:prstGeom>
+                      </pic:spPr>
+                    </pic:pic>
+                  </a:graphicData>
+                </a:graphic>
+              </wp:inline>
+            </w:drawing>
+          </w:r>
+        </w:p>
+      </w:tc>
+      <w:tc>
+        <w:tcPr>
+          <w:tcW w:w="8500" w:type="dxa"/>
+          <w:vAlign w:val="center"/>
+          <w:tcMar>
+            <w:top w:w="0" w:type="dxa"/>
+            <w:bottom w:w="40" w:type="dxa"/>
+            <w:start w:w="100" w:type="dxa"/>
+            <w:end w:w="0" w:type="dxa"/>
+          </w:tcMar>
+          <w:tcBorders>
+            <w:top w:val="nil"/>
+            <w:left w:val="nil"/>
+            <w:right w:val="nil"/>
+            <w:bottom w:val="single" w:sz="6" w:color="005F9E"/>
+          </w:tcBorders>
+        </w:tcPr>
+        <w:p>
+          <w:pPr>
+            <w:jc w:val="right"/>
+            <w:spacing w:before="0" w:after="0"/>
+          </w:pPr>
+          <w:r>
+            <w:rPr>
+              <w:rFonts w:ascii="Calibri" w:hAnsi="Calibri"/>
+              <w:sz w:val="16"/>
+              <w:szCs w:val="16"/>
+              <w:color w:val="404040"/>
+            </w:rPr>
+            <w:t xml:space="preserve">HP iLO Health Check – ilo.example.com – Example Customer</w:t>
+          </w:r>
+        </w:p>
+      </w:tc>
+    </w:tr>
+  </w:tbl>
 </w:hdr>
 </file>
 
@@ -4976,7 +5022,7 @@
         <w:spacing w:after="80" w:line="300" w:lineRule="auto"/>
       </w:pPr>
       <w:rPr>
-        <w:rFonts w:ascii="Aptos" w:hAnsi="Aptos"/>
+        <w:rFonts w:ascii="Calibri" w:hAnsi="Calibri"/>
         <w:sz w:val="18"/>
       </w:rPr>
     </w:lvl>
@@ -4992,7 +5038,7 @@
   <w:docDefaults>
     <w:rPrDefault>
       <w:rPr>
-        <w:rFonts w:ascii="Aptos" w:hAnsi="Aptos"/>
+        <w:rFonts w:ascii="Calibri" w:hAnsi="Calibri"/>
         <w:sz w:val="20"/>
         <w:szCs w:val="20"/>
         <w:color w:val="222222"/>
@@ -5010,7 +5056,7 @@
       <w:spacing w:after="120" w:line="276" w:lineRule="auto"/>
     </w:pPr>
     <w:rPr>
-      <w:rFonts w:ascii="Aptos" w:hAnsi="Aptos"/>
+      <w:rFonts w:ascii="Calibri" w:hAnsi="Calibri"/>
       <w:sz w:val="20"/>
       <w:szCs w:val="20"/>
     </w:rPr>
@@ -5021,7 +5067,7 @@
     <w:next w:val="Normal"/>
     <w:qFormat/>
     <w:rPr>
-      <w:rFonts w:ascii="Aptos Display" w:hAnsi="Aptos Display"/>
+      <w:rFonts w:ascii="Calibri" w:hAnsi="Calibri"/>
       <w:b/>
       <w:color w:val="005F9E"/>
       <w:sz w:val="56"/>
@@ -5033,7 +5079,7 @@
     <w:next w:val="Normal"/>
     <w:qFormat/>
     <w:rPr>
-      <w:rFonts w:ascii="Aptos" w:hAnsi="Aptos"/>
+      <w:rFonts w:ascii="Calibri" w:hAnsi="Calibri"/>
       <w:color w:val="203647"/>
       <w:sz w:val="32"/>
     </w:rPr>
@@ -5066,9 +5112,9 @@
       <w:spacing w:before="280" w:after="140"/>
     </w:pPr>
     <w:rPr>
-      <w:rFonts w:ascii="Aptos Display" w:hAnsi="Aptos Display"/>
+      <w:rFonts w:ascii="Calibri" w:hAnsi="Calibri"/>
       <w:b/>
-      <w:color w:val="005F9E"/>
+      <w:color w:val="404040"/>
       <w:sz w:val="26"/>
     </w:rPr>
   </w:style>

</xml_diff>

<commit_message>
Complete report layout alignment
</commit_message>
<xml_diff>
--- a/examples/sample-health-report.docx
+++ b/examples/sample-health-report.docx
@@ -60,8 +60,8 @@
       <w:r>
         <w:rPr>
           <w:rFonts w:ascii="Calibri" w:hAnsi="Calibri"/>
-          <w:sz w:val="24"/>
-          <w:szCs w:val="24"/>
+          <w:sz w:val="26"/>
+          <w:szCs w:val="26"/>
           <w:color w:val="777777"/>
         </w:rPr>
         <w:t xml:space="preserve">July 29, 2026</w:t>
@@ -151,12 +151,12 @@
           <w:end w:w="120" w:type="dxa"/>
         </w:tblCellMar>
         <w:tblBorders>
-          <w:top w:val="single" w:sz="4" w:color="C8D5DF"/>
-          <w:left w:val="single" w:sz="4" w:color="C8D5DF"/>
-          <w:bottom w:val="single" w:sz="4" w:color="C8D5DF"/>
-          <w:right w:val="single" w:sz="4" w:color="C8D5DF"/>
-          <w:insideH w:val="single" w:sz="4" w:color="DCE5EB"/>
-          <w:insideV w:val="single" w:sz="4" w:color="DCE5EB"/>
+          <w:top w:val="single" w:sz="1" w:color="CCCCCC"/>
+          <w:left w:val="single" w:sz="1" w:color="CCCCCC"/>
+          <w:bottom w:val="single" w:sz="1" w:color="CCCCCC"/>
+          <w:right w:val="single" w:sz="1" w:color="CCCCCC"/>
+          <w:insideH w:val="single" w:sz="1" w:color="CCCCCC"/>
+          <w:insideV w:val="single" w:sz="1" w:color="CCCCCC"/>
         </w:tblBorders>
       </w:tblPr>
       <w:tblGrid>
@@ -166,6 +166,7 @@
       <w:tr>
         <w:trPr>
           <w:tblHeader/>
+          <w:cantSplit/>
         </w:trPr>
         <w:tc>
           <w:tcPr>
@@ -215,6 +216,9 @@
         </w:tc>
       </w:tr>
       <w:tr>
+        <w:trPr>
+          <w:cantSplit/>
+        </w:trPr>
         <w:tc>
           <w:tcPr>
             <w:tcW w:w="3000" w:type="dxa"/>
@@ -262,10 +266,13 @@
         </w:tc>
       </w:tr>
       <w:tr>
+        <w:trPr>
+          <w:cantSplit/>
+        </w:trPr>
         <w:tc>
           <w:tcPr>
             <w:tcW w:w="3000" w:type="dxa"/>
-            <w:shd w:val="clear" w:color="auto" w:fill="EEF4F8"/>
+            <w:shd w:val="clear" w:color="auto" w:fill="F2F7FB"/>
             <w:vAlign w:val="center"/>
           </w:tcPr>
           <w:p>
@@ -288,7 +295,7 @@
         <w:tc>
           <w:tcPr>
             <w:tcW w:w="7800" w:type="dxa"/>
-            <w:shd w:val="clear" w:color="auto" w:fill="EEF4F8"/>
+            <w:shd w:val="clear" w:color="auto" w:fill="F2F7FB"/>
             <w:vAlign w:val="center"/>
           </w:tcPr>
           <w:p>
@@ -309,6 +316,9 @@
         </w:tc>
       </w:tr>
       <w:tr>
+        <w:trPr>
+          <w:cantSplit/>
+        </w:trPr>
         <w:tc>
           <w:tcPr>
             <w:tcW w:w="3000" w:type="dxa"/>
@@ -356,10 +366,13 @@
         </w:tc>
       </w:tr>
       <w:tr>
+        <w:trPr>
+          <w:cantSplit/>
+        </w:trPr>
         <w:tc>
           <w:tcPr>
             <w:tcW w:w="3000" w:type="dxa"/>
-            <w:shd w:val="clear" w:color="auto" w:fill="EEF4F8"/>
+            <w:shd w:val="clear" w:color="auto" w:fill="F2F7FB"/>
             <w:vAlign w:val="center"/>
           </w:tcPr>
           <w:p>
@@ -382,7 +395,7 @@
         <w:tc>
           <w:tcPr>
             <w:tcW w:w="7800" w:type="dxa"/>
-            <w:shd w:val="clear" w:color="auto" w:fill="EEF4F8"/>
+            <w:shd w:val="clear" w:color="auto" w:fill="F2F7FB"/>
             <w:vAlign w:val="center"/>
           </w:tcPr>
           <w:p>
@@ -499,12 +512,12 @@
           <w:end w:w="120" w:type="dxa"/>
         </w:tblCellMar>
         <w:tblBorders>
-          <w:top w:val="single" w:sz="4" w:color="C8D5DF"/>
-          <w:left w:val="single" w:sz="4" w:color="C8D5DF"/>
-          <w:bottom w:val="single" w:sz="4" w:color="C8D5DF"/>
-          <w:right w:val="single" w:sz="4" w:color="C8D5DF"/>
-          <w:insideH w:val="single" w:sz="4" w:color="DCE5EB"/>
-          <w:insideV w:val="single" w:sz="4" w:color="DCE5EB"/>
+          <w:top w:val="single" w:sz="1" w:color="CCCCCC"/>
+          <w:left w:val="single" w:sz="1" w:color="CCCCCC"/>
+          <w:bottom w:val="single" w:sz="1" w:color="CCCCCC"/>
+          <w:right w:val="single" w:sz="1" w:color="CCCCCC"/>
+          <w:insideH w:val="single" w:sz="1" w:color="CCCCCC"/>
+          <w:insideV w:val="single" w:sz="1" w:color="CCCCCC"/>
         </w:tblBorders>
       </w:tblPr>
       <w:tblGrid>
@@ -516,6 +529,7 @@
       <w:tr>
         <w:trPr>
           <w:tblHeader/>
+          <w:cantSplit/>
         </w:trPr>
         <w:tc>
           <w:tcPr>
@@ -611,6 +625,9 @@
         </w:tc>
       </w:tr>
       <w:tr>
+        <w:trPr>
+          <w:cantSplit/>
+        </w:trPr>
         <w:tc>
           <w:tcPr>
             <w:tcW w:w="3460" w:type="dxa"/>
@@ -703,10 +720,13 @@
         </w:tc>
       </w:tr>
       <w:tr>
+        <w:trPr>
+          <w:cantSplit/>
+        </w:trPr>
         <w:tc>
           <w:tcPr>
             <w:tcW w:w="3460" w:type="dxa"/>
-            <w:shd w:val="clear" w:color="auto" w:fill="EEF4F8"/>
+            <w:shd w:val="clear" w:color="auto" w:fill="F2F7FB"/>
             <w:vAlign w:val="center"/>
           </w:tcPr>
           <w:p>
@@ -728,7 +748,7 @@
         <w:tc>
           <w:tcPr>
             <w:tcW w:w="1940" w:type="dxa"/>
-            <w:shd w:val="clear" w:color="auto" w:fill="EEF4F8"/>
+            <w:shd w:val="clear" w:color="auto" w:fill="F2F7FB"/>
             <w:vAlign w:val="center"/>
           </w:tcPr>
           <w:p>
@@ -751,7 +771,7 @@
         <w:tc>
           <w:tcPr>
             <w:tcW w:w="3460" w:type="dxa"/>
-            <w:shd w:val="clear" w:color="auto" w:fill="EEF4F8"/>
+            <w:shd w:val="clear" w:color="auto" w:fill="F2F7FB"/>
             <w:vAlign w:val="center"/>
           </w:tcPr>
           <w:p>
@@ -773,7 +793,7 @@
         <w:tc>
           <w:tcPr>
             <w:tcW w:w="1940" w:type="dxa"/>
-            <w:shd w:val="clear" w:color="auto" w:fill="EEF4F8"/>
+            <w:shd w:val="clear" w:color="auto" w:fill="F2F7FB"/>
             <w:vAlign w:val="center"/>
           </w:tcPr>
           <w:p>
@@ -795,6 +815,9 @@
         </w:tc>
       </w:tr>
       <w:tr>
+        <w:trPr>
+          <w:cantSplit/>
+        </w:trPr>
         <w:tc>
           <w:tcPr>
             <w:tcW w:w="3460" w:type="dxa"/>
@@ -887,10 +910,13 @@
         </w:tc>
       </w:tr>
       <w:tr>
+        <w:trPr>
+          <w:cantSplit/>
+        </w:trPr>
         <w:tc>
           <w:tcPr>
             <w:tcW w:w="3460" w:type="dxa"/>
-            <w:shd w:val="clear" w:color="auto" w:fill="EEF4F8"/>
+            <w:shd w:val="clear" w:color="auto" w:fill="F2F7FB"/>
             <w:vAlign w:val="center"/>
           </w:tcPr>
           <w:p>
@@ -912,7 +938,7 @@
         <w:tc>
           <w:tcPr>
             <w:tcW w:w="1940" w:type="dxa"/>
-            <w:shd w:val="clear" w:color="auto" w:fill="EEF4F8"/>
+            <w:shd w:val="clear" w:color="auto" w:fill="F2F7FB"/>
             <w:vAlign w:val="center"/>
           </w:tcPr>
           <w:p>
@@ -935,7 +961,7 @@
         <w:tc>
           <w:tcPr>
             <w:tcW w:w="3460" w:type="dxa"/>
-            <w:shd w:val="clear" w:color="auto" w:fill="EEF4F8"/>
+            <w:shd w:val="clear" w:color="auto" w:fill="F2F7FB"/>
             <w:vAlign w:val="center"/>
           </w:tcPr>
           <w:p>
@@ -957,7 +983,7 @@
         <w:tc>
           <w:tcPr>
             <w:tcW w:w="1940" w:type="dxa"/>
-            <w:shd w:val="clear" w:color="auto" w:fill="EEF4F8"/>
+            <w:shd w:val="clear" w:color="auto" w:fill="F2F7FB"/>
             <w:vAlign w:val="center"/>
           </w:tcPr>
           <w:p>
@@ -1028,12 +1054,12 @@
           <w:end w:w="120" w:type="dxa"/>
         </w:tblCellMar>
         <w:tblBorders>
-          <w:top w:val="single" w:sz="4" w:color="C8D5DF"/>
-          <w:left w:val="single" w:sz="4" w:color="C8D5DF"/>
-          <w:bottom w:val="single" w:sz="4" w:color="C8D5DF"/>
-          <w:right w:val="single" w:sz="4" w:color="C8D5DF"/>
-          <w:insideH w:val="single" w:sz="4" w:color="DCE5EB"/>
-          <w:insideV w:val="single" w:sz="4" w:color="DCE5EB"/>
+          <w:top w:val="single" w:sz="1" w:color="CCCCCC"/>
+          <w:left w:val="single" w:sz="1" w:color="CCCCCC"/>
+          <w:bottom w:val="single" w:sz="1" w:color="CCCCCC"/>
+          <w:right w:val="single" w:sz="1" w:color="CCCCCC"/>
+          <w:insideH w:val="single" w:sz="1" w:color="CCCCCC"/>
+          <w:insideV w:val="single" w:sz="1" w:color="CCCCCC"/>
         </w:tblBorders>
       </w:tblPr>
       <w:tblGrid>
@@ -1043,6 +1069,7 @@
       <w:tr>
         <w:trPr>
           <w:tblHeader/>
+          <w:cantSplit/>
         </w:trPr>
         <w:tc>
           <w:tcPr>
@@ -1092,6 +1119,9 @@
         </w:tc>
       </w:tr>
       <w:tr>
+        <w:trPr>
+          <w:cantSplit/>
+        </w:trPr>
         <w:tc>
           <w:tcPr>
             <w:tcW w:w="3000" w:type="dxa"/>
@@ -1138,10 +1168,13 @@
         </w:tc>
       </w:tr>
       <w:tr>
+        <w:trPr>
+          <w:cantSplit/>
+        </w:trPr>
         <w:tc>
           <w:tcPr>
             <w:tcW w:w="3000" w:type="dxa"/>
-            <w:shd w:val="clear" w:color="auto" w:fill="EEF4F8"/>
+            <w:shd w:val="clear" w:color="auto" w:fill="F2F7FB"/>
             <w:vAlign w:val="center"/>
           </w:tcPr>
           <w:p>
@@ -1163,7 +1196,7 @@
         <w:tc>
           <w:tcPr>
             <w:tcW w:w="7800" w:type="dxa"/>
-            <w:shd w:val="clear" w:color="auto" w:fill="EEF4F8"/>
+            <w:shd w:val="clear" w:color="auto" w:fill="F2F7FB"/>
             <w:vAlign w:val="center"/>
           </w:tcPr>
           <w:p>
@@ -1184,6 +1217,9 @@
         </w:tc>
       </w:tr>
       <w:tr>
+        <w:trPr>
+          <w:cantSplit/>
+        </w:trPr>
         <w:tc>
           <w:tcPr>
             <w:tcW w:w="3000" w:type="dxa"/>
@@ -1261,12 +1297,12 @@
           <w:end w:w="120" w:type="dxa"/>
         </w:tblCellMar>
         <w:tblBorders>
-          <w:top w:val="single" w:sz="4" w:color="C8D5DF"/>
-          <w:left w:val="single" w:sz="4" w:color="C8D5DF"/>
-          <w:bottom w:val="single" w:sz="4" w:color="C8D5DF"/>
-          <w:right w:val="single" w:sz="4" w:color="C8D5DF"/>
-          <w:insideH w:val="single" w:sz="4" w:color="DCE5EB"/>
-          <w:insideV w:val="single" w:sz="4" w:color="DCE5EB"/>
+          <w:top w:val="single" w:sz="1" w:color="CCCCCC"/>
+          <w:left w:val="single" w:sz="1" w:color="CCCCCC"/>
+          <w:bottom w:val="single" w:sz="1" w:color="CCCCCC"/>
+          <w:right w:val="single" w:sz="1" w:color="CCCCCC"/>
+          <w:insideH w:val="single" w:sz="1" w:color="CCCCCC"/>
+          <w:insideV w:val="single" w:sz="1" w:color="CCCCCC"/>
         </w:tblBorders>
       </w:tblPr>
       <w:tblGrid>
@@ -1277,6 +1313,7 @@
       <w:tr>
         <w:trPr>
           <w:tblHeader/>
+          <w:cantSplit/>
         </w:trPr>
         <w:tc>
           <w:tcPr>
@@ -1349,6 +1386,9 @@
         </w:tc>
       </w:tr>
       <w:tr>
+        <w:trPr>
+          <w:cantSplit/>
+        </w:trPr>
         <w:tc>
           <w:tcPr>
             <w:tcW w:w="2925" w:type="dxa"/>
@@ -1448,12 +1488,12 @@
           <w:end w:w="120" w:type="dxa"/>
         </w:tblCellMar>
         <w:tblBorders>
-          <w:top w:val="single" w:sz="4" w:color="C8D5DF"/>
-          <w:left w:val="single" w:sz="4" w:color="C8D5DF"/>
-          <w:bottom w:val="single" w:sz="4" w:color="C8D5DF"/>
-          <w:right w:val="single" w:sz="4" w:color="C8D5DF"/>
-          <w:insideH w:val="single" w:sz="4" w:color="DCE5EB"/>
-          <w:insideV w:val="single" w:sz="4" w:color="DCE5EB"/>
+          <w:top w:val="single" w:sz="1" w:color="CCCCCC"/>
+          <w:left w:val="single" w:sz="1" w:color="CCCCCC"/>
+          <w:bottom w:val="single" w:sz="1" w:color="CCCCCC"/>
+          <w:right w:val="single" w:sz="1" w:color="CCCCCC"/>
+          <w:insideH w:val="single" w:sz="1" w:color="CCCCCC"/>
+          <w:insideV w:val="single" w:sz="1" w:color="CCCCCC"/>
         </w:tblBorders>
       </w:tblPr>
       <w:tblGrid>
@@ -1464,6 +1504,7 @@
       <w:tr>
         <w:trPr>
           <w:tblHeader/>
+          <w:cantSplit/>
         </w:trPr>
         <w:tc>
           <w:tcPr>
@@ -1536,6 +1577,9 @@
         </w:tc>
       </w:tr>
       <w:tr>
+        <w:trPr>
+          <w:cantSplit/>
+        </w:trPr>
         <w:tc>
           <w:tcPr>
             <w:tcW w:w="3703" w:type="dxa"/>
@@ -1635,12 +1679,12 @@
           <w:end w:w="120" w:type="dxa"/>
         </w:tblCellMar>
         <w:tblBorders>
-          <w:top w:val="single" w:sz="4" w:color="C8D5DF"/>
-          <w:left w:val="single" w:sz="4" w:color="C8D5DF"/>
-          <w:bottom w:val="single" w:sz="4" w:color="C8D5DF"/>
-          <w:right w:val="single" w:sz="4" w:color="C8D5DF"/>
-          <w:insideH w:val="single" w:sz="4" w:color="DCE5EB"/>
-          <w:insideV w:val="single" w:sz="4" w:color="DCE5EB"/>
+          <w:top w:val="single" w:sz="1" w:color="CCCCCC"/>
+          <w:left w:val="single" w:sz="1" w:color="CCCCCC"/>
+          <w:bottom w:val="single" w:sz="1" w:color="CCCCCC"/>
+          <w:right w:val="single" w:sz="1" w:color="CCCCCC"/>
+          <w:insideH w:val="single" w:sz="1" w:color="CCCCCC"/>
+          <w:insideV w:val="single" w:sz="1" w:color="CCCCCC"/>
         </w:tblBorders>
       </w:tblPr>
       <w:tblGrid>
@@ -1652,6 +1696,7 @@
       <w:tr>
         <w:trPr>
           <w:tblHeader/>
+          <w:cantSplit/>
         </w:trPr>
         <w:tc>
           <w:tcPr>
@@ -1747,6 +1792,9 @@
         </w:tc>
       </w:tr>
       <w:tr>
+        <w:trPr>
+          <w:cantSplit/>
+        </w:trPr>
         <w:tc>
           <w:tcPr>
             <w:tcW w:w="2152" w:type="dxa"/>
@@ -1886,12 +1934,12 @@
           <w:end w:w="120" w:type="dxa"/>
         </w:tblCellMar>
         <w:tblBorders>
-          <w:top w:val="single" w:sz="4" w:color="C8D5DF"/>
-          <w:left w:val="single" w:sz="4" w:color="C8D5DF"/>
-          <w:bottom w:val="single" w:sz="4" w:color="C8D5DF"/>
-          <w:right w:val="single" w:sz="4" w:color="C8D5DF"/>
-          <w:insideH w:val="single" w:sz="4" w:color="DCE5EB"/>
-          <w:insideV w:val="single" w:sz="4" w:color="DCE5EB"/>
+          <w:top w:val="single" w:sz="1" w:color="CCCCCC"/>
+          <w:left w:val="single" w:sz="1" w:color="CCCCCC"/>
+          <w:bottom w:val="single" w:sz="1" w:color="CCCCCC"/>
+          <w:right w:val="single" w:sz="1" w:color="CCCCCC"/>
+          <w:insideH w:val="single" w:sz="1" w:color="CCCCCC"/>
+          <w:insideV w:val="single" w:sz="1" w:color="CCCCCC"/>
         </w:tblBorders>
       </w:tblPr>
       <w:tblGrid>
@@ -1901,6 +1949,7 @@
       <w:tr>
         <w:trPr>
           <w:tblHeader/>
+          <w:cantSplit/>
         </w:trPr>
         <w:tc>
           <w:tcPr>
@@ -1950,6 +1999,9 @@
         </w:tc>
       </w:tr>
       <w:tr>
+        <w:trPr>
+          <w:cantSplit/>
+        </w:trPr>
         <w:tc>
           <w:tcPr>
             <w:tcW w:w="3000" w:type="dxa"/>
@@ -1996,10 +2048,13 @@
         </w:tc>
       </w:tr>
       <w:tr>
+        <w:trPr>
+          <w:cantSplit/>
+        </w:trPr>
         <w:tc>
           <w:tcPr>
             <w:tcW w:w="3000" w:type="dxa"/>
-            <w:shd w:val="clear" w:color="auto" w:fill="EEF4F8"/>
+            <w:shd w:val="clear" w:color="auto" w:fill="F2F7FB"/>
             <w:vAlign w:val="center"/>
           </w:tcPr>
           <w:p>
@@ -2021,7 +2076,7 @@
         <w:tc>
           <w:tcPr>
             <w:tcW w:w="7800" w:type="dxa"/>
-            <w:shd w:val="clear" w:color="auto" w:fill="EEF4F8"/>
+            <w:shd w:val="clear" w:color="auto" w:fill="F2F7FB"/>
             <w:vAlign w:val="center"/>
           </w:tcPr>
           <w:p>
@@ -2042,6 +2097,9 @@
         </w:tc>
       </w:tr>
       <w:tr>
+        <w:trPr>
+          <w:cantSplit/>
+        </w:trPr>
         <w:tc>
           <w:tcPr>
             <w:tcW w:w="3000" w:type="dxa"/>
@@ -2088,10 +2146,13 @@
         </w:tc>
       </w:tr>
       <w:tr>
+        <w:trPr>
+          <w:cantSplit/>
+        </w:trPr>
         <w:tc>
           <w:tcPr>
             <w:tcW w:w="3000" w:type="dxa"/>
-            <w:shd w:val="clear" w:color="auto" w:fill="EEF4F8"/>
+            <w:shd w:val="clear" w:color="auto" w:fill="F2F7FB"/>
             <w:vAlign w:val="center"/>
           </w:tcPr>
           <w:p>
@@ -2113,7 +2174,7 @@
         <w:tc>
           <w:tcPr>
             <w:tcW w:w="7800" w:type="dxa"/>
-            <w:shd w:val="clear" w:color="auto" w:fill="EEF4F8"/>
+            <w:shd w:val="clear" w:color="auto" w:fill="F2F7FB"/>
             <w:vAlign w:val="center"/>
           </w:tcPr>
           <w:p>
@@ -2164,12 +2225,12 @@
           <w:end w:w="120" w:type="dxa"/>
         </w:tblCellMar>
         <w:tblBorders>
-          <w:top w:val="single" w:sz="4" w:color="C8D5DF"/>
-          <w:left w:val="single" w:sz="4" w:color="C8D5DF"/>
-          <w:bottom w:val="single" w:sz="4" w:color="C8D5DF"/>
-          <w:right w:val="single" w:sz="4" w:color="C8D5DF"/>
-          <w:insideH w:val="single" w:sz="4" w:color="DCE5EB"/>
-          <w:insideV w:val="single" w:sz="4" w:color="DCE5EB"/>
+          <w:top w:val="single" w:sz="1" w:color="CCCCCC"/>
+          <w:left w:val="single" w:sz="1" w:color="CCCCCC"/>
+          <w:bottom w:val="single" w:sz="1" w:color="CCCCCC"/>
+          <w:right w:val="single" w:sz="1" w:color="CCCCCC"/>
+          <w:insideH w:val="single" w:sz="1" w:color="CCCCCC"/>
+          <w:insideV w:val="single" w:sz="1" w:color="CCCCCC"/>
         </w:tblBorders>
       </w:tblPr>
       <w:tblGrid>
@@ -2179,6 +2240,7 @@
       <w:tr>
         <w:trPr>
           <w:tblHeader/>
+          <w:cantSplit/>
         </w:trPr>
         <w:tc>
           <w:tcPr>
@@ -2228,6 +2290,9 @@
         </w:tc>
       </w:tr>
       <w:tr>
+        <w:trPr>
+          <w:cantSplit/>
+        </w:trPr>
         <w:tc>
           <w:tcPr>
             <w:tcW w:w="6347" w:type="dxa"/>
@@ -2323,12 +2388,12 @@
           <w:end w:w="120" w:type="dxa"/>
         </w:tblCellMar>
         <w:tblBorders>
-          <w:top w:val="single" w:sz="4" w:color="C8D5DF"/>
-          <w:left w:val="single" w:sz="4" w:color="C8D5DF"/>
-          <w:bottom w:val="single" w:sz="4" w:color="C8D5DF"/>
-          <w:right w:val="single" w:sz="4" w:color="C8D5DF"/>
-          <w:insideH w:val="single" w:sz="4" w:color="DCE5EB"/>
-          <w:insideV w:val="single" w:sz="4" w:color="DCE5EB"/>
+          <w:top w:val="single" w:sz="1" w:color="CCCCCC"/>
+          <w:left w:val="single" w:sz="1" w:color="CCCCCC"/>
+          <w:bottom w:val="single" w:sz="1" w:color="CCCCCC"/>
+          <w:right w:val="single" w:sz="1" w:color="CCCCCC"/>
+          <w:insideH w:val="single" w:sz="1" w:color="CCCCCC"/>
+          <w:insideV w:val="single" w:sz="1" w:color="CCCCCC"/>
         </w:tblBorders>
       </w:tblPr>
       <w:tblGrid>
@@ -2338,6 +2403,7 @@
       <w:tr>
         <w:trPr>
           <w:tblHeader/>
+          <w:cantSplit/>
         </w:trPr>
         <w:tc>
           <w:tcPr>
@@ -2387,6 +2453,9 @@
         </w:tc>
       </w:tr>
       <w:tr>
+        <w:trPr>
+          <w:cantSplit/>
+        </w:trPr>
         <w:tc>
           <w:tcPr>
             <w:tcW w:w="3000" w:type="dxa"/>
@@ -2433,10 +2502,13 @@
         </w:tc>
       </w:tr>
       <w:tr>
+        <w:trPr>
+          <w:cantSplit/>
+        </w:trPr>
         <w:tc>
           <w:tcPr>
             <w:tcW w:w="3000" w:type="dxa"/>
-            <w:shd w:val="clear" w:color="auto" w:fill="EEF4F8"/>
+            <w:shd w:val="clear" w:color="auto" w:fill="F2F7FB"/>
             <w:vAlign w:val="center"/>
           </w:tcPr>
           <w:p>
@@ -2458,7 +2530,7 @@
         <w:tc>
           <w:tcPr>
             <w:tcW w:w="7800" w:type="dxa"/>
-            <w:shd w:val="clear" w:color="auto" w:fill="EEF4F8"/>
+            <w:shd w:val="clear" w:color="auto" w:fill="F2F7FB"/>
             <w:vAlign w:val="center"/>
           </w:tcPr>
           <w:p>
@@ -2479,6 +2551,9 @@
         </w:tc>
       </w:tr>
       <w:tr>
+        <w:trPr>
+          <w:cantSplit/>
+        </w:trPr>
         <w:tc>
           <w:tcPr>
             <w:tcW w:w="3000" w:type="dxa"/>
@@ -2556,12 +2631,12 @@
           <w:end w:w="120" w:type="dxa"/>
         </w:tblCellMar>
         <w:tblBorders>
-          <w:top w:val="single" w:sz="4" w:color="C8D5DF"/>
-          <w:left w:val="single" w:sz="4" w:color="C8D5DF"/>
-          <w:bottom w:val="single" w:sz="4" w:color="C8D5DF"/>
-          <w:right w:val="single" w:sz="4" w:color="C8D5DF"/>
-          <w:insideH w:val="single" w:sz="4" w:color="DCE5EB"/>
-          <w:insideV w:val="single" w:sz="4" w:color="DCE5EB"/>
+          <w:top w:val="single" w:sz="1" w:color="CCCCCC"/>
+          <w:left w:val="single" w:sz="1" w:color="CCCCCC"/>
+          <w:bottom w:val="single" w:sz="1" w:color="CCCCCC"/>
+          <w:right w:val="single" w:sz="1" w:color="CCCCCC"/>
+          <w:insideH w:val="single" w:sz="1" w:color="CCCCCC"/>
+          <w:insideV w:val="single" w:sz="1" w:color="CCCCCC"/>
         </w:tblBorders>
       </w:tblPr>
       <w:tblGrid>
@@ -2572,6 +2647,7 @@
       <w:tr>
         <w:trPr>
           <w:tblHeader/>
+          <w:cantSplit/>
         </w:trPr>
         <w:tc>
           <w:tcPr>
@@ -2644,6 +2720,9 @@
         </w:tc>
       </w:tr>
       <w:tr>
+        <w:trPr>
+          <w:cantSplit/>
+        </w:trPr>
         <w:tc>
           <w:tcPr>
             <w:tcW w:w="2308" w:type="dxa"/>
@@ -2743,12 +2822,12 @@
           <w:end w:w="120" w:type="dxa"/>
         </w:tblCellMar>
         <w:tblBorders>
-          <w:top w:val="single" w:sz="4" w:color="C8D5DF"/>
-          <w:left w:val="single" w:sz="4" w:color="C8D5DF"/>
-          <w:bottom w:val="single" w:sz="4" w:color="C8D5DF"/>
-          <w:right w:val="single" w:sz="4" w:color="C8D5DF"/>
-          <w:insideH w:val="single" w:sz="4" w:color="DCE5EB"/>
-          <w:insideV w:val="single" w:sz="4" w:color="DCE5EB"/>
+          <w:top w:val="single" w:sz="1" w:color="CCCCCC"/>
+          <w:left w:val="single" w:sz="1" w:color="CCCCCC"/>
+          <w:bottom w:val="single" w:sz="1" w:color="CCCCCC"/>
+          <w:right w:val="single" w:sz="1" w:color="CCCCCC"/>
+          <w:insideH w:val="single" w:sz="1" w:color="CCCCCC"/>
+          <w:insideV w:val="single" w:sz="1" w:color="CCCCCC"/>
         </w:tblBorders>
       </w:tblPr>
       <w:tblGrid>
@@ -2761,6 +2840,7 @@
       <w:tr>
         <w:trPr>
           <w:tblHeader/>
+          <w:cantSplit/>
         </w:trPr>
         <w:tc>
           <w:tcPr>
@@ -2879,6 +2959,9 @@
         </w:tc>
       </w:tr>
       <w:tr>
+        <w:trPr>
+          <w:cantSplit/>
+        </w:trPr>
         <w:tc>
           <w:tcPr>
             <w:tcW w:w="2503" w:type="dxa"/>
@@ -2992,10 +3075,13 @@
         </w:tc>
       </w:tr>
       <w:tr>
+        <w:trPr>
+          <w:cantSplit/>
+        </w:trPr>
         <w:tc>
           <w:tcPr>
             <w:tcW w:w="2503" w:type="dxa"/>
-            <w:shd w:val="clear" w:color="auto" w:fill="EEF4F8"/>
+            <w:shd w:val="clear" w:color="auto" w:fill="F2F7FB"/>
             <w:vAlign w:val="center"/>
           </w:tcPr>
           <w:p>
@@ -3017,7 +3103,7 @@
         <w:tc>
           <w:tcPr>
             <w:tcW w:w="2503" w:type="dxa"/>
-            <w:shd w:val="clear" w:color="auto" w:fill="EEF4F8"/>
+            <w:shd w:val="clear" w:color="auto" w:fill="F2F7FB"/>
             <w:vAlign w:val="center"/>
           </w:tcPr>
           <w:p>
@@ -3039,7 +3125,7 @@
         <w:tc>
           <w:tcPr>
             <w:tcW w:w="1816" w:type="dxa"/>
-            <w:shd w:val="clear" w:color="auto" w:fill="EEF4F8"/>
+            <w:shd w:val="clear" w:color="auto" w:fill="F2F7FB"/>
             <w:vAlign w:val="center"/>
           </w:tcPr>
           <w:p>
@@ -3061,7 +3147,7 @@
         <w:tc>
           <w:tcPr>
             <w:tcW w:w="2160" w:type="dxa"/>
-            <w:shd w:val="clear" w:color="auto" w:fill="EEF4F8"/>
+            <w:shd w:val="clear" w:color="auto" w:fill="F2F7FB"/>
             <w:vAlign w:val="center"/>
           </w:tcPr>
           <w:p>
@@ -3083,7 +3169,7 @@
         <w:tc>
           <w:tcPr>
             <w:tcW w:w="1818" w:type="dxa"/>
-            <w:shd w:val="clear" w:color="auto" w:fill="EEF4F8"/>
+            <w:shd w:val="clear" w:color="auto" w:fill="F2F7FB"/>
             <w:vAlign w:val="center"/>
           </w:tcPr>
           <w:p>
@@ -3135,12 +3221,12 @@
           <w:end w:w="120" w:type="dxa"/>
         </w:tblCellMar>
         <w:tblBorders>
-          <w:top w:val="single" w:sz="4" w:color="C8D5DF"/>
-          <w:left w:val="single" w:sz="4" w:color="C8D5DF"/>
-          <w:bottom w:val="single" w:sz="4" w:color="C8D5DF"/>
-          <w:right w:val="single" w:sz="4" w:color="C8D5DF"/>
-          <w:insideH w:val="single" w:sz="4" w:color="DCE5EB"/>
-          <w:insideV w:val="single" w:sz="4" w:color="DCE5EB"/>
+          <w:top w:val="single" w:sz="1" w:color="CCCCCC"/>
+          <w:left w:val="single" w:sz="1" w:color="CCCCCC"/>
+          <w:bottom w:val="single" w:sz="1" w:color="CCCCCC"/>
+          <w:right w:val="single" w:sz="1" w:color="CCCCCC"/>
+          <w:insideH w:val="single" w:sz="1" w:color="CCCCCC"/>
+          <w:insideV w:val="single" w:sz="1" w:color="CCCCCC"/>
         </w:tblBorders>
       </w:tblPr>
       <w:tblGrid>
@@ -3155,6 +3241,7 @@
       <w:tr>
         <w:trPr>
           <w:tblHeader/>
+          <w:cantSplit/>
         </w:trPr>
         <w:tc>
           <w:tcPr>
@@ -3319,6 +3406,9 @@
         </w:tc>
       </w:tr>
       <w:tr>
+        <w:trPr>
+          <w:cantSplit/>
+        </w:trPr>
         <w:tc>
           <w:tcPr>
             <w:tcW w:w="1624" w:type="dxa"/>
@@ -3506,12 +3596,12 @@
           <w:end w:w="120" w:type="dxa"/>
         </w:tblCellMar>
         <w:tblBorders>
-          <w:top w:val="single" w:sz="4" w:color="C8D5DF"/>
-          <w:left w:val="single" w:sz="4" w:color="C8D5DF"/>
-          <w:bottom w:val="single" w:sz="4" w:color="C8D5DF"/>
-          <w:right w:val="single" w:sz="4" w:color="C8D5DF"/>
-          <w:insideH w:val="single" w:sz="4" w:color="DCE5EB"/>
-          <w:insideV w:val="single" w:sz="4" w:color="DCE5EB"/>
+          <w:top w:val="single" w:sz="1" w:color="CCCCCC"/>
+          <w:left w:val="single" w:sz="1" w:color="CCCCCC"/>
+          <w:bottom w:val="single" w:sz="1" w:color="CCCCCC"/>
+          <w:right w:val="single" w:sz="1" w:color="CCCCCC"/>
+          <w:insideH w:val="single" w:sz="1" w:color="CCCCCC"/>
+          <w:insideV w:val="single" w:sz="1" w:color="CCCCCC"/>
         </w:tblBorders>
       </w:tblPr>
       <w:tblGrid>
@@ -3524,6 +3614,7 @@
       <w:tr>
         <w:trPr>
           <w:tblHeader/>
+          <w:cantSplit/>
         </w:trPr>
         <w:tc>
           <w:tcPr>
@@ -3642,6 +3733,9 @@
         </w:tc>
       </w:tr>
       <w:tr>
+        <w:trPr>
+          <w:cantSplit/>
+        </w:trPr>
         <w:tc>
           <w:tcPr>
             <w:tcW w:w="1810" w:type="dxa"/>
@@ -3785,12 +3879,12 @@
           <w:end w:w="120" w:type="dxa"/>
         </w:tblCellMar>
         <w:tblBorders>
-          <w:top w:val="single" w:sz="4" w:color="C8D5DF"/>
-          <w:left w:val="single" w:sz="4" w:color="C8D5DF"/>
-          <w:bottom w:val="single" w:sz="4" w:color="C8D5DF"/>
-          <w:right w:val="single" w:sz="4" w:color="C8D5DF"/>
-          <w:insideH w:val="single" w:sz="4" w:color="DCE5EB"/>
-          <w:insideV w:val="single" w:sz="4" w:color="DCE5EB"/>
+          <w:top w:val="single" w:sz="1" w:color="CCCCCC"/>
+          <w:left w:val="single" w:sz="1" w:color="CCCCCC"/>
+          <w:bottom w:val="single" w:sz="1" w:color="CCCCCC"/>
+          <w:right w:val="single" w:sz="1" w:color="CCCCCC"/>
+          <w:insideH w:val="single" w:sz="1" w:color="CCCCCC"/>
+          <w:insideV w:val="single" w:sz="1" w:color="CCCCCC"/>
         </w:tblBorders>
       </w:tblPr>
       <w:tblGrid>
@@ -3802,6 +3896,7 @@
       <w:tr>
         <w:trPr>
           <w:tblHeader/>
+          <w:cantSplit/>
         </w:trPr>
         <w:tc>
           <w:tcPr>
@@ -3897,6 +3992,9 @@
         </w:tc>
       </w:tr>
       <w:tr>
+        <w:trPr>
+          <w:cantSplit/>
+        </w:trPr>
         <w:tc>
           <w:tcPr>
             <w:tcW w:w="2700" w:type="dxa"/>
@@ -4018,12 +4116,12 @@
           <w:end w:w="120" w:type="dxa"/>
         </w:tblCellMar>
         <w:tblBorders>
-          <w:top w:val="single" w:sz="4" w:color="C8D5DF"/>
-          <w:left w:val="single" w:sz="4" w:color="C8D5DF"/>
-          <w:bottom w:val="single" w:sz="4" w:color="C8D5DF"/>
-          <w:right w:val="single" w:sz="4" w:color="C8D5DF"/>
-          <w:insideH w:val="single" w:sz="4" w:color="DCE5EB"/>
-          <w:insideV w:val="single" w:sz="4" w:color="DCE5EB"/>
+          <w:top w:val="single" w:sz="1" w:color="CCCCCC"/>
+          <w:left w:val="single" w:sz="1" w:color="CCCCCC"/>
+          <w:bottom w:val="single" w:sz="1" w:color="CCCCCC"/>
+          <w:right w:val="single" w:sz="1" w:color="CCCCCC"/>
+          <w:insideH w:val="single" w:sz="1" w:color="CCCCCC"/>
+          <w:insideV w:val="single" w:sz="1" w:color="CCCCCC"/>
         </w:tblBorders>
       </w:tblPr>
       <w:tblGrid>
@@ -4034,6 +4132,7 @@
       <w:tr>
         <w:trPr>
           <w:tblHeader/>
+          <w:cantSplit/>
         </w:trPr>
         <w:tc>
           <w:tcPr>
@@ -4106,6 +4205,9 @@
         </w:tc>
       </w:tr>
       <w:tr>
+        <w:trPr>
+          <w:cantSplit/>
+        </w:trPr>
         <w:tc>
           <w:tcPr>
             <w:tcW w:w="3600" w:type="dxa"/>
@@ -4223,12 +4325,12 @@
           <w:end w:w="120" w:type="dxa"/>
         </w:tblCellMar>
         <w:tblBorders>
-          <w:top w:val="single" w:sz="4" w:color="C8D5DF"/>
-          <w:left w:val="single" w:sz="4" w:color="C8D5DF"/>
-          <w:bottom w:val="single" w:sz="4" w:color="C8D5DF"/>
-          <w:right w:val="single" w:sz="4" w:color="C8D5DF"/>
-          <w:insideH w:val="single" w:sz="4" w:color="DCE5EB"/>
-          <w:insideV w:val="single" w:sz="4" w:color="DCE5EB"/>
+          <w:top w:val="single" w:sz="1" w:color="CCCCCC"/>
+          <w:left w:val="single" w:sz="1" w:color="CCCCCC"/>
+          <w:bottom w:val="single" w:sz="1" w:color="CCCCCC"/>
+          <w:right w:val="single" w:sz="1" w:color="CCCCCC"/>
+          <w:insideH w:val="single" w:sz="1" w:color="CCCCCC"/>
+          <w:insideV w:val="single" w:sz="1" w:color="CCCCCC"/>
         </w:tblBorders>
       </w:tblPr>
       <w:tblGrid>
@@ -4239,6 +4341,7 @@
       <w:tr>
         <w:trPr>
           <w:tblHeader/>
+          <w:cantSplit/>
         </w:trPr>
         <w:tc>
           <w:tcPr>
@@ -4311,6 +4414,9 @@
         </w:tc>
       </w:tr>
       <w:tr>
+        <w:trPr>
+          <w:cantSplit/>
+        </w:trPr>
         <w:tc>
           <w:tcPr>
             <w:tcW w:w="3000" w:type="dxa"/>
@@ -4410,12 +4516,12 @@
           <w:end w:w="120" w:type="dxa"/>
         </w:tblCellMar>
         <w:tblBorders>
-          <w:top w:val="single" w:sz="4" w:color="C8D5DF"/>
-          <w:left w:val="single" w:sz="4" w:color="C8D5DF"/>
-          <w:bottom w:val="single" w:sz="4" w:color="C8D5DF"/>
-          <w:right w:val="single" w:sz="4" w:color="C8D5DF"/>
-          <w:insideH w:val="single" w:sz="4" w:color="DCE5EB"/>
-          <w:insideV w:val="single" w:sz="4" w:color="DCE5EB"/>
+          <w:top w:val="single" w:sz="1" w:color="CCCCCC"/>
+          <w:left w:val="single" w:sz="1" w:color="CCCCCC"/>
+          <w:bottom w:val="single" w:sz="1" w:color="CCCCCC"/>
+          <w:right w:val="single" w:sz="1" w:color="CCCCCC"/>
+          <w:insideH w:val="single" w:sz="1" w:color="CCCCCC"/>
+          <w:insideV w:val="single" w:sz="1" w:color="CCCCCC"/>
         </w:tblBorders>
       </w:tblPr>
       <w:tblGrid>
@@ -4426,6 +4532,7 @@
       <w:tr>
         <w:trPr>
           <w:tblHeader/>
+          <w:cantSplit/>
         </w:trPr>
         <w:tc>
           <w:tcPr>
@@ -4498,6 +4605,9 @@
         </w:tc>
       </w:tr>
       <w:tr>
+        <w:trPr>
+          <w:cantSplit/>
+        </w:trPr>
         <w:tc>
           <w:tcPr>
             <w:tcW w:w="3600" w:type="dxa"/>
@@ -4597,12 +4707,12 @@
           <w:end w:w="120" w:type="dxa"/>
         </w:tblCellMar>
         <w:tblBorders>
-          <w:top w:val="single" w:sz="4" w:color="C8D5DF"/>
-          <w:left w:val="single" w:sz="4" w:color="C8D5DF"/>
-          <w:bottom w:val="single" w:sz="4" w:color="C8D5DF"/>
-          <w:right w:val="single" w:sz="4" w:color="C8D5DF"/>
-          <w:insideH w:val="single" w:sz="4" w:color="DCE5EB"/>
-          <w:insideV w:val="single" w:sz="4" w:color="DCE5EB"/>
+          <w:top w:val="single" w:sz="1" w:color="CCCCCC"/>
+          <w:left w:val="single" w:sz="1" w:color="CCCCCC"/>
+          <w:bottom w:val="single" w:sz="1" w:color="CCCCCC"/>
+          <w:right w:val="single" w:sz="1" w:color="CCCCCC"/>
+          <w:insideH w:val="single" w:sz="1" w:color="CCCCCC"/>
+          <w:insideV w:val="single" w:sz="1" w:color="CCCCCC"/>
         </w:tblBorders>
       </w:tblPr>
       <w:tblGrid>
@@ -4614,6 +4724,7 @@
       <w:tr>
         <w:trPr>
           <w:tblHeader/>
+          <w:cantSplit/>
         </w:trPr>
         <w:tc>
           <w:tcPr>
@@ -4709,6 +4820,9 @@
         </w:tc>
       </w:tr>
       <w:tr>
+        <w:trPr>
+          <w:cantSplit/>
+        </w:trPr>
         <w:tc>
           <w:tcPr>
             <w:tcW w:w="3073" w:type="dxa"/>
@@ -4941,7 +5055,7 @@
                   <a:graphicData uri="http://schemas.openxmlformats.org/drawingml/2006/picture">
                     <pic:pic>
                       <pic:nvPicPr>
-                        <pic:cNvPr id="0" name="winslowtg-logo.png"/>
+                        <pic:cNvPr id="0" name="winslow-technology-group-logo.png"/>
                         <pic:cNvPicPr/>
                       </pic:nvPicPr>
                       <pic:blipFill>
@@ -5095,7 +5209,7 @@
       <w:spacing w:before="320" w:after="160"/>
     </w:pPr>
     <w:rPr>
-      <w:rFonts w:ascii="Aptos Display" w:hAnsi="Aptos Display"/>
+      <w:rFonts w:ascii="Calibri" w:hAnsi="Calibri"/>
       <w:b/>
       <w:color w:val="005F9E"/>
       <w:sz w:val="32"/>

</xml_diff>

<commit_message>
Add executive overview objectives
</commit_message>
<xml_diff>
--- a/examples/sample-health-report.docx
+++ b/examples/sample-health-report.docx
@@ -119,6 +119,78 @@
           <w:color w:val="222222"/>
         </w:rPr>
         <w:t xml:space="preserve">Example Customer engaged Professional Services to conduct an HP iLO Health Check of ilo.example.com. This report documents the discovery, analysis, and recommendations from the assessment.</w:t>
+      </w:r>
+    </w:p>
+    <w:p>
+      <w:pPr>
+        <w:pStyle w:val="Heading2"/>
+        <w:jc w:val="left"/>
+        <w:spacing w:before="0" w:after="60" w:line="276" w:lineRule="auto"/>
+        <w:keepNext/>
+      </w:pPr>
+      <w:r>
+        <w:rPr>
+          <w:rFonts w:ascii="Calibri" w:hAnsi="Calibri"/>
+          <w:sz w:val="26"/>
+          <w:szCs w:val="26"/>
+          <w:color w:val="404040"/>
+          <w:b/>
+        </w:rPr>
+        <w:t xml:space="preserve">Key Objectives</w:t>
+      </w:r>
+    </w:p>
+    <w:p>
+      <w:pPr>
+        <w:numPr>
+          <w:ilvl w:val="0"/>
+          <w:numId w:val="1"/>
+        </w:numPr>
+        <w:spacing w:after="80" w:line="276" w:lineRule="auto"/>
+      </w:pPr>
+      <w:r>
+        <w:rPr>
+          <w:rFonts w:ascii="Calibri" w:hAnsi="Calibri"/>
+          <w:sz w:val="18"/>
+          <w:szCs w:val="18"/>
+          <w:color w:val="666666"/>
+        </w:rPr>
+        <w:t xml:space="preserve">Identify conditions that present an immediate availability or data-protection risk.</w:t>
+      </w:r>
+    </w:p>
+    <w:p>
+      <w:pPr>
+        <w:numPr>
+          <w:ilvl w:val="0"/>
+          <w:numId w:val="1"/>
+        </w:numPr>
+        <w:spacing w:after="80" w:line="276" w:lineRule="auto"/>
+      </w:pPr>
+      <w:r>
+        <w:rPr>
+          <w:rFonts w:ascii="Calibri" w:hAnsi="Calibri"/>
+          <w:sz w:val="18"/>
+          <w:szCs w:val="18"/>
+          <w:color w:val="666666"/>
+        </w:rPr>
+        <w:t xml:space="preserve">Highlight developing capacity, performance, hardware, storage, and network concerns.</w:t>
+      </w:r>
+    </w:p>
+    <w:p>
+      <w:pPr>
+        <w:numPr>
+          <w:ilvl w:val="0"/>
+          <w:numId w:val="1"/>
+        </w:numPr>
+        <w:spacing w:after="80" w:line="276" w:lineRule="auto"/>
+      </w:pPr>
+      <w:r>
+        <w:rPr>
+          <w:rFonts w:ascii="Calibri" w:hAnsi="Calibri"/>
+          <w:sz w:val="18"/>
+          <w:szCs w:val="18"/>
+          <w:color w:val="666666"/>
+        </w:rPr>
+        <w:t xml:space="preserve">Document the current configuration and provide clear, prioritized recommendations.</w:t>
       </w:r>
     </w:p>
     <w:p>

</xml_diff>

<commit_message>
Refine executive overview layout
</commit_message>
<xml_diff>
--- a/examples/sample-health-report.docx
+++ b/examples/sample-health-report.docx
@@ -145,14 +145,14 @@
           <w:ilvl w:val="0"/>
           <w:numId w:val="1"/>
         </w:numPr>
-        <w:spacing w:after="80" w:line="276" w:lineRule="auto"/>
+        <w:spacing w:after="80" w:line="240" w:lineRule="auto"/>
       </w:pPr>
       <w:r>
         <w:rPr>
           <w:rFonts w:ascii="Calibri" w:hAnsi="Calibri"/>
-          <w:sz w:val="18"/>
-          <w:szCs w:val="18"/>
-          <w:color w:val="666666"/>
+          <w:sz w:val="21"/>
+          <w:szCs w:val="21"/>
+          <w:color w:val="222222"/>
         </w:rPr>
         <w:t xml:space="preserve">Identify conditions that present an immediate availability or data-protection risk.</w:t>
       </w:r>
@@ -163,14 +163,14 @@
           <w:ilvl w:val="0"/>
           <w:numId w:val="1"/>
         </w:numPr>
-        <w:spacing w:after="80" w:line="276" w:lineRule="auto"/>
+        <w:spacing w:after="80" w:line="240" w:lineRule="auto"/>
       </w:pPr>
       <w:r>
         <w:rPr>
           <w:rFonts w:ascii="Calibri" w:hAnsi="Calibri"/>
-          <w:sz w:val="18"/>
-          <w:szCs w:val="18"/>
-          <w:color w:val="666666"/>
+          <w:sz w:val="21"/>
+          <w:szCs w:val="21"/>
+          <w:color w:val="222222"/>
         </w:rPr>
         <w:t xml:space="preserve">Highlight developing capacity, performance, hardware, storage, and network concerns.</w:t>
       </w:r>
@@ -181,14 +181,14 @@
           <w:ilvl w:val="0"/>
           <w:numId w:val="1"/>
         </w:numPr>
-        <w:spacing w:after="80" w:line="276" w:lineRule="auto"/>
+        <w:spacing w:after="80" w:line="240" w:lineRule="auto"/>
       </w:pPr>
       <w:r>
         <w:rPr>
           <w:rFonts w:ascii="Calibri" w:hAnsi="Calibri"/>
-          <w:sz w:val="18"/>
-          <w:szCs w:val="18"/>
-          <w:color w:val="666666"/>
+          <w:sz w:val="21"/>
+          <w:szCs w:val="21"/>
+          <w:color w:val="222222"/>
         </w:rPr>
         <w:t xml:space="preserve">Document the current configuration and provide clear, prioritized recommendations.</w:t>
       </w:r>
@@ -528,56 +528,6 @@
         </w:tc>
       </w:tr>
     </w:tbl>
-    <w:p>
-      <w:pPr>
-        <w:pStyle w:val="Normal"/>
-        <w:jc w:val="left"/>
-        <w:spacing w:before="0" w:after="0" w:line="276" w:lineRule="auto"/>
-      </w:pPr>
-      <w:r>
-        <w:rPr>
-          <w:rFonts w:ascii="Calibri" w:hAnsi="Calibri"/>
-          <w:sz w:val="20"/>
-          <w:szCs w:val="20"/>
-          <w:color w:val="222222"/>
-        </w:rPr>
-        <w:t xml:space="preserve"/>
-      </w:r>
-    </w:p>
-    <w:p>
-      <w:pPr>
-        <w:pStyle w:val="Heading2"/>
-        <w:jc w:val="left"/>
-        <w:spacing w:before="0" w:after="100" w:line="276" w:lineRule="auto"/>
-        <w:keepNext/>
-      </w:pPr>
-      <w:r>
-        <w:rPr>
-          <w:rFonts w:ascii="Calibri" w:hAnsi="Calibri"/>
-          <w:sz w:val="26"/>
-          <w:szCs w:val="26"/>
-          <w:color w:val="404040"/>
-          <w:b/>
-        </w:rPr>
-        <w:t xml:space="preserve">Recommended Action</w:t>
-      </w:r>
-    </w:p>
-    <w:p>
-      <w:pPr>
-        <w:pStyle w:val="Normal"/>
-        <w:jc w:val="left"/>
-        <w:spacing w:before="0" w:after="160" w:line="276" w:lineRule="auto"/>
-      </w:pPr>
-      <w:r>
-        <w:rPr>
-          <w:rFonts w:ascii="Calibri" w:hAnsi="Calibri"/>
-          <w:sz w:val="21"/>
-          <w:szCs w:val="21"/>
-          <w:color w:val="222222"/>
-        </w:rPr>
-        <w:t xml:space="preserve">No immediate corrective action is required. Continue routine monitoring and periodic health checks.</w:t>
-      </w:r>
-    </w:p>
     <w:p>
       <w:pPr>
         <w:pStyle w:val="Normal"/>
@@ -1197,6 +1147,56 @@
         </w:tc>
       </w:tr>
     </w:tbl>
+    <w:p>
+      <w:pPr>
+        <w:pStyle w:val="Normal"/>
+        <w:jc w:val="left"/>
+        <w:spacing w:before="0" w:after="0" w:line="276" w:lineRule="auto"/>
+      </w:pPr>
+      <w:r>
+        <w:rPr>
+          <w:rFonts w:ascii="Calibri" w:hAnsi="Calibri"/>
+          <w:sz w:val="20"/>
+          <w:szCs w:val="20"/>
+          <w:color w:val="222222"/>
+        </w:rPr>
+        <w:t xml:space="preserve"/>
+      </w:r>
+    </w:p>
+    <w:p>
+      <w:pPr>
+        <w:pStyle w:val="Heading2"/>
+        <w:jc w:val="left"/>
+        <w:spacing w:before="0" w:after="100" w:line="276" w:lineRule="auto"/>
+        <w:keepNext/>
+      </w:pPr>
+      <w:r>
+        <w:rPr>
+          <w:rFonts w:ascii="Calibri" w:hAnsi="Calibri"/>
+          <w:sz w:val="26"/>
+          <w:szCs w:val="26"/>
+          <w:color w:val="404040"/>
+          <w:b/>
+        </w:rPr>
+        <w:t xml:space="preserve">Recommended Action</w:t>
+      </w:r>
+    </w:p>
+    <w:p>
+      <w:pPr>
+        <w:pStyle w:val="Normal"/>
+        <w:jc w:val="left"/>
+        <w:spacing w:before="0" w:after="160" w:line="276" w:lineRule="auto"/>
+      </w:pPr>
+      <w:r>
+        <w:rPr>
+          <w:rFonts w:ascii="Calibri" w:hAnsi="Calibri"/>
+          <w:sz w:val="21"/>
+          <w:szCs w:val="21"/>
+          <w:color w:val="222222"/>
+        </w:rPr>
+        <w:t xml:space="preserve">No immediate corrective action is required. Continue routine monitoring and periodic health checks.</w:t>
+      </w:r>
+    </w:p>
     <w:p>
       <w:pPr>
         <w:pStyle w:val="Heading1"/>
@@ -5793,11 +5793,11 @@
           <w:tab w:val="num" w:pos="540"/>
         </w:tabs>
         <w:ind w:left="540" w:hanging="260"/>
-        <w:spacing w:after="80" w:line="300" w:lineRule="auto"/>
+        <w:spacing w:after="80" w:line="240" w:lineRule="auto"/>
       </w:pPr>
       <w:rPr>
         <w:rFonts w:ascii="Calibri" w:hAnsi="Calibri"/>
-        <w:sz w:val="18"/>
+        <w:sz w:val="21"/>
       </w:rPr>
     </w:lvl>
   </w:abstractNum>

</xml_diff>